<commit_message>
Describe setting security configuration class
</commit_message>
<xml_diff>
--- a/Spring_security_concept.docx
+++ b/Spring_security_concept.docx
@@ -206,7 +206,7 @@
           <w:numId w:val="2"/>
         </w:numPr>
         <w:spacing w:before="240" w:after="240" w:line="360" w:lineRule="auto"/>
-        <w:ind w:left="714" w:hanging="357"/>
+        <w:ind w:left="714" w:hanging="430"/>
         <w:rPr>
           <w:rFonts w:ascii="Arial" w:hAnsi="Arial" w:cs="Arial"/>
           <w:sz w:val="28"/>
@@ -502,36 +502,12 @@
         <w:rPr>
           <w:rFonts w:ascii="Arial" w:hAnsi="Arial" w:cs="Arial"/>
         </w:rPr>
-        <w:t xml:space="preserve"> class</w:t>
-      </w:r>
-      <w:r>
-        <w:rPr>
-          <w:rFonts w:ascii="Arial" w:hAnsi="Arial" w:cs="Arial"/>
-        </w:rPr>
-        <w:t>,</w:t>
-      </w:r>
-      <w:r>
-        <w:rPr>
-          <w:rFonts w:ascii="Arial" w:hAnsi="Arial" w:cs="Arial"/>
-        </w:rPr>
-        <w:t xml:space="preserve"> </w:t>
-      </w:r>
-      <w:r>
-        <w:rPr>
-          <w:rFonts w:ascii="Arial" w:hAnsi="Arial" w:cs="Arial"/>
-        </w:rPr>
-        <w:t>with</w:t>
-      </w:r>
-      <w:r>
-        <w:rPr>
-          <w:rFonts w:ascii="Arial" w:hAnsi="Arial" w:cs="Arial"/>
-        </w:rPr>
-        <w:t xml:space="preserve"> </w:t>
+        <w:t xml:space="preserve"> class, with </w:t>
       </w:r>
       <w:proofErr w:type="spellStart"/>
       <w:r>
         <w:rPr>
-          <w:rFonts w:ascii="Arial" w:hAnsi="Arial" w:cs="Arial"/>
+          <w:rFonts w:ascii="Courier New" w:hAnsi="Courier New" w:cs="Courier New"/>
         </w:rPr>
         <w:t>HttpSecurity</w:t>
       </w:r>
@@ -540,9 +516,22 @@
         <w:rPr>
           <w:rFonts w:ascii="Arial" w:hAnsi="Arial" w:cs="Arial"/>
         </w:rPr>
-        <w:t xml:space="preserve"> object passed into is, the latter’s method </w:t>
+        <w:t xml:space="preserve"> object passed into i</w:t>
+      </w:r>
+      <w:r>
+        <w:rPr>
+          <w:rFonts w:ascii="Arial" w:hAnsi="Arial" w:cs="Arial"/>
+        </w:rPr>
+        <w:t>t</w:t>
+      </w:r>
+      <w:r>
+        <w:rPr>
+          <w:rFonts w:ascii="Arial" w:hAnsi="Arial" w:cs="Arial"/>
+        </w:rPr>
+        <w:t xml:space="preserve">, the latter’s method </w:t>
       </w:r>
       <w:proofErr w:type="spellStart"/>
+      <w:proofErr w:type="gramStart"/>
       <w:r>
         <w:rPr>
           <w:rFonts w:ascii="Courier New" w:hAnsi="Courier New" w:cs="Courier New"/>
@@ -554,7 +543,14 @@
         <w:rPr>
           <w:rFonts w:ascii="Courier New" w:hAnsi="Courier New" w:cs="Courier New"/>
         </w:rPr>
-        <w:t>(Customizer&lt;</w:t>
+        <w:t>(</w:t>
+      </w:r>
+      <w:proofErr w:type="gramEnd"/>
+      <w:r>
+        <w:rPr>
+          <w:rFonts w:ascii="Courier New" w:hAnsi="Courier New" w:cs="Courier New"/>
+        </w:rPr>
+        <w:t>Customizer&lt;</w:t>
       </w:r>
       <w:proofErr w:type="spellStart"/>
       <w:r>
@@ -629,6 +625,7 @@
       <w:r>
         <w:rPr>
           <w:rFonts w:ascii="Arial" w:hAnsi="Arial" w:cs="Arial"/>
+          <w:noProof/>
         </w:rPr>
         <w:lastRenderedPageBreak/>
         <w:drawing>
@@ -671,10 +668,1003 @@
     <w:p>
       <w:pPr>
         <w:pStyle w:val="ListParagraph"/>
+        <w:ind w:left="851"/>
+        <w:rPr>
+          <w:noProof/>
+        </w:rPr>
+      </w:pPr>
+      <w:proofErr w:type="gramStart"/>
+      <w:r>
+        <w:rPr>
+          <w:rFonts w:ascii="Arial" w:hAnsi="Arial" w:cs="Arial"/>
+        </w:rPr>
+        <w:t>Setting</w:t>
+      </w:r>
+      <w:r>
+        <w:rPr>
+          <w:rFonts w:ascii="Arial" w:hAnsi="Arial" w:cs="Arial"/>
+        </w:rPr>
+        <w:t xml:space="preserve"> </w:t>
+      </w:r>
+      <w:r>
+        <w:rPr>
+          <w:rFonts w:ascii="Courier New" w:hAnsi="Courier New" w:cs="Courier New"/>
+        </w:rPr>
+        <w:t>.</w:t>
+      </w:r>
+      <w:proofErr w:type="spellStart"/>
+      <w:r>
+        <w:rPr>
+          <w:rFonts w:ascii="Courier New" w:hAnsi="Courier New" w:cs="Courier New"/>
+        </w:rPr>
+        <w:t>loginPage</w:t>
+      </w:r>
+      <w:proofErr w:type="spellEnd"/>
+      <w:proofErr w:type="gramEnd"/>
+      <w:r>
+        <w:rPr>
+          <w:rFonts w:ascii="Courier New" w:hAnsi="Courier New" w:cs="Courier New"/>
+        </w:rPr>
+        <w:t xml:space="preserve">([login </w:t>
+      </w:r>
+      <w:proofErr w:type="spellStart"/>
+      <w:r>
+        <w:rPr>
+          <w:rFonts w:ascii="Courier New" w:hAnsi="Courier New" w:cs="Courier New"/>
+        </w:rPr>
+        <w:t>url</w:t>
+      </w:r>
+      <w:proofErr w:type="spellEnd"/>
+      <w:r>
+        <w:rPr>
+          <w:rFonts w:ascii="Courier New" w:hAnsi="Courier New" w:cs="Courier New"/>
+        </w:rPr>
+        <w:t>])</w:t>
+      </w:r>
+      <w:r>
+        <w:rPr>
+          <w:rFonts w:ascii="Arial" w:hAnsi="Arial" w:cs="Arial"/>
+        </w:rPr>
+        <w:t xml:space="preserve"> </w:t>
+      </w:r>
+      <w:proofErr w:type="gramStart"/>
+      <w:r>
+        <w:rPr>
+          <w:rFonts w:ascii="Arial" w:hAnsi="Arial" w:cs="Arial"/>
+        </w:rPr>
+        <w:t xml:space="preserve">in </w:t>
+      </w:r>
+      <w:r>
+        <w:rPr>
+          <w:rFonts w:ascii="Courier New" w:hAnsi="Courier New" w:cs="Courier New"/>
+        </w:rPr>
+        <w:t>.</w:t>
+      </w:r>
+      <w:proofErr w:type="spellStart"/>
+      <w:r>
+        <w:rPr>
+          <w:rFonts w:ascii="Courier New" w:hAnsi="Courier New" w:cs="Courier New"/>
+        </w:rPr>
+        <w:t>formLogin</w:t>
+      </w:r>
+      <w:proofErr w:type="spellEnd"/>
+      <w:proofErr w:type="gramEnd"/>
+      <w:r>
+        <w:rPr>
+          <w:rFonts w:ascii="Courier New" w:hAnsi="Courier New" w:cs="Courier New"/>
+        </w:rPr>
+        <w:t>(</w:t>
+      </w:r>
+      <w:r>
+        <w:rPr>
+          <w:rFonts w:ascii="Courier New" w:hAnsi="Courier New" w:cs="Courier New"/>
+        </w:rPr>
+        <w:t>login -&gt; login…</w:t>
+      </w:r>
+      <w:r>
+        <w:rPr>
+          <w:rFonts w:ascii="Courier New" w:hAnsi="Courier New" w:cs="Courier New"/>
+        </w:rPr>
+        <w:t>)</w:t>
+      </w:r>
+      <w:r>
+        <w:rPr>
+          <w:rFonts w:ascii="Courier New" w:hAnsi="Courier New" w:cs="Courier New"/>
+        </w:rPr>
+        <w:br/>
+      </w:r>
+      <w:r>
+        <w:rPr>
+          <w:rFonts w:ascii="Arial" w:hAnsi="Arial" w:cs="Arial"/>
+        </w:rPr>
+        <w:t>re-directs logging option from Spring’s default</w:t>
+      </w:r>
+      <w:r>
+        <w:rPr>
+          <w:noProof/>
+        </w:rPr>
+        <w:t>:</w:t>
+      </w:r>
+    </w:p>
+    <w:p>
+      <w:pPr>
+        <w:pStyle w:val="ListParagraph"/>
+        <w:ind w:left="927"/>
+        <w:jc w:val="center"/>
+        <w:rPr>
+          <w:rFonts w:ascii="Arial" w:hAnsi="Arial" w:cs="Arial"/>
+        </w:rPr>
+      </w:pPr>
+      <w:r>
+        <w:rPr>
+          <w:rFonts w:ascii="Courier New" w:hAnsi="Courier New" w:cs="Courier New"/>
+        </w:rPr>
+        <w:drawing>
+          <wp:inline distT="0" distB="0" distL="0" distR="0" wp14:anchorId="4126E4D3" wp14:editId="04B59069">
+            <wp:extent cx="2038455" cy="1797142"/>
+            <wp:effectExtent l="0" t="0" r="0" b="0"/>
+            <wp:docPr id="1254589974" name="Picture 1" descr="A screenshot of a login screen&#10;&#10;AI-generated content may be incorrect."/>
+            <wp:cNvGraphicFramePr>
+              <a:graphicFrameLocks xmlns:a="http://schemas.openxmlformats.org/drawingml/2006/main" noChangeAspect="1"/>
+            </wp:cNvGraphicFramePr>
+            <a:graphic xmlns:a="http://schemas.openxmlformats.org/drawingml/2006/main">
+              <a:graphicData uri="http://schemas.openxmlformats.org/drawingml/2006/picture">
+                <pic:pic xmlns:pic="http://schemas.openxmlformats.org/drawingml/2006/picture">
+                  <pic:nvPicPr>
+                    <pic:cNvPr id="1254589974" name="Picture 1" descr="A screenshot of a login screen&#10;&#10;AI-generated content may be incorrect."/>
+                    <pic:cNvPicPr/>
+                  </pic:nvPicPr>
+                  <pic:blipFill>
+                    <a:blip r:embed="rId8"/>
+                    <a:stretch>
+                      <a:fillRect/>
+                    </a:stretch>
+                  </pic:blipFill>
+                  <pic:spPr>
+                    <a:xfrm>
+                      <a:off x="0" y="0"/>
+                      <a:ext cx="2038455" cy="1797142"/>
+                    </a:xfrm>
+                    <a:prstGeom prst="rect">
+                      <a:avLst/>
+                    </a:prstGeom>
+                  </pic:spPr>
+                </pic:pic>
+              </a:graphicData>
+            </a:graphic>
+          </wp:inline>
+        </w:drawing>
+      </w:r>
+    </w:p>
+    <w:p>
+      <w:pPr>
+        <w:pStyle w:val="ListParagraph"/>
+        <w:ind w:left="927"/>
+        <w:jc w:val="center"/>
+        <w:rPr>
+          <w:rFonts w:ascii="Arial" w:hAnsi="Arial" w:cs="Arial"/>
+        </w:rPr>
+      </w:pPr>
+    </w:p>
+    <w:p>
+      <w:pPr>
+        <w:pStyle w:val="ListParagraph"/>
+        <w:ind w:left="927"/>
+        <w:rPr>
+          <w:rFonts w:ascii="Arial" w:hAnsi="Arial" w:cs="Arial"/>
+        </w:rPr>
+      </w:pPr>
+      <w:r>
+        <w:rPr>
+          <w:rFonts w:ascii="Arial" w:hAnsi="Arial" w:cs="Arial"/>
+        </w:rPr>
+        <w:t xml:space="preserve">to one defined by a developer e.g. </w:t>
+      </w:r>
+      <w:r>
+        <w:rPr>
+          <w:rFonts w:ascii="Courier New" w:hAnsi="Courier New" w:cs="Courier New"/>
+        </w:rPr>
+        <w:t>“</w:t>
+      </w:r>
+      <w:r>
+        <w:rPr>
+          <w:rFonts w:ascii="Courier New" w:hAnsi="Courier New" w:cs="Courier New"/>
+        </w:rPr>
+        <w:t>/auth/login”</w:t>
+      </w:r>
+      <w:r>
+        <w:rPr>
+          <w:rFonts w:ascii="Arial" w:hAnsi="Arial" w:cs="Arial"/>
+        </w:rPr>
+        <w:t>:</w:t>
+      </w:r>
+    </w:p>
+    <w:p>
+      <w:pPr>
+        <w:pStyle w:val="ListParagraph"/>
         <w:ind w:left="0"/>
         <w:jc w:val="center"/>
         <w:rPr>
           <w:rFonts w:ascii="Arial" w:hAnsi="Arial" w:cs="Arial"/>
+        </w:rPr>
+      </w:pPr>
+      <w:r>
+        <w:rPr>
+          <w:rFonts w:ascii="Arial" w:hAnsi="Arial" w:cs="Arial"/>
+        </w:rPr>
+        <w:drawing>
+          <wp:inline distT="0" distB="0" distL="0" distR="0" wp14:anchorId="0A53AF75" wp14:editId="7AFEF5FF">
+            <wp:extent cx="5289462" cy="2667000"/>
+            <wp:effectExtent l="0" t="0" r="6985" b="0"/>
+            <wp:docPr id="18023313" name="Picture 1"/>
+            <wp:cNvGraphicFramePr>
+              <a:graphicFrameLocks xmlns:a="http://schemas.openxmlformats.org/drawingml/2006/main" noChangeAspect="1"/>
+            </wp:cNvGraphicFramePr>
+            <a:graphic xmlns:a="http://schemas.openxmlformats.org/drawingml/2006/main">
+              <a:graphicData uri="http://schemas.openxmlformats.org/drawingml/2006/picture">
+                <pic:pic xmlns:pic="http://schemas.openxmlformats.org/drawingml/2006/picture">
+                  <pic:nvPicPr>
+                    <pic:cNvPr id="18023313" name=""/>
+                    <pic:cNvPicPr/>
+                  </pic:nvPicPr>
+                  <pic:blipFill>
+                    <a:blip r:embed="rId9"/>
+                    <a:stretch>
+                      <a:fillRect/>
+                    </a:stretch>
+                  </pic:blipFill>
+                  <pic:spPr>
+                    <a:xfrm>
+                      <a:off x="0" y="0"/>
+                      <a:ext cx="5297890" cy="2671249"/>
+                    </a:xfrm>
+                    <a:prstGeom prst="rect">
+                      <a:avLst/>
+                    </a:prstGeom>
+                  </pic:spPr>
+                </pic:pic>
+              </a:graphicData>
+            </a:graphic>
+          </wp:inline>
+        </w:drawing>
+      </w:r>
+    </w:p>
+    <w:p>
+      <w:pPr>
+        <w:pStyle w:val="ListParagraph"/>
+        <w:ind w:left="0"/>
+        <w:jc w:val="center"/>
+        <w:rPr>
+          <w:rFonts w:ascii="Arial" w:hAnsi="Arial" w:cs="Arial"/>
+        </w:rPr>
+      </w:pPr>
+    </w:p>
+    <w:p>
+      <w:pPr>
+        <w:pStyle w:val="ListParagraph"/>
+        <w:ind w:left="851"/>
+        <w:rPr>
+          <w:rFonts w:ascii="Arial" w:hAnsi="Arial" w:cs="Arial"/>
+        </w:rPr>
+      </w:pPr>
+      <w:proofErr w:type="gramStart"/>
+      <w:r>
+        <w:rPr>
+          <w:rFonts w:ascii="Arial" w:hAnsi="Arial" w:cs="Arial"/>
+        </w:rPr>
+        <w:t xml:space="preserve">Setting </w:t>
+      </w:r>
+      <w:r>
+        <w:rPr>
+          <w:rFonts w:ascii="Courier New" w:hAnsi="Courier New" w:cs="Courier New"/>
+        </w:rPr>
+        <w:t>.</w:t>
+      </w:r>
+      <w:proofErr w:type="spellStart"/>
+      <w:r>
+        <w:rPr>
+          <w:rFonts w:ascii="Courier New" w:hAnsi="Courier New" w:cs="Courier New"/>
+        </w:rPr>
+        <w:t>usernameParameter</w:t>
+      </w:r>
+      <w:proofErr w:type="spellEnd"/>
+      <w:proofErr w:type="gramEnd"/>
+      <w:r>
+        <w:rPr>
+          <w:rFonts w:ascii="Courier New" w:hAnsi="Courier New" w:cs="Courier New"/>
+        </w:rPr>
+        <w:t>([</w:t>
+      </w:r>
+      <w:r>
+        <w:rPr>
+          <w:rFonts w:ascii="Courier New" w:hAnsi="Courier New" w:cs="Courier New"/>
+        </w:rPr>
+        <w:t>username</w:t>
+      </w:r>
+      <w:r>
+        <w:rPr>
+          <w:rFonts w:ascii="Courier New" w:hAnsi="Courier New" w:cs="Courier New"/>
+        </w:rPr>
+        <w:t>])</w:t>
+      </w:r>
+      <w:r>
+        <w:rPr>
+          <w:rFonts w:ascii="Arial" w:hAnsi="Arial" w:cs="Arial"/>
+        </w:rPr>
+        <w:t xml:space="preserve"> </w:t>
+      </w:r>
+      <w:proofErr w:type="gramStart"/>
+      <w:r>
+        <w:rPr>
+          <w:rFonts w:ascii="Arial" w:hAnsi="Arial" w:cs="Arial"/>
+        </w:rPr>
+        <w:t xml:space="preserve">and </w:t>
+      </w:r>
+      <w:r>
+        <w:rPr>
+          <w:rFonts w:ascii="Courier New" w:hAnsi="Courier New" w:cs="Courier New"/>
+        </w:rPr>
+        <w:t>.</w:t>
+      </w:r>
+      <w:proofErr w:type="spellStart"/>
+      <w:r>
+        <w:rPr>
+          <w:rFonts w:ascii="Courier New" w:hAnsi="Courier New" w:cs="Courier New"/>
+        </w:rPr>
+        <w:t>passwordParameter</w:t>
+      </w:r>
+      <w:proofErr w:type="spellEnd"/>
+      <w:proofErr w:type="gramEnd"/>
+      <w:r>
+        <w:rPr>
+          <w:rFonts w:ascii="Courier New" w:hAnsi="Courier New" w:cs="Courier New"/>
+        </w:rPr>
+        <w:t>([password])</w:t>
+      </w:r>
+      <w:r>
+        <w:rPr>
+          <w:rFonts w:ascii="Arial" w:hAnsi="Arial" w:cs="Arial"/>
+        </w:rPr>
+        <w:t xml:space="preserve"> </w:t>
+      </w:r>
+      <w:proofErr w:type="gramStart"/>
+      <w:r>
+        <w:rPr>
+          <w:rFonts w:ascii="Arial" w:hAnsi="Arial" w:cs="Arial"/>
+        </w:rPr>
+        <w:t xml:space="preserve">in </w:t>
+      </w:r>
+      <w:r>
+        <w:rPr>
+          <w:rFonts w:ascii="Courier New" w:hAnsi="Courier New" w:cs="Courier New"/>
+        </w:rPr>
+        <w:t>.</w:t>
+      </w:r>
+      <w:proofErr w:type="spellStart"/>
+      <w:r>
+        <w:rPr>
+          <w:rFonts w:ascii="Courier New" w:hAnsi="Courier New" w:cs="Courier New"/>
+        </w:rPr>
+        <w:t>formLogin</w:t>
+      </w:r>
+      <w:proofErr w:type="spellEnd"/>
+      <w:proofErr w:type="gramEnd"/>
+      <w:r>
+        <w:rPr>
+          <w:rFonts w:ascii="Courier New" w:hAnsi="Courier New" w:cs="Courier New"/>
+        </w:rPr>
+        <w:t>(login -&gt; login…)</w:t>
+      </w:r>
+      <w:r>
+        <w:rPr>
+          <w:rFonts w:ascii="Arial" w:hAnsi="Arial" w:cs="Arial"/>
+        </w:rPr>
+        <w:t xml:space="preserve"> enables receiving values from form’s fields of corresponding names</w:t>
+      </w:r>
+      <w:r>
+        <w:rPr>
+          <w:rFonts w:ascii="Arial" w:hAnsi="Arial" w:cs="Arial"/>
+        </w:rPr>
+        <w:t>:</w:t>
+      </w:r>
+    </w:p>
+    <w:p>
+      <w:pPr>
+        <w:jc w:val="center"/>
+        <w:rPr>
+          <w:rFonts w:ascii="Arial" w:hAnsi="Arial" w:cs="Arial"/>
+        </w:rPr>
+      </w:pPr>
+      <w:r>
+        <w:rPr>
+          <w:rFonts w:ascii="Arial" w:hAnsi="Arial" w:cs="Arial"/>
+        </w:rPr>
+        <w:drawing>
+          <wp:inline distT="0" distB="0" distL="0" distR="0" wp14:anchorId="561FA94A" wp14:editId="17AE6FBA">
+            <wp:extent cx="3943900" cy="1152686"/>
+            <wp:effectExtent l="0" t="0" r="0" b="9525"/>
+            <wp:docPr id="1988633872" name="Picture 1"/>
+            <wp:cNvGraphicFramePr>
+              <a:graphicFrameLocks xmlns:a="http://schemas.openxmlformats.org/drawingml/2006/main" noChangeAspect="1"/>
+            </wp:cNvGraphicFramePr>
+            <a:graphic xmlns:a="http://schemas.openxmlformats.org/drawingml/2006/main">
+              <a:graphicData uri="http://schemas.openxmlformats.org/drawingml/2006/picture">
+                <pic:pic xmlns:pic="http://schemas.openxmlformats.org/drawingml/2006/picture">
+                  <pic:nvPicPr>
+                    <pic:cNvPr id="1988633872" name=""/>
+                    <pic:cNvPicPr/>
+                  </pic:nvPicPr>
+                  <pic:blipFill>
+                    <a:blip r:embed="rId10"/>
+                    <a:stretch>
+                      <a:fillRect/>
+                    </a:stretch>
+                  </pic:blipFill>
+                  <pic:spPr>
+                    <a:xfrm>
+                      <a:off x="0" y="0"/>
+                      <a:ext cx="3943900" cy="1152686"/>
+                    </a:xfrm>
+                    <a:prstGeom prst="rect">
+                      <a:avLst/>
+                    </a:prstGeom>
+                  </pic:spPr>
+                </pic:pic>
+              </a:graphicData>
+            </a:graphic>
+          </wp:inline>
+        </w:drawing>
+      </w:r>
+    </w:p>
+    <w:p>
+      <w:pPr>
+        <w:rPr>
+          <w:rFonts w:ascii="Arial" w:hAnsi="Arial" w:cs="Arial"/>
+          <w:b/>
+          <w:bCs/>
+        </w:rPr>
+      </w:pPr>
+      <w:r>
+        <w:rPr>
+          <w:rFonts w:ascii="Arial" w:hAnsi="Arial" w:cs="Arial"/>
+          <w:b/>
+          <w:bCs/>
+        </w:rPr>
+        <w:lastRenderedPageBreak/>
+        <w:t>Form</w:t>
+      </w:r>
+      <w:r>
+        <w:rPr>
+          <w:rFonts w:ascii="Arial" w:hAnsi="Arial" w:cs="Arial"/>
+          <w:b/>
+          <w:bCs/>
+        </w:rPr>
+        <w:t>:</w:t>
+      </w:r>
+    </w:p>
+    <w:p>
+      <w:pPr>
+        <w:jc w:val="center"/>
+        <w:rPr>
+          <w:rFonts w:ascii="Arial" w:hAnsi="Arial" w:cs="Arial"/>
+          <w:b/>
+          <w:bCs/>
+        </w:rPr>
+      </w:pPr>
+      <w:r>
+        <w:rPr>
+          <w:rFonts w:ascii="Arial" w:hAnsi="Arial" w:cs="Arial"/>
+          <w:b/>
+          <w:bCs/>
+        </w:rPr>
+        <w:drawing>
+          <wp:inline distT="0" distB="0" distL="0" distR="0" wp14:anchorId="086996BE" wp14:editId="0C2DFA1A">
+            <wp:extent cx="5382376" cy="2505425"/>
+            <wp:effectExtent l="0" t="0" r="0" b="9525"/>
+            <wp:docPr id="1743090149" name="Picture 1" descr="A computer screen shot of a program code&#10;&#10;AI-generated content may be incorrect."/>
+            <wp:cNvGraphicFramePr>
+              <a:graphicFrameLocks xmlns:a="http://schemas.openxmlformats.org/drawingml/2006/main" noChangeAspect="1"/>
+            </wp:cNvGraphicFramePr>
+            <a:graphic xmlns:a="http://schemas.openxmlformats.org/drawingml/2006/main">
+              <a:graphicData uri="http://schemas.openxmlformats.org/drawingml/2006/picture">
+                <pic:pic xmlns:pic="http://schemas.openxmlformats.org/drawingml/2006/picture">
+                  <pic:nvPicPr>
+                    <pic:cNvPr id="1743090149" name="Picture 1" descr="A computer screen shot of a program code&#10;&#10;AI-generated content may be incorrect."/>
+                    <pic:cNvPicPr/>
+                  </pic:nvPicPr>
+                  <pic:blipFill>
+                    <a:blip r:embed="rId11"/>
+                    <a:stretch>
+                      <a:fillRect/>
+                    </a:stretch>
+                  </pic:blipFill>
+                  <pic:spPr>
+                    <a:xfrm>
+                      <a:off x="0" y="0"/>
+                      <a:ext cx="5382376" cy="2505425"/>
+                    </a:xfrm>
+                    <a:prstGeom prst="rect">
+                      <a:avLst/>
+                    </a:prstGeom>
+                  </pic:spPr>
+                </pic:pic>
+              </a:graphicData>
+            </a:graphic>
+          </wp:inline>
+        </w:drawing>
+      </w:r>
+    </w:p>
+    <w:p>
+      <w:pPr>
+        <w:rPr>
+          <w:rFonts w:ascii="Arial" w:hAnsi="Arial" w:cs="Arial"/>
+          <w:b/>
+          <w:bCs/>
+        </w:rPr>
+      </w:pPr>
+      <w:r>
+        <w:rPr>
+          <w:rFonts w:ascii="Arial" w:hAnsi="Arial" w:cs="Arial"/>
+          <w:b/>
+          <w:bCs/>
+        </w:rPr>
+        <w:t>NOTE</w:t>
+      </w:r>
+      <w:r>
+        <w:rPr>
+          <w:rFonts w:ascii="Arial" w:hAnsi="Arial" w:cs="Arial"/>
+          <w:b/>
+          <w:bCs/>
+        </w:rPr>
+        <w:t>S</w:t>
+      </w:r>
+      <w:r>
+        <w:rPr>
+          <w:rFonts w:ascii="Arial" w:hAnsi="Arial" w:cs="Arial"/>
+          <w:b/>
+          <w:bCs/>
+        </w:rPr>
+        <w:t>:</w:t>
+      </w:r>
+    </w:p>
+    <w:p>
+      <w:pPr>
+        <w:rPr>
+          <w:rFonts w:ascii="Courier New" w:hAnsi="Courier New" w:cs="Courier New"/>
+          <w:b/>
+          <w:bCs/>
+        </w:rPr>
+      </w:pPr>
+      <w:r>
+        <w:rPr>
+          <w:rFonts w:ascii="Arial" w:hAnsi="Arial" w:cs="Arial"/>
+          <w:b/>
+          <w:bCs/>
+        </w:rPr>
+        <w:t>When “input” fields’ names are default i.e.: “username” and “password</w:t>
+      </w:r>
+      <w:r>
+        <w:rPr>
+          <w:rFonts w:ascii="Arial" w:hAnsi="Arial" w:cs="Arial"/>
+          <w:b/>
+          <w:bCs/>
+        </w:rPr>
+        <w:t>”</w:t>
+      </w:r>
+      <w:proofErr w:type="gramStart"/>
+      <w:r>
+        <w:rPr>
+          <w:rFonts w:ascii="Arial" w:hAnsi="Arial" w:cs="Arial"/>
+          <w:b/>
+          <w:bCs/>
+        </w:rPr>
+        <w:t xml:space="preserve">, </w:t>
+      </w:r>
+      <w:r>
+        <w:rPr>
+          <w:rFonts w:ascii="Courier New" w:hAnsi="Courier New" w:cs="Courier New"/>
+          <w:b/>
+          <w:bCs/>
+        </w:rPr>
+        <w:t>.</w:t>
+      </w:r>
+      <w:proofErr w:type="spellStart"/>
+      <w:r>
+        <w:rPr>
+          <w:rFonts w:ascii="Courier New" w:hAnsi="Courier New" w:cs="Courier New"/>
+          <w:b/>
+          <w:bCs/>
+        </w:rPr>
+        <w:t>usernameParameter</w:t>
+      </w:r>
+      <w:proofErr w:type="spellEnd"/>
+      <w:proofErr w:type="gramEnd"/>
+      <w:r>
+        <w:rPr>
+          <w:rFonts w:ascii="Courier New" w:hAnsi="Courier New" w:cs="Courier New"/>
+          <w:b/>
+          <w:bCs/>
+        </w:rPr>
+        <w:t>([</w:t>
+      </w:r>
+      <w:r>
+        <w:rPr>
+          <w:rFonts w:ascii="Courier New" w:hAnsi="Courier New" w:cs="Courier New"/>
+          <w:b/>
+          <w:bCs/>
+        </w:rPr>
+        <w:t>username</w:t>
+      </w:r>
+      <w:r>
+        <w:rPr>
+          <w:rFonts w:ascii="Courier New" w:hAnsi="Courier New" w:cs="Courier New"/>
+          <w:b/>
+          <w:bCs/>
+        </w:rPr>
+        <w:t>])</w:t>
+      </w:r>
+      <w:r>
+        <w:rPr>
+          <w:rFonts w:ascii="Arial" w:hAnsi="Arial" w:cs="Arial"/>
+          <w:b/>
+          <w:bCs/>
+        </w:rPr>
+        <w:t xml:space="preserve"> </w:t>
+      </w:r>
+      <w:proofErr w:type="gramStart"/>
+      <w:r>
+        <w:rPr>
+          <w:rFonts w:ascii="Arial" w:hAnsi="Arial" w:cs="Arial"/>
+          <w:b/>
+          <w:bCs/>
+        </w:rPr>
+        <w:t xml:space="preserve">and </w:t>
+      </w:r>
+      <w:r>
+        <w:rPr>
+          <w:rFonts w:ascii="Courier New" w:hAnsi="Courier New" w:cs="Courier New"/>
+          <w:b/>
+          <w:bCs/>
+        </w:rPr>
+        <w:t>.</w:t>
+      </w:r>
+      <w:proofErr w:type="spellStart"/>
+      <w:r>
+        <w:rPr>
+          <w:rFonts w:ascii="Courier New" w:hAnsi="Courier New" w:cs="Courier New"/>
+          <w:b/>
+          <w:bCs/>
+        </w:rPr>
+        <w:t>passwordParameter</w:t>
+      </w:r>
+      <w:proofErr w:type="spellEnd"/>
+      <w:proofErr w:type="gramEnd"/>
+      <w:r>
+        <w:rPr>
+          <w:rFonts w:ascii="Courier New" w:hAnsi="Courier New" w:cs="Courier New"/>
+          <w:b/>
+          <w:bCs/>
+        </w:rPr>
+        <w:t>([password])</w:t>
+      </w:r>
+      <w:r>
+        <w:rPr>
+          <w:rFonts w:ascii="Arial" w:hAnsi="Arial" w:cs="Arial"/>
+          <w:b/>
+          <w:bCs/>
+        </w:rPr>
+        <w:t xml:space="preserve"> </w:t>
+      </w:r>
+      <w:proofErr w:type="gramStart"/>
+      <w:r>
+        <w:rPr>
+          <w:rFonts w:ascii="Arial" w:hAnsi="Arial" w:cs="Arial"/>
+          <w:b/>
+          <w:bCs/>
+        </w:rPr>
+        <w:t xml:space="preserve">in </w:t>
+      </w:r>
+      <w:r>
+        <w:rPr>
+          <w:rFonts w:ascii="Courier New" w:hAnsi="Courier New" w:cs="Courier New"/>
+          <w:b/>
+          <w:bCs/>
+        </w:rPr>
+        <w:t>.</w:t>
+      </w:r>
+      <w:proofErr w:type="spellStart"/>
+      <w:r>
+        <w:rPr>
+          <w:rFonts w:ascii="Courier New" w:hAnsi="Courier New" w:cs="Courier New"/>
+          <w:b/>
+          <w:bCs/>
+        </w:rPr>
+        <w:t>formLogin</w:t>
+      </w:r>
+      <w:proofErr w:type="spellEnd"/>
+      <w:proofErr w:type="gramEnd"/>
+      <w:r>
+        <w:rPr>
+          <w:rFonts w:ascii="Courier New" w:hAnsi="Courier New" w:cs="Courier New"/>
+          <w:b/>
+          <w:bCs/>
+        </w:rPr>
+        <w:t>(login -&gt; login</w:t>
+      </w:r>
+      <w:proofErr w:type="gramStart"/>
+      <w:r>
+        <w:rPr>
+          <w:rFonts w:ascii="Courier New" w:hAnsi="Courier New" w:cs="Courier New"/>
+          <w:b/>
+          <w:bCs/>
+        </w:rPr>
+        <w:t>…)</w:t>
+      </w:r>
+      <w:r>
+        <w:rPr>
+          <w:rFonts w:ascii="Arial" w:hAnsi="Arial" w:cs="Arial"/>
+          <w:b/>
+          <w:bCs/>
+        </w:rPr>
+        <w:t>are</w:t>
+      </w:r>
+      <w:proofErr w:type="gramEnd"/>
+      <w:r>
+        <w:rPr>
+          <w:rFonts w:ascii="Arial" w:hAnsi="Arial" w:cs="Arial"/>
+          <w:b/>
+          <w:bCs/>
+        </w:rPr>
+        <w:t xml:space="preserve"> not required </w:t>
+      </w:r>
+      <w:proofErr w:type="gramStart"/>
+      <w:r>
+        <w:rPr>
+          <w:rFonts w:ascii="Arial" w:hAnsi="Arial" w:cs="Arial"/>
+          <w:b/>
+          <w:bCs/>
+        </w:rPr>
+        <w:t>in</w:t>
+      </w:r>
+      <w:r>
+        <w:rPr>
+          <w:rFonts w:ascii="Courier New" w:hAnsi="Courier New" w:cs="Courier New"/>
+          <w:b/>
+          <w:bCs/>
+        </w:rPr>
+        <w:t xml:space="preserve"> </w:t>
+      </w:r>
+      <w:r>
+        <w:rPr>
+          <w:rFonts w:ascii="Courier New" w:hAnsi="Courier New" w:cs="Courier New"/>
+          <w:b/>
+          <w:bCs/>
+        </w:rPr>
+        <w:t>.</w:t>
+      </w:r>
+      <w:proofErr w:type="spellStart"/>
+      <w:r>
+        <w:rPr>
+          <w:rFonts w:ascii="Courier New" w:hAnsi="Courier New" w:cs="Courier New"/>
+          <w:b/>
+          <w:bCs/>
+        </w:rPr>
+        <w:t>loginPage</w:t>
+      </w:r>
+      <w:proofErr w:type="spellEnd"/>
+      <w:proofErr w:type="gramEnd"/>
+      <w:r>
+        <w:rPr>
+          <w:rFonts w:ascii="Courier New" w:hAnsi="Courier New" w:cs="Courier New"/>
+          <w:b/>
+          <w:bCs/>
+        </w:rPr>
+        <w:t xml:space="preserve">([login </w:t>
+      </w:r>
+      <w:proofErr w:type="spellStart"/>
+      <w:r>
+        <w:rPr>
+          <w:rFonts w:ascii="Courier New" w:hAnsi="Courier New" w:cs="Courier New"/>
+          <w:b/>
+          <w:bCs/>
+        </w:rPr>
+        <w:t>url</w:t>
+      </w:r>
+      <w:proofErr w:type="spellEnd"/>
+      <w:r>
+        <w:rPr>
+          <w:rFonts w:ascii="Courier New" w:hAnsi="Courier New" w:cs="Courier New"/>
+          <w:b/>
+          <w:bCs/>
+        </w:rPr>
+        <w:t>])</w:t>
+      </w:r>
+      <w:r>
+        <w:rPr>
+          <w:rFonts w:ascii="Arial" w:hAnsi="Arial" w:cs="Arial"/>
+          <w:b/>
+          <w:bCs/>
+        </w:rPr>
+        <w:t xml:space="preserve"> </w:t>
+      </w:r>
+      <w:proofErr w:type="gramStart"/>
+      <w:r>
+        <w:rPr>
+          <w:rFonts w:ascii="Arial" w:hAnsi="Arial" w:cs="Arial"/>
+          <w:b/>
+          <w:bCs/>
+        </w:rPr>
+        <w:t xml:space="preserve">in </w:t>
+      </w:r>
+      <w:r>
+        <w:rPr>
+          <w:rFonts w:ascii="Courier New" w:hAnsi="Courier New" w:cs="Courier New"/>
+          <w:b/>
+          <w:bCs/>
+        </w:rPr>
+        <w:t>.</w:t>
+      </w:r>
+      <w:proofErr w:type="spellStart"/>
+      <w:r>
+        <w:rPr>
+          <w:rFonts w:ascii="Courier New" w:hAnsi="Courier New" w:cs="Courier New"/>
+          <w:b/>
+          <w:bCs/>
+        </w:rPr>
+        <w:t>formLogin</w:t>
+      </w:r>
+      <w:proofErr w:type="spellEnd"/>
+      <w:proofErr w:type="gramEnd"/>
+      <w:r>
+        <w:rPr>
+          <w:rFonts w:ascii="Courier New" w:hAnsi="Courier New" w:cs="Courier New"/>
+          <w:b/>
+          <w:bCs/>
+        </w:rPr>
+        <w:t>(login -&gt; login…</w:t>
+      </w:r>
+      <w:r>
+        <w:rPr>
+          <w:rFonts w:ascii="Courier New" w:hAnsi="Courier New" w:cs="Courier New"/>
+          <w:b/>
+          <w:bCs/>
+        </w:rPr>
+        <w:t>)</w:t>
+      </w:r>
+    </w:p>
+    <w:p>
+      <w:pPr>
+        <w:jc w:val="center"/>
+        <w:rPr>
+          <w:rFonts w:ascii="Courier New" w:hAnsi="Courier New" w:cs="Courier New"/>
+          <w:b/>
+          <w:bCs/>
+        </w:rPr>
+      </w:pPr>
+      <w:r>
+        <w:rPr>
+          <w:rFonts w:ascii="Courier New" w:hAnsi="Courier New" w:cs="Courier New"/>
+          <w:b/>
+          <w:bCs/>
+        </w:rPr>
+        <w:drawing>
+          <wp:inline distT="0" distB="0" distL="0" distR="0" wp14:anchorId="77DCC4FE" wp14:editId="1C9D68FA">
+            <wp:extent cx="3209925" cy="1054005"/>
+            <wp:effectExtent l="0" t="0" r="0" b="0"/>
+            <wp:docPr id="1256547438" name="Picture 1" descr="A screen shot of a computer&#10;&#10;AI-generated content may be incorrect."/>
+            <wp:cNvGraphicFramePr>
+              <a:graphicFrameLocks xmlns:a="http://schemas.openxmlformats.org/drawingml/2006/main" noChangeAspect="1"/>
+            </wp:cNvGraphicFramePr>
+            <a:graphic xmlns:a="http://schemas.openxmlformats.org/drawingml/2006/main">
+              <a:graphicData uri="http://schemas.openxmlformats.org/drawingml/2006/picture">
+                <pic:pic xmlns:pic="http://schemas.openxmlformats.org/drawingml/2006/picture">
+                  <pic:nvPicPr>
+                    <pic:cNvPr id="1256547438" name="Picture 1" descr="A screen shot of a computer&#10;&#10;AI-generated content may be incorrect."/>
+                    <pic:cNvPicPr/>
+                  </pic:nvPicPr>
+                  <pic:blipFill>
+                    <a:blip r:embed="rId12"/>
+                    <a:stretch>
+                      <a:fillRect/>
+                    </a:stretch>
+                  </pic:blipFill>
+                  <pic:spPr>
+                    <a:xfrm>
+                      <a:off x="0" y="0"/>
+                      <a:ext cx="3217707" cy="1056560"/>
+                    </a:xfrm>
+                    <a:prstGeom prst="rect">
+                      <a:avLst/>
+                    </a:prstGeom>
+                  </pic:spPr>
+                </pic:pic>
+              </a:graphicData>
+            </a:graphic>
+          </wp:inline>
+        </w:drawing>
+      </w:r>
+    </w:p>
+    <w:p>
+      <w:pPr>
+        <w:rPr>
+          <w:rFonts w:ascii="Arial" w:hAnsi="Arial" w:cs="Arial"/>
+          <w:b/>
+          <w:bCs/>
+        </w:rPr>
+      </w:pPr>
+      <w:r>
+        <w:rPr>
+          <w:rFonts w:ascii="Arial" w:hAnsi="Arial" w:cs="Arial"/>
+          <w:b/>
+          <w:bCs/>
+        </w:rPr>
+        <w:t xml:space="preserve">Evaluation of credentials passed in </w:t>
+      </w:r>
+      <w:r>
+        <w:rPr>
+          <w:rFonts w:ascii="Arial" w:hAnsi="Arial" w:cs="Arial"/>
+          <w:b/>
+          <w:bCs/>
+        </w:rPr>
+        <w:t xml:space="preserve">against exiting user is performed with a use of </w:t>
+      </w:r>
+      <w:proofErr w:type="spellStart"/>
+      <w:r>
+        <w:rPr>
+          <w:rFonts w:ascii="Courier New" w:hAnsi="Courier New" w:cs="Courier New"/>
+          <w:b/>
+          <w:bCs/>
+        </w:rPr>
+        <w:t>UserDetailsService</w:t>
+      </w:r>
+      <w:proofErr w:type="spellEnd"/>
+      <w:r>
+        <w:rPr>
+          <w:rFonts w:ascii="Arial" w:hAnsi="Arial" w:cs="Arial"/>
+          <w:b/>
+          <w:bCs/>
+        </w:rPr>
+        <w:t xml:space="preserve"> class whose implementation is described</w:t>
+      </w:r>
+      <w:r>
+        <w:rPr>
+          <w:rFonts w:ascii="Arial" w:hAnsi="Arial" w:cs="Arial"/>
+          <w:b/>
+          <w:bCs/>
+        </w:rPr>
+        <w:t xml:space="preserve"> further</w:t>
+      </w:r>
+      <w:r>
+        <w:rPr>
+          <w:rFonts w:ascii="Arial" w:hAnsi="Arial" w:cs="Arial"/>
+          <w:b/>
+          <w:bCs/>
+        </w:rPr>
+        <w:t xml:space="preserve"> in point </w:t>
+      </w:r>
+      <w:r>
+        <w:rPr>
+          <w:rFonts w:ascii="Arial" w:hAnsi="Arial" w:cs="Arial"/>
+          <w:b/>
+          <w:bCs/>
+        </w:rPr>
+        <w:t>2</w:t>
+      </w:r>
+      <w:r>
+        <w:rPr>
+          <w:rFonts w:ascii="Arial" w:hAnsi="Arial" w:cs="Arial"/>
+          <w:b/>
+          <w:bCs/>
+        </w:rPr>
+        <w:t>.</w:t>
+      </w:r>
+    </w:p>
+    <w:p>
+      <w:pPr>
+        <w:rPr>
+          <w:rFonts w:ascii="Arial" w:hAnsi="Arial" w:cs="Arial"/>
+          <w:b/>
+          <w:bCs/>
         </w:rPr>
       </w:pPr>
     </w:p>
@@ -693,32 +1683,152 @@
         <w:rPr>
           <w:rFonts w:ascii="Arial" w:hAnsi="Arial" w:cs="Arial"/>
         </w:rPr>
-        <w:t>further redirection after successful login should be set:</w:t>
+        <w:t>next setting is where user is redirected when authentication is successful:</w:t>
       </w:r>
     </w:p>
     <w:p>
       <w:pPr>
         <w:pStyle w:val="ListParagraph"/>
         <w:ind w:left="927"/>
-        <w:rPr>
-          <w:rFonts w:ascii="Arial" w:hAnsi="Arial" w:cs="Arial"/>
+        <w:jc w:val="center"/>
+        <w:rPr>
+          <w:rFonts w:ascii="Arial" w:hAnsi="Arial" w:cs="Arial"/>
+          <w:b/>
+          <w:bCs/>
+        </w:rPr>
+      </w:pPr>
+      <w:r>
+        <w:rPr>
+          <w:rFonts w:ascii="Arial" w:hAnsi="Arial" w:cs="Arial"/>
+          <w:b/>
+          <w:bCs/>
+        </w:rPr>
+        <w:drawing>
+          <wp:inline distT="0" distB="0" distL="0" distR="0" wp14:anchorId="7716322A" wp14:editId="741E9DA8">
+            <wp:extent cx="3202119" cy="1314450"/>
+            <wp:effectExtent l="0" t="0" r="0" b="0"/>
+            <wp:docPr id="250279954" name="Picture 1" descr="A screen shot of a computer&#10;&#10;AI-generated content may be incorrect."/>
+            <wp:cNvGraphicFramePr>
+              <a:graphicFrameLocks xmlns:a="http://schemas.openxmlformats.org/drawingml/2006/main" noChangeAspect="1"/>
+            </wp:cNvGraphicFramePr>
+            <a:graphic xmlns:a="http://schemas.openxmlformats.org/drawingml/2006/main">
+              <a:graphicData uri="http://schemas.openxmlformats.org/drawingml/2006/picture">
+                <pic:pic xmlns:pic="http://schemas.openxmlformats.org/drawingml/2006/picture">
+                  <pic:nvPicPr>
+                    <pic:cNvPr id="250279954" name="Picture 1" descr="A screen shot of a computer&#10;&#10;AI-generated content may be incorrect."/>
+                    <pic:cNvPicPr/>
+                  </pic:nvPicPr>
+                  <pic:blipFill>
+                    <a:blip r:embed="rId13"/>
+                    <a:stretch>
+                      <a:fillRect/>
+                    </a:stretch>
+                  </pic:blipFill>
+                  <pic:spPr>
+                    <a:xfrm>
+                      <a:off x="0" y="0"/>
+                      <a:ext cx="3209997" cy="1317684"/>
+                    </a:xfrm>
+                    <a:prstGeom prst="rect">
+                      <a:avLst/>
+                    </a:prstGeom>
+                  </pic:spPr>
+                </pic:pic>
+              </a:graphicData>
+            </a:graphic>
+          </wp:inline>
+        </w:drawing>
+      </w:r>
+    </w:p>
+    <w:p>
+      <w:pPr>
+        <w:rPr>
+          <w:rFonts w:ascii="Arial" w:hAnsi="Arial" w:cs="Arial"/>
+          <w:b/>
+          <w:bCs/>
         </w:rPr>
       </w:pPr>
     </w:p>
     <w:p>
       <w:pPr>
         <w:pStyle w:val="ListParagraph"/>
-        <w:ind w:left="567"/>
-        <w:rPr>
-          <w:rFonts w:ascii="Arial" w:hAnsi="Arial" w:cs="Arial"/>
-        </w:rPr>
-      </w:pPr>
-      <w:r>
-        <w:rPr>
-          <w:rFonts w:ascii="Arial" w:hAnsi="Arial" w:cs="Arial"/>
-        </w:rPr>
-        <w:t>????????????????????????????????????????????</w:t>
-      </w:r>
+        <w:numPr>
+          <w:ilvl w:val="0"/>
+          <w:numId w:val="10"/>
+        </w:numPr>
+        <w:rPr>
+          <w:rFonts w:ascii="Arial" w:hAnsi="Arial" w:cs="Arial"/>
+        </w:rPr>
+      </w:pPr>
+      <w:r>
+        <w:rPr>
+          <w:rFonts w:ascii="Arial" w:hAnsi="Arial" w:cs="Arial"/>
+        </w:rPr>
+        <w:t>and next, where, when authentication fails:</w:t>
+      </w:r>
+    </w:p>
+    <w:p>
+      <w:pPr>
+        <w:pStyle w:val="ListParagraph"/>
+        <w:ind w:left="927"/>
+        <w:jc w:val="center"/>
+        <w:rPr>
+          <w:rFonts w:ascii="Arial" w:hAnsi="Arial" w:cs="Arial"/>
+          <w:b/>
+          <w:bCs/>
+        </w:rPr>
+      </w:pPr>
+      <w:r>
+        <w:rPr>
+          <w:rFonts w:ascii="Arial" w:hAnsi="Arial" w:cs="Arial"/>
+          <w:b/>
+          <w:bCs/>
+        </w:rPr>
+        <w:drawing>
+          <wp:inline distT="0" distB="0" distL="0" distR="0" wp14:anchorId="71DD8EA2" wp14:editId="67DA9744">
+            <wp:extent cx="4544059" cy="1467055"/>
+            <wp:effectExtent l="0" t="0" r="0" b="0"/>
+            <wp:docPr id="961814235" name="Picture 1" descr="A computer screen shot of a program&#10;&#10;AI-generated content may be incorrect."/>
+            <wp:cNvGraphicFramePr>
+              <a:graphicFrameLocks xmlns:a="http://schemas.openxmlformats.org/drawingml/2006/main" noChangeAspect="1"/>
+            </wp:cNvGraphicFramePr>
+            <a:graphic xmlns:a="http://schemas.openxmlformats.org/drawingml/2006/main">
+              <a:graphicData uri="http://schemas.openxmlformats.org/drawingml/2006/picture">
+                <pic:pic xmlns:pic="http://schemas.openxmlformats.org/drawingml/2006/picture">
+                  <pic:nvPicPr>
+                    <pic:cNvPr id="961814235" name="Picture 1" descr="A computer screen shot of a program&#10;&#10;AI-generated content may be incorrect."/>
+                    <pic:cNvPicPr/>
+                  </pic:nvPicPr>
+                  <pic:blipFill>
+                    <a:blip r:embed="rId14"/>
+                    <a:stretch>
+                      <a:fillRect/>
+                    </a:stretch>
+                  </pic:blipFill>
+                  <pic:spPr>
+                    <a:xfrm>
+                      <a:off x="0" y="0"/>
+                      <a:ext cx="4544059" cy="1467055"/>
+                    </a:xfrm>
+                    <a:prstGeom prst="rect">
+                      <a:avLst/>
+                    </a:prstGeom>
+                  </pic:spPr>
+                </pic:pic>
+              </a:graphicData>
+            </a:graphic>
+          </wp:inline>
+        </w:drawing>
+      </w:r>
+    </w:p>
+    <w:p>
+      <w:pPr>
+        <w:rPr>
+          <w:rFonts w:ascii="Arial" w:hAnsi="Arial" w:cs="Arial"/>
+          <w:b/>
+          <w:bCs/>
+        </w:rPr>
+      </w:pPr>
     </w:p>
     <w:p>
       <w:pPr>
@@ -728,7 +1838,7 @@
           <w:numId w:val="3"/>
         </w:numPr>
         <w:spacing w:before="240" w:line="360" w:lineRule="auto"/>
-        <w:ind w:left="721" w:hanging="437"/>
+        <w:ind w:left="709" w:hanging="425"/>
         <w:rPr>
           <w:rFonts w:ascii="Arial" w:hAnsi="Arial" w:cs="Arial"/>
           <w:sz w:val="28"/>
@@ -811,9 +1921,9 @@
           <w:noProof/>
         </w:rPr>
         <w:drawing>
-          <wp:inline distT="0" distB="0" distL="0" distR="0" wp14:anchorId="61750FB6" wp14:editId="62E8ABD5">
-            <wp:extent cx="3057525" cy="1520631"/>
-            <wp:effectExtent l="0" t="0" r="0" b="3810"/>
+          <wp:inline distT="0" distB="0" distL="0" distR="0" wp14:anchorId="61750FB6" wp14:editId="61C646E5">
+            <wp:extent cx="3428185" cy="1704975"/>
+            <wp:effectExtent l="0" t="0" r="1270" b="0"/>
             <wp:docPr id="137625622" name="Picture 1"/>
             <wp:cNvGraphicFramePr>
               <a:graphicFrameLocks xmlns:a="http://schemas.openxmlformats.org/drawingml/2006/main" noChangeAspect="1"/>
@@ -826,7 +1936,7 @@
                     <pic:cNvPicPr/>
                   </pic:nvPicPr>
                   <pic:blipFill>
-                    <a:blip r:embed="rId8"/>
+                    <a:blip r:embed="rId15"/>
                     <a:stretch>
                       <a:fillRect/>
                     </a:stretch>
@@ -834,7 +1944,7 @@
                   <pic:spPr>
                     <a:xfrm>
                       <a:off x="0" y="0"/>
-                      <a:ext cx="3065820" cy="1524756"/>
+                      <a:ext cx="3441229" cy="1711462"/>
                     </a:xfrm>
                     <a:prstGeom prst="rect">
                       <a:avLst/>
@@ -851,27 +1961,30 @@
       <w:pPr>
         <w:pStyle w:val="ListParagraph"/>
         <w:ind w:left="0"/>
-        <w:jc w:val="center"/>
-        <w:rPr>
-          <w:rFonts w:ascii="Arial" w:hAnsi="Arial" w:cs="Arial"/>
-        </w:rPr>
-      </w:pPr>
-      <w:r>
-        <w:rPr>
-          <w:rFonts w:ascii="Arial" w:hAnsi="Arial" w:cs="Arial"/>
-        </w:rPr>
-        <w:t>?????????????????????????????????????????????????????????????????</w:t>
-      </w:r>
-    </w:p>
-    <w:p>
-      <w:pPr>
-        <w:pStyle w:val="ListParagraph"/>
-        <w:ind w:left="0"/>
-        <w:jc w:val="center"/>
-        <w:rPr>
-          <w:rFonts w:ascii="Arial" w:hAnsi="Arial" w:cs="Arial"/>
-        </w:rPr>
-      </w:pPr>
+        <w:rPr>
+          <w:rFonts w:ascii="Arial" w:hAnsi="Arial" w:cs="Arial"/>
+        </w:rPr>
+      </w:pPr>
+      <w:r>
+        <w:rPr>
+          <w:rFonts w:ascii="Arial" w:hAnsi="Arial" w:cs="Arial"/>
+        </w:rPr>
+        <w:tab/>
+        <w:t>Its use is described further in point 3.</w:t>
+      </w:r>
+    </w:p>
+    <w:p>
+      <w:pPr>
+        <w:rPr>
+          <w:rFonts w:ascii="Arial" w:hAnsi="Arial" w:cs="Arial"/>
+        </w:rPr>
+      </w:pPr>
+      <w:r>
+        <w:rPr>
+          <w:rFonts w:ascii="Arial" w:hAnsi="Arial" w:cs="Arial"/>
+        </w:rPr>
+        <w:br w:type="page"/>
+      </w:r>
     </w:p>
     <w:p>
       <w:pPr>
@@ -894,135 +2007,6 @@
           <w:sz w:val="32"/>
           <w:szCs w:val="32"/>
         </w:rPr>
-        <w:t xml:space="preserve">Usage of </w:t>
-      </w:r>
-      <w:proofErr w:type="spellStart"/>
-      <w:r>
-        <w:rPr>
-          <w:rFonts w:ascii="Courier New" w:hAnsi="Courier New" w:cs="Courier New"/>
-          <w:sz w:val="32"/>
-          <w:szCs w:val="32"/>
-        </w:rPr>
-        <w:t>PasswordEncoder</w:t>
-      </w:r>
-      <w:proofErr w:type="spellEnd"/>
-      <w:r>
-        <w:rPr>
-          <w:rFonts w:ascii="Arial" w:hAnsi="Arial" w:cs="Arial"/>
-          <w:sz w:val="32"/>
-          <w:szCs w:val="32"/>
-        </w:rPr>
-        <w:t xml:space="preserve"> class:</w:t>
-      </w:r>
-    </w:p>
-    <w:p>
-      <w:pPr>
-        <w:pStyle w:val="ListParagraph"/>
-        <w:numPr>
-          <w:ilvl w:val="0"/>
-          <w:numId w:val="5"/>
-        </w:numPr>
-        <w:spacing w:before="240" w:line="360" w:lineRule="auto"/>
-        <w:ind w:left="709" w:hanging="425"/>
-        <w:rPr>
-          <w:rFonts w:ascii="Arial" w:hAnsi="Arial" w:cs="Arial"/>
-          <w:sz w:val="28"/>
-          <w:szCs w:val="28"/>
-        </w:rPr>
-      </w:pPr>
-      <w:r>
-        <w:rPr>
-          <w:rFonts w:ascii="Arial" w:hAnsi="Arial" w:cs="Arial"/>
-          <w:sz w:val="28"/>
-          <w:szCs w:val="28"/>
-        </w:rPr>
-        <w:t>encoding password when registering users:</w:t>
-      </w:r>
-    </w:p>
-    <w:p>
-      <w:pPr>
-        <w:pStyle w:val="ListParagraph"/>
-        <w:ind w:left="0"/>
-        <w:jc w:val="center"/>
-        <w:rPr>
-          <w:rFonts w:ascii="Arial" w:hAnsi="Arial" w:cs="Arial"/>
-          <w:sz w:val="32"/>
-          <w:szCs w:val="32"/>
-        </w:rPr>
-      </w:pPr>
-      <w:r>
-        <w:rPr>
-          <w:rFonts w:ascii="Arial" w:hAnsi="Arial" w:cs="Arial"/>
-          <w:sz w:val="32"/>
-          <w:szCs w:val="32"/>
-        </w:rPr>
-        <w:drawing>
-          <wp:inline distT="0" distB="0" distL="0" distR="0" wp14:anchorId="56E4520F" wp14:editId="3A47A854">
-            <wp:extent cx="5143500" cy="2715924"/>
-            <wp:effectExtent l="0" t="0" r="0" b="8255"/>
-            <wp:docPr id="242131301" name="Picture 1" descr="A computer screen with text&#10;&#10;AI-generated content may be incorrect."/>
-            <wp:cNvGraphicFramePr>
-              <a:graphicFrameLocks xmlns:a="http://schemas.openxmlformats.org/drawingml/2006/main" noChangeAspect="1"/>
-            </wp:cNvGraphicFramePr>
-            <a:graphic xmlns:a="http://schemas.openxmlformats.org/drawingml/2006/main">
-              <a:graphicData uri="http://schemas.openxmlformats.org/drawingml/2006/picture">
-                <pic:pic xmlns:pic="http://schemas.openxmlformats.org/drawingml/2006/picture">
-                  <pic:nvPicPr>
-                    <pic:cNvPr id="242131301" name="Picture 1" descr="A computer screen with text&#10;&#10;AI-generated content may be incorrect."/>
-                    <pic:cNvPicPr/>
-                  </pic:nvPicPr>
-                  <pic:blipFill>
-                    <a:blip r:embed="rId9"/>
-                    <a:stretch>
-                      <a:fillRect/>
-                    </a:stretch>
-                  </pic:blipFill>
-                  <pic:spPr>
-                    <a:xfrm>
-                      <a:off x="0" y="0"/>
-                      <a:ext cx="5162717" cy="2726071"/>
-                    </a:xfrm>
-                    <a:prstGeom prst="rect">
-                      <a:avLst/>
-                    </a:prstGeom>
-                  </pic:spPr>
-                </pic:pic>
-              </a:graphicData>
-            </a:graphic>
-          </wp:inline>
-        </w:drawing>
-      </w:r>
-    </w:p>
-    <w:p>
-      <w:pPr>
-        <w:rPr>
-          <w:rFonts w:ascii="Arial" w:hAnsi="Arial" w:cs="Arial"/>
-          <w:sz w:val="32"/>
-          <w:szCs w:val="32"/>
-        </w:rPr>
-      </w:pPr>
-    </w:p>
-    <w:p>
-      <w:pPr>
-        <w:pStyle w:val="ListParagraph"/>
-        <w:numPr>
-          <w:ilvl w:val="0"/>
-          <w:numId w:val="4"/>
-        </w:numPr>
-        <w:spacing w:before="240" w:line="360" w:lineRule="auto"/>
-        <w:ind w:left="426" w:hanging="426"/>
-        <w:rPr>
-          <w:rFonts w:ascii="Arial" w:hAnsi="Arial" w:cs="Arial"/>
-          <w:sz w:val="32"/>
-          <w:szCs w:val="32"/>
-        </w:rPr>
-      </w:pPr>
-      <w:r>
-        <w:rPr>
-          <w:rFonts w:ascii="Arial" w:hAnsi="Arial" w:cs="Arial"/>
-          <w:sz w:val="32"/>
-          <w:szCs w:val="32"/>
-        </w:rPr>
         <w:lastRenderedPageBreak/>
         <w:t>Usage of</w:t>
       </w:r>
@@ -1122,6 +2106,9 @@
         </w:rPr>
       </w:pPr>
       <w:r>
+        <w:rPr>
+          <w:noProof/>
+        </w:rPr>
         <w:drawing>
           <wp:inline distT="0" distB="0" distL="0" distR="0" wp14:anchorId="498C8D70" wp14:editId="301ADB3A">
             <wp:extent cx="4385310" cy="400063"/>
@@ -1138,7 +2125,7 @@
                     <pic:cNvPicPr/>
                   </pic:nvPicPr>
                   <pic:blipFill>
-                    <a:blip r:embed="rId10"/>
+                    <a:blip r:embed="rId16"/>
                     <a:stretch>
                       <a:fillRect/>
                     </a:stretch>
@@ -1186,6 +2173,7 @@
         <w:t xml:space="preserve">User Details </w:t>
       </w:r>
       <w:proofErr w:type="spellStart"/>
+      <w:proofErr w:type="gramStart"/>
       <w:r>
         <w:rPr>
           <w:rFonts w:ascii="Courier New" w:hAnsi="Courier New" w:cs="Courier New"/>
@@ -1199,6 +2187,7 @@
         </w:rPr>
         <w:t>(</w:t>
       </w:r>
+      <w:proofErr w:type="gramEnd"/>
       <w:r>
         <w:rPr>
           <w:rFonts w:ascii="Courier New" w:hAnsi="Courier New" w:cs="Courier New"/>
@@ -1209,13 +2198,7 @@
         <w:rPr>
           <w:rFonts w:ascii="Courier New" w:hAnsi="Courier New" w:cs="Courier New"/>
         </w:rPr>
-        <w:t>)</w:t>
-      </w:r>
-      <w:r>
-        <w:rPr>
-          <w:rFonts w:ascii="Courier New" w:hAnsi="Courier New" w:cs="Courier New"/>
-        </w:rPr>
-        <w:t xml:space="preserve">; </w:t>
+        <w:t xml:space="preserve">); </w:t>
       </w:r>
       <w:r>
         <w:rPr>
@@ -1317,7 +2300,7 @@
         <w:rPr>
           <w:rFonts w:ascii="Arial" w:hAnsi="Arial" w:cs="Arial"/>
         </w:rPr>
-        <w:t xml:space="preserve"> if not, an exception is thrown (3)</w:t>
+        <w:t>if not, an exception is thrown (3)</w:t>
       </w:r>
     </w:p>
     <w:p>
@@ -1352,6 +2335,7 @@
       <w:r>
         <w:rPr>
           <w:rFonts w:ascii="Arial" w:hAnsi="Arial" w:cs="Arial"/>
+          <w:noProof/>
         </w:rPr>
         <w:drawing>
           <wp:inline distT="0" distB="0" distL="0" distR="0" wp14:anchorId="64FFC7B5" wp14:editId="439D651D">
@@ -1369,7 +2353,7 @@
                     <pic:cNvPicPr/>
                   </pic:nvPicPr>
                   <pic:blipFill>
-                    <a:blip r:embed="rId11"/>
+                    <a:blip r:embed="rId17"/>
                     <a:stretch>
                       <a:fillRect/>
                     </a:stretch>
@@ -1389,6 +2373,189 @@
           </wp:inline>
         </w:drawing>
       </w:r>
+    </w:p>
+    <w:p>
+      <w:pPr>
+        <w:pStyle w:val="ListParagraph"/>
+        <w:spacing w:line="360" w:lineRule="auto"/>
+        <w:ind w:left="0"/>
+        <w:jc w:val="center"/>
+        <w:rPr>
+          <w:rFonts w:ascii="Arial" w:hAnsi="Arial" w:cs="Arial"/>
+        </w:rPr>
+      </w:pPr>
+    </w:p>
+    <w:p>
+      <w:pPr>
+        <w:pStyle w:val="ListParagraph"/>
+        <w:numPr>
+          <w:ilvl w:val="0"/>
+          <w:numId w:val="4"/>
+        </w:numPr>
+        <w:ind w:left="426" w:hanging="426"/>
+        <w:rPr>
+          <w:rFonts w:ascii="Arial" w:hAnsi="Arial" w:cs="Arial"/>
+          <w:sz w:val="32"/>
+          <w:szCs w:val="32"/>
+        </w:rPr>
+      </w:pPr>
+      <w:r>
+        <w:rPr>
+          <w:rFonts w:ascii="Arial" w:hAnsi="Arial" w:cs="Arial"/>
+          <w:sz w:val="32"/>
+          <w:szCs w:val="32"/>
+        </w:rPr>
+        <w:t>Usage of</w:t>
+      </w:r>
+      <w:r>
+        <w:rPr>
+          <w:rFonts w:ascii="Courier New" w:hAnsi="Courier New" w:cs="Courier New"/>
+          <w:sz w:val="32"/>
+          <w:szCs w:val="32"/>
+        </w:rPr>
+        <w:t xml:space="preserve"> </w:t>
+      </w:r>
+      <w:proofErr w:type="spellStart"/>
+      <w:r>
+        <w:rPr>
+          <w:rFonts w:ascii="Courier New" w:hAnsi="Courier New" w:cs="Courier New"/>
+          <w:sz w:val="32"/>
+          <w:szCs w:val="32"/>
+        </w:rPr>
+        <w:t>PasswordEncoder</w:t>
+      </w:r>
+      <w:proofErr w:type="spellEnd"/>
+      <w:r>
+        <w:rPr>
+          <w:rFonts w:ascii="Courier New" w:hAnsi="Courier New" w:cs="Courier New"/>
+          <w:sz w:val="32"/>
+          <w:szCs w:val="32"/>
+        </w:rPr>
+        <w:t xml:space="preserve"> </w:t>
+      </w:r>
+      <w:r>
+        <w:rPr>
+          <w:rFonts w:ascii="Arial" w:hAnsi="Arial" w:cs="Arial"/>
+          <w:sz w:val="32"/>
+          <w:szCs w:val="32"/>
+        </w:rPr>
+        <w:t>class:</w:t>
+      </w:r>
+    </w:p>
+    <w:p>
+      <w:pPr>
+        <w:pStyle w:val="ListParagraph"/>
+        <w:ind w:left="426"/>
+        <w:rPr>
+          <w:rFonts w:ascii="Arial" w:hAnsi="Arial" w:cs="Arial"/>
+          <w:sz w:val="32"/>
+          <w:szCs w:val="32"/>
+        </w:rPr>
+      </w:pPr>
+    </w:p>
+    <w:p>
+      <w:pPr>
+        <w:pStyle w:val="ListParagraph"/>
+        <w:numPr>
+          <w:ilvl w:val="0"/>
+          <w:numId w:val="14"/>
+        </w:numPr>
+        <w:ind w:left="709" w:hanging="425"/>
+        <w:rPr>
+          <w:rFonts w:ascii="Arial" w:hAnsi="Arial" w:cs="Arial"/>
+          <w:sz w:val="28"/>
+          <w:szCs w:val="28"/>
+        </w:rPr>
+      </w:pPr>
+      <w:r>
+        <w:rPr>
+          <w:rFonts w:ascii="Arial" w:hAnsi="Arial" w:cs="Arial"/>
+          <w:sz w:val="28"/>
+          <w:szCs w:val="28"/>
+        </w:rPr>
+        <w:t>encoding password when registering users:</w:t>
+      </w:r>
+    </w:p>
+    <w:p>
+      <w:pPr>
+        <w:pStyle w:val="ListParagraph"/>
+        <w:spacing w:line="360" w:lineRule="auto"/>
+        <w:rPr>
+          <w:rFonts w:ascii="Arial" w:hAnsi="Arial" w:cs="Arial"/>
+        </w:rPr>
+      </w:pPr>
+      <w:r>
+        <w:rPr>
+          <w:rFonts w:ascii="Arial" w:hAnsi="Arial" w:cs="Arial"/>
+        </w:rPr>
+        <w:drawing>
+          <wp:inline distT="0" distB="0" distL="0" distR="0" wp14:anchorId="48EC8393" wp14:editId="62FAEDCC">
+            <wp:extent cx="5143500" cy="2717800"/>
+            <wp:effectExtent l="0" t="0" r="0" b="6350"/>
+            <wp:docPr id="45607124" name="Picture 4" descr="A computer screen with text&#10;&#10;AI-generated content may be incorrect."/>
+            <wp:cNvGraphicFramePr>
+              <a:graphicFrameLocks xmlns:a="http://schemas.openxmlformats.org/drawingml/2006/main" noChangeAspect="1"/>
+            </wp:cNvGraphicFramePr>
+            <a:graphic xmlns:a="http://schemas.openxmlformats.org/drawingml/2006/main">
+              <a:graphicData uri="http://schemas.openxmlformats.org/drawingml/2006/picture">
+                <pic:pic xmlns:pic="http://schemas.openxmlformats.org/drawingml/2006/picture">
+                  <pic:nvPicPr>
+                    <pic:cNvPr id="0" name="Picture 1" descr="A computer screen with text&#10;&#10;AI-generated content may be incorrect."/>
+                    <pic:cNvPicPr>
+                      <a:picLocks noChangeAspect="1" noChangeArrowheads="1"/>
+                    </pic:cNvPicPr>
+                  </pic:nvPicPr>
+                  <pic:blipFill>
+                    <a:blip r:embed="rId18">
+                      <a:extLst>
+                        <a:ext uri="{28A0092B-C50C-407E-A947-70E740481C1C}">
+                          <a14:useLocalDpi xmlns:a14="http://schemas.microsoft.com/office/drawing/2010/main" val="0"/>
+                        </a:ext>
+                      </a:extLst>
+                    </a:blip>
+                    <a:srcRect/>
+                    <a:stretch>
+                      <a:fillRect/>
+                    </a:stretch>
+                  </pic:blipFill>
+                  <pic:spPr bwMode="auto">
+                    <a:xfrm>
+                      <a:off x="0" y="0"/>
+                      <a:ext cx="5143500" cy="2717800"/>
+                    </a:xfrm>
+                    <a:prstGeom prst="rect">
+                      <a:avLst/>
+                    </a:prstGeom>
+                    <a:noFill/>
+                    <a:ln>
+                      <a:noFill/>
+                    </a:ln>
+                  </pic:spPr>
+                </pic:pic>
+              </a:graphicData>
+            </a:graphic>
+          </wp:inline>
+        </w:drawing>
+      </w:r>
+    </w:p>
+    <w:p>
+      <w:pPr>
+        <w:pStyle w:val="ListParagraph"/>
+        <w:spacing w:line="360" w:lineRule="auto"/>
+        <w:rPr>
+          <w:rFonts w:ascii="Arial" w:hAnsi="Arial" w:cs="Arial"/>
+        </w:rPr>
+      </w:pPr>
+    </w:p>
+    <w:p>
+      <w:pPr>
+        <w:pStyle w:val="ListParagraph"/>
+        <w:spacing w:line="360" w:lineRule="auto"/>
+        <w:ind w:left="0"/>
+        <w:rPr>
+          <w:rFonts w:ascii="Arial" w:hAnsi="Arial" w:cs="Arial"/>
+        </w:rPr>
+      </w:pPr>
     </w:p>
     <w:sectPr>
       <w:pgSz w:w="11906" w:h="16838"/>
@@ -2383,15 +3550,6 @@
   </w:num>
   <w:num w:numId="6" w16cid:durableId="1403067222">
     <w:abstractNumId w:val="1"/>
-    <w:lvlOverride w:ilvl="0"/>
-    <w:lvlOverride w:ilvl="1"/>
-    <w:lvlOverride w:ilvl="2"/>
-    <w:lvlOverride w:ilvl="3"/>
-    <w:lvlOverride w:ilvl="4"/>
-    <w:lvlOverride w:ilvl="5"/>
-    <w:lvlOverride w:ilvl="6"/>
-    <w:lvlOverride w:ilvl="7"/>
-    <w:lvlOverride w:ilvl="8"/>
   </w:num>
   <w:num w:numId="7" w16cid:durableId="1141507692">
     <w:abstractNumId w:val="3"/>
@@ -2410,6 +3568,9 @@
   </w:num>
   <w:num w:numId="12" w16cid:durableId="1285817368">
     <w:abstractNumId w:val="9"/>
+  </w:num>
+  <w:num w:numId="13" w16cid:durableId="220286772">
+    <w:abstractNumId w:val="1"/>
     <w:lvlOverride w:ilvl="0"/>
     <w:lvlOverride w:ilvl="1"/>
     <w:lvlOverride w:ilvl="2"/>
@@ -2419,6 +3580,36 @@
     <w:lvlOverride w:ilvl="6"/>
     <w:lvlOverride w:ilvl="7"/>
     <w:lvlOverride w:ilvl="8"/>
+  </w:num>
+  <w:num w:numId="14" w16cid:durableId="1454251544">
+    <w:abstractNumId w:val="5"/>
+    <w:lvlOverride w:ilvl="0">
+      <w:startOverride w:val="1"/>
+    </w:lvlOverride>
+    <w:lvlOverride w:ilvl="1">
+      <w:startOverride w:val="1"/>
+    </w:lvlOverride>
+    <w:lvlOverride w:ilvl="2">
+      <w:startOverride w:val="1"/>
+    </w:lvlOverride>
+    <w:lvlOverride w:ilvl="3">
+      <w:startOverride w:val="1"/>
+    </w:lvlOverride>
+    <w:lvlOverride w:ilvl="4">
+      <w:startOverride w:val="1"/>
+    </w:lvlOverride>
+    <w:lvlOverride w:ilvl="5">
+      <w:startOverride w:val="1"/>
+    </w:lvlOverride>
+    <w:lvlOverride w:ilvl="6">
+      <w:startOverride w:val="1"/>
+    </w:lvlOverride>
+    <w:lvlOverride w:ilvl="7">
+      <w:startOverride w:val="1"/>
+    </w:lvlOverride>
+    <w:lvlOverride w:ilvl="8">
+      <w:startOverride w:val="1"/>
+    </w:lvlOverride>
   </w:num>
 </w:numbering>
 </file>

</xml_diff>

<commit_message>
Highlight links in text to other paragraphs dicussing topic further
</commit_message>
<xml_diff>
--- a/Spring_security_concept.docx
+++ b/Spring_security_concept.docx
@@ -753,13 +753,7 @@
         <w:rPr>
           <w:rFonts w:ascii="Courier New" w:hAnsi="Courier New" w:cs="Courier New"/>
         </w:rPr>
-        <w:t>(</w:t>
-      </w:r>
-      <w:r>
-        <w:rPr>
-          <w:rFonts w:ascii="Courier New" w:hAnsi="Courier New" w:cs="Courier New"/>
-        </w:rPr>
-        <w:t>login -&gt; login…</w:t>
+        <w:t>(login -&gt; login…</w:t>
       </w:r>
       <w:r>
         <w:rPr>
@@ -798,6 +792,7 @@
       <w:r>
         <w:rPr>
           <w:rFonts w:ascii="Courier New" w:hAnsi="Courier New" w:cs="Courier New"/>
+          <w:noProof/>
         </w:rPr>
         <w:drawing>
           <wp:inline distT="0" distB="0" distL="0" distR="0" wp14:anchorId="4126E4D3" wp14:editId="04B59069">
@@ -891,6 +886,7 @@
       <w:r>
         <w:rPr>
           <w:rFonts w:ascii="Arial" w:hAnsi="Arial" w:cs="Arial"/>
+          <w:noProof/>
         </w:rPr>
         <w:drawing>
           <wp:inline distT="0" distB="0" distL="0" distR="0" wp14:anchorId="0A53AF75" wp14:editId="7AFEF5FF">
@@ -1078,6 +1074,7 @@
       <w:r>
         <w:rPr>
           <w:rFonts w:ascii="Arial" w:hAnsi="Arial" w:cs="Arial"/>
+          <w:noProof/>
         </w:rPr>
         <w:drawing>
           <wp:inline distT="0" distB="0" distL="0" distR="0" wp14:anchorId="561FA94A" wp14:editId="17AE6FBA">
@@ -1156,6 +1153,7 @@
           <w:rFonts w:ascii="Arial" w:hAnsi="Arial" w:cs="Arial"/>
           <w:b/>
           <w:bCs/>
+          <w:noProof/>
         </w:rPr>
         <w:drawing>
           <wp:inline distT="0" distB="0" distL="0" distR="0" wp14:anchorId="086996BE" wp14:editId="0C2DFA1A">
@@ -1432,15 +1430,7 @@
           <w:b/>
           <w:bCs/>
         </w:rPr>
-        <w:t xml:space="preserve"> </w:t>
-      </w:r>
-      <w:r>
-        <w:rPr>
-          <w:rFonts w:ascii="Courier New" w:hAnsi="Courier New" w:cs="Courier New"/>
-          <w:b/>
-          <w:bCs/>
-        </w:rPr>
-        <w:t>.</w:t>
+        <w:t xml:space="preserve"> .</w:t>
       </w:r>
       <w:proofErr w:type="spellStart"/>
       <w:r>
@@ -1546,6 +1536,7 @@
           <w:rFonts w:ascii="Courier New" w:hAnsi="Courier New" w:cs="Courier New"/>
           <w:b/>
           <w:bCs/>
+          <w:noProof/>
         </w:rPr>
         <w:drawing>
           <wp:inline distT="0" distB="0" distL="0" distR="0" wp14:anchorId="77DCC4FE" wp14:editId="1C9D68FA">
@@ -1640,13 +1631,23 @@
           <w:b/>
           <w:bCs/>
         </w:rPr>
-        <w:t xml:space="preserve"> in point </w:t>
-      </w:r>
-      <w:r>
-        <w:rPr>
-          <w:rFonts w:ascii="Arial" w:hAnsi="Arial" w:cs="Arial"/>
-          <w:b/>
-          <w:bCs/>
+        <w:t xml:space="preserve"> in </w:t>
+      </w:r>
+      <w:r>
+        <w:rPr>
+          <w:rFonts w:ascii="Arial" w:hAnsi="Arial" w:cs="Arial"/>
+          <w:b/>
+          <w:bCs/>
+          <w:color w:val="4C94D8" w:themeColor="text2" w:themeTint="80"/>
+        </w:rPr>
+        <w:t xml:space="preserve">point </w:t>
+      </w:r>
+      <w:r>
+        <w:rPr>
+          <w:rFonts w:ascii="Arial" w:hAnsi="Arial" w:cs="Arial"/>
+          <w:b/>
+          <w:bCs/>
+          <w:color w:val="4C94D8" w:themeColor="text2" w:themeTint="80"/>
         </w:rPr>
         <w:t>2</w:t>
       </w:r>
@@ -1702,6 +1703,7 @@
           <w:rFonts w:ascii="Arial" w:hAnsi="Arial" w:cs="Arial"/>
           <w:b/>
           <w:bCs/>
+          <w:noProof/>
         </w:rPr>
         <w:drawing>
           <wp:inline distT="0" distB="0" distL="0" distR="0" wp14:anchorId="7716322A" wp14:editId="741E9DA8">
@@ -1783,6 +1785,7 @@
           <w:rFonts w:ascii="Arial" w:hAnsi="Arial" w:cs="Arial"/>
           <w:b/>
           <w:bCs/>
+          <w:noProof/>
         </w:rPr>
         <w:drawing>
           <wp:inline distT="0" distB="0" distL="0" distR="0" wp14:anchorId="71DD8EA2" wp14:editId="67DA9744">
@@ -1961,6 +1964,16 @@
       <w:pPr>
         <w:pStyle w:val="ListParagraph"/>
         <w:ind w:left="0"/>
+        <w:jc w:val="center"/>
+        <w:rPr>
+          <w:rFonts w:ascii="Arial" w:hAnsi="Arial" w:cs="Arial"/>
+        </w:rPr>
+      </w:pPr>
+    </w:p>
+    <w:p>
+      <w:pPr>
+        <w:pStyle w:val="ListParagraph"/>
+        <w:ind w:left="0"/>
         <w:rPr>
           <w:rFonts w:ascii="Arial" w:hAnsi="Arial" w:cs="Arial"/>
         </w:rPr>
@@ -1970,7 +1983,20 @@
           <w:rFonts w:ascii="Arial" w:hAnsi="Arial" w:cs="Arial"/>
         </w:rPr>
         <w:tab/>
-        <w:t>Its use is described further in point 3.</w:t>
+        <w:t xml:space="preserve">Its use is described further in </w:t>
+      </w:r>
+      <w:r>
+        <w:rPr>
+          <w:rFonts w:ascii="Arial" w:hAnsi="Arial" w:cs="Arial"/>
+          <w:color w:val="4C94D8" w:themeColor="text2" w:themeTint="80"/>
+        </w:rPr>
+        <w:t>point 3</w:t>
+      </w:r>
+      <w:r>
+        <w:rPr>
+          <w:rFonts w:ascii="Arial" w:hAnsi="Arial" w:cs="Arial"/>
+        </w:rPr>
+        <w:t>.</w:t>
       </w:r>
     </w:p>
     <w:p>
@@ -2487,6 +2513,7 @@
       <w:r>
         <w:rPr>
           <w:rFonts w:ascii="Arial" w:hAnsi="Arial" w:cs="Arial"/>
+          <w:noProof/>
         </w:rPr>
         <w:drawing>
           <wp:inline distT="0" distB="0" distL="0" distR="0" wp14:anchorId="48EC8393" wp14:editId="62FAEDCC">
@@ -3571,15 +3598,6 @@
   </w:num>
   <w:num w:numId="13" w16cid:durableId="220286772">
     <w:abstractNumId w:val="1"/>
-    <w:lvlOverride w:ilvl="0"/>
-    <w:lvlOverride w:ilvl="1"/>
-    <w:lvlOverride w:ilvl="2"/>
-    <w:lvlOverride w:ilvl="3"/>
-    <w:lvlOverride w:ilvl="4"/>
-    <w:lvlOverride w:ilvl="5"/>
-    <w:lvlOverride w:ilvl="6"/>
-    <w:lvlOverride w:ilvl="7"/>
-    <w:lvlOverride w:ilvl="8"/>
   </w:num>
   <w:num w:numId="14" w16cid:durableId="1454251544">
     <w:abstractNumId w:val="5"/>
@@ -4217,6 +4235,7 @@
   <w:style w:type="character" w:default="1" w:styleId="DefaultParagraphFont">
     <w:name w:val="Default Paragraph Font"/>
     <w:uiPriority w:val="1"/>
+    <w:semiHidden/>
     <w:unhideWhenUsed/>
   </w:style>
   <w:style w:type="table" w:default="1" w:styleId="TableNormal">

</xml_diff>

<commit_message>
In instruction: explain a use of UserDetailsService class
</commit_message>
<xml_diff>
--- a/Spring_security_concept.docx
+++ b/Spring_security_concept.docx
@@ -531,7 +531,6 @@
         <w:t xml:space="preserve">, the latter’s method </w:t>
       </w:r>
       <w:proofErr w:type="spellStart"/>
-      <w:proofErr w:type="gramStart"/>
       <w:r>
         <w:rPr>
           <w:rFonts w:ascii="Courier New" w:hAnsi="Courier New" w:cs="Courier New"/>
@@ -543,14 +542,7 @@
         <w:rPr>
           <w:rFonts w:ascii="Courier New" w:hAnsi="Courier New" w:cs="Courier New"/>
         </w:rPr>
-        <w:t>(</w:t>
-      </w:r>
-      <w:proofErr w:type="gramEnd"/>
-      <w:r>
-        <w:rPr>
-          <w:rFonts w:ascii="Courier New" w:hAnsi="Courier New" w:cs="Courier New"/>
-        </w:rPr>
-        <w:t>Customizer&lt;</w:t>
+        <w:t>(Customizer&lt;</w:t>
       </w:r>
       <w:proofErr w:type="spellStart"/>
       <w:r>
@@ -673,7 +665,6 @@
           <w:noProof/>
         </w:rPr>
       </w:pPr>
-      <w:proofErr w:type="gramStart"/>
       <w:r>
         <w:rPr>
           <w:rFonts w:ascii="Arial" w:hAnsi="Arial" w:cs="Arial"/>
@@ -700,7 +691,6 @@
         <w:t>loginPage</w:t>
       </w:r>
       <w:proofErr w:type="spellEnd"/>
-      <w:proofErr w:type="gramEnd"/>
       <w:r>
         <w:rPr>
           <w:rFonts w:ascii="Courier New" w:hAnsi="Courier New" w:cs="Courier New"/>
@@ -725,14 +715,7 @@
         <w:rPr>
           <w:rFonts w:ascii="Arial" w:hAnsi="Arial" w:cs="Arial"/>
         </w:rPr>
-        <w:t xml:space="preserve"> </w:t>
-      </w:r>
-      <w:proofErr w:type="gramStart"/>
-      <w:r>
-        <w:rPr>
-          <w:rFonts w:ascii="Arial" w:hAnsi="Arial" w:cs="Arial"/>
-        </w:rPr>
-        <w:t xml:space="preserve">in </w:t>
+        <w:t xml:space="preserve"> in </w:t>
       </w:r>
       <w:r>
         <w:rPr>
@@ -748,7 +731,6 @@
         <w:t>formLogin</w:t>
       </w:r>
       <w:proofErr w:type="spellEnd"/>
-      <w:proofErr w:type="gramEnd"/>
       <w:r>
         <w:rPr>
           <w:rFonts w:ascii="Courier New" w:hAnsi="Courier New" w:cs="Courier New"/>
@@ -943,7 +925,6 @@
           <w:rFonts w:ascii="Arial" w:hAnsi="Arial" w:cs="Arial"/>
         </w:rPr>
       </w:pPr>
-      <w:proofErr w:type="gramStart"/>
       <w:r>
         <w:rPr>
           <w:rFonts w:ascii="Arial" w:hAnsi="Arial" w:cs="Arial"/>
@@ -964,7 +945,6 @@
         <w:t>usernameParameter</w:t>
       </w:r>
       <w:proofErr w:type="spellEnd"/>
-      <w:proofErr w:type="gramEnd"/>
       <w:r>
         <w:rPr>
           <w:rFonts w:ascii="Courier New" w:hAnsi="Courier New" w:cs="Courier New"/>
@@ -989,7 +969,6 @@
         </w:rPr>
         <w:t xml:space="preserve"> </w:t>
       </w:r>
-      <w:proofErr w:type="gramStart"/>
       <w:r>
         <w:rPr>
           <w:rFonts w:ascii="Arial" w:hAnsi="Arial" w:cs="Arial"/>
@@ -1010,7 +989,6 @@
         <w:t>passwordParameter</w:t>
       </w:r>
       <w:proofErr w:type="spellEnd"/>
-      <w:proofErr w:type="gramEnd"/>
       <w:r>
         <w:rPr>
           <w:rFonts w:ascii="Courier New" w:hAnsi="Courier New" w:cs="Courier New"/>
@@ -1023,7 +1001,6 @@
         </w:rPr>
         <w:t xml:space="preserve"> </w:t>
       </w:r>
-      <w:proofErr w:type="gramStart"/>
       <w:r>
         <w:rPr>
           <w:rFonts w:ascii="Arial" w:hAnsi="Arial" w:cs="Arial"/>
@@ -1044,7 +1021,6 @@
         <w:t>formLogin</w:t>
       </w:r>
       <w:proofErr w:type="spellEnd"/>
-      <w:proofErr w:type="gramEnd"/>
       <w:r>
         <w:rPr>
           <w:rFonts w:ascii="Courier New" w:hAnsi="Courier New" w:cs="Courier New"/>
@@ -1194,17 +1170,29 @@
     </w:p>
     <w:p>
       <w:pPr>
-        <w:rPr>
-          <w:rFonts w:ascii="Arial" w:hAnsi="Arial" w:cs="Arial"/>
-          <w:b/>
-          <w:bCs/>
-        </w:rPr>
-      </w:pPr>
-      <w:r>
-        <w:rPr>
-          <w:rFonts w:ascii="Arial" w:hAnsi="Arial" w:cs="Arial"/>
-          <w:b/>
-          <w:bCs/>
+        <w:jc w:val="center"/>
+        <w:rPr>
+          <w:rFonts w:ascii="Arial" w:hAnsi="Arial" w:cs="Arial"/>
+          <w:b/>
+          <w:bCs/>
+        </w:rPr>
+      </w:pPr>
+    </w:p>
+    <w:p>
+      <w:pPr>
+        <w:rPr>
+          <w:rFonts w:ascii="Arial" w:hAnsi="Arial" w:cs="Arial"/>
+          <w:b/>
+          <w:bCs/>
+          <w:u w:val="single"/>
+        </w:rPr>
+      </w:pPr>
+      <w:r>
+        <w:rPr>
+          <w:rFonts w:ascii="Arial" w:hAnsi="Arial" w:cs="Arial"/>
+          <w:b/>
+          <w:bCs/>
+          <w:u w:val="single"/>
         </w:rPr>
         <w:t>NOTE</w:t>
       </w:r>
@@ -1213,6 +1201,7 @@
           <w:rFonts w:ascii="Arial" w:hAnsi="Arial" w:cs="Arial"/>
           <w:b/>
           <w:bCs/>
+          <w:u w:val="single"/>
         </w:rPr>
         <w:t>S</w:t>
       </w:r>
@@ -1221,6 +1210,7 @@
           <w:rFonts w:ascii="Arial" w:hAnsi="Arial" w:cs="Arial"/>
           <w:b/>
           <w:bCs/>
+          <w:u w:val="single"/>
         </w:rPr>
         <w:t>:</w:t>
       </w:r>
@@ -1247,16 +1237,7 @@
           <w:b/>
           <w:bCs/>
         </w:rPr>
-        <w:t>”</w:t>
-      </w:r>
-      <w:proofErr w:type="gramStart"/>
-      <w:r>
-        <w:rPr>
-          <w:rFonts w:ascii="Arial" w:hAnsi="Arial" w:cs="Arial"/>
-          <w:b/>
-          <w:bCs/>
-        </w:rPr>
-        <w:t xml:space="preserve">, </w:t>
+        <w:t xml:space="preserve">”, </w:t>
       </w:r>
       <w:r>
         <w:rPr>
@@ -1276,7 +1257,6 @@
         <w:t>usernameParameter</w:t>
       </w:r>
       <w:proofErr w:type="spellEnd"/>
-      <w:proofErr w:type="gramEnd"/>
       <w:r>
         <w:rPr>
           <w:rFonts w:ascii="Courier New" w:hAnsi="Courier New" w:cs="Courier New"/>
@@ -1309,7 +1289,6 @@
         </w:rPr>
         <w:t xml:space="preserve"> </w:t>
       </w:r>
-      <w:proofErr w:type="gramStart"/>
       <w:r>
         <w:rPr>
           <w:rFonts w:ascii="Arial" w:hAnsi="Arial" w:cs="Arial"/>
@@ -1336,7 +1315,6 @@
         <w:t>passwordParameter</w:t>
       </w:r>
       <w:proofErr w:type="spellEnd"/>
-      <w:proofErr w:type="gramEnd"/>
       <w:r>
         <w:rPr>
           <w:rFonts w:ascii="Courier New" w:hAnsi="Courier New" w:cs="Courier New"/>
@@ -1353,7 +1331,6 @@
         </w:rPr>
         <w:t xml:space="preserve"> </w:t>
       </w:r>
-      <w:proofErr w:type="gramStart"/>
       <w:r>
         <w:rPr>
           <w:rFonts w:ascii="Arial" w:hAnsi="Arial" w:cs="Arial"/>
@@ -1380,49 +1357,21 @@
         <w:t>formLogin</w:t>
       </w:r>
       <w:proofErr w:type="spellEnd"/>
-      <w:proofErr w:type="gramEnd"/>
-      <w:r>
-        <w:rPr>
-          <w:rFonts w:ascii="Courier New" w:hAnsi="Courier New" w:cs="Courier New"/>
-          <w:b/>
-          <w:bCs/>
-        </w:rPr>
-        <w:t>(login -&gt; login</w:t>
-      </w:r>
-      <w:proofErr w:type="gramStart"/>
-      <w:r>
-        <w:rPr>
-          <w:rFonts w:ascii="Courier New" w:hAnsi="Courier New" w:cs="Courier New"/>
-          <w:b/>
-          <w:bCs/>
-        </w:rPr>
-        <w:t>…)</w:t>
-      </w:r>
-      <w:r>
-        <w:rPr>
-          <w:rFonts w:ascii="Arial" w:hAnsi="Arial" w:cs="Arial"/>
-          <w:b/>
-          <w:bCs/>
-        </w:rPr>
-        <w:t>are</w:t>
-      </w:r>
-      <w:proofErr w:type="gramEnd"/>
-      <w:r>
-        <w:rPr>
-          <w:rFonts w:ascii="Arial" w:hAnsi="Arial" w:cs="Arial"/>
-          <w:b/>
-          <w:bCs/>
-        </w:rPr>
-        <w:t xml:space="preserve"> not required </w:t>
-      </w:r>
-      <w:proofErr w:type="gramStart"/>
-      <w:r>
-        <w:rPr>
-          <w:rFonts w:ascii="Arial" w:hAnsi="Arial" w:cs="Arial"/>
-          <w:b/>
-          <w:bCs/>
-        </w:rPr>
-        <w:t>in</w:t>
+      <w:r>
+        <w:rPr>
+          <w:rFonts w:ascii="Courier New" w:hAnsi="Courier New" w:cs="Courier New"/>
+          <w:b/>
+          <w:bCs/>
+        </w:rPr>
+        <w:t>(login -&gt; login…)</w:t>
+      </w:r>
+      <w:r>
+        <w:rPr>
+          <w:rFonts w:ascii="Arial" w:hAnsi="Arial" w:cs="Arial"/>
+          <w:b/>
+          <w:bCs/>
+        </w:rPr>
+        <w:t>are not required in</w:t>
       </w:r>
       <w:r>
         <w:rPr>
@@ -1442,7 +1391,6 @@
         <w:t>loginPage</w:t>
       </w:r>
       <w:proofErr w:type="spellEnd"/>
-      <w:proofErr w:type="gramEnd"/>
       <w:r>
         <w:rPr>
           <w:rFonts w:ascii="Courier New" w:hAnsi="Courier New" w:cs="Courier New"/>
@@ -1475,16 +1423,7 @@
           <w:b/>
           <w:bCs/>
         </w:rPr>
-        <w:t xml:space="preserve"> </w:t>
-      </w:r>
-      <w:proofErr w:type="gramStart"/>
-      <w:r>
-        <w:rPr>
-          <w:rFonts w:ascii="Arial" w:hAnsi="Arial" w:cs="Arial"/>
-          <w:b/>
-          <w:bCs/>
-        </w:rPr>
-        <w:t xml:space="preserve">in </w:t>
+        <w:t xml:space="preserve"> in </w:t>
       </w:r>
       <w:r>
         <w:rPr>
@@ -1504,7 +1443,6 @@
         <w:t>formLogin</w:t>
       </w:r>
       <w:proofErr w:type="spellEnd"/>
-      <w:proofErr w:type="gramEnd"/>
       <w:r>
         <w:rPr>
           <w:rFonts w:ascii="Courier New" w:hAnsi="Courier New" w:cs="Courier New"/>
@@ -1662,15 +1600,6 @@
     </w:p>
     <w:p>
       <w:pPr>
-        <w:rPr>
-          <w:rFonts w:ascii="Arial" w:hAnsi="Arial" w:cs="Arial"/>
-          <w:b/>
-          <w:bCs/>
-        </w:rPr>
-      </w:pPr>
-    </w:p>
-    <w:p>
-      <w:pPr>
         <w:pStyle w:val="ListParagraph"/>
         <w:numPr>
           <w:ilvl w:val="0"/>
@@ -2190,16 +2119,35 @@
         <w:rPr>
           <w:rFonts w:ascii="Arial" w:hAnsi="Arial" w:cs="Arial"/>
         </w:rPr>
-        <w:t xml:space="preserve">n this class, </w:t>
-      </w:r>
-      <w:r>
-        <w:rPr>
-          <w:rFonts w:ascii="Courier New" w:hAnsi="Courier New" w:cs="Courier New"/>
-        </w:rPr>
-        <w:t xml:space="preserve">User Details </w:t>
+        <w:t>n this class</w:t>
+      </w:r>
+      <w:r>
+        <w:rPr>
+          <w:rFonts w:ascii="Arial" w:hAnsi="Arial" w:cs="Arial"/>
+        </w:rPr>
+        <w:t xml:space="preserve"> the method</w:t>
+      </w:r>
+      <w:r>
+        <w:rPr>
+          <w:rFonts w:ascii="Arial" w:hAnsi="Arial" w:cs="Arial"/>
+        </w:rPr>
+        <w:t xml:space="preserve"> </w:t>
       </w:r>
       <w:proofErr w:type="spellStart"/>
-      <w:proofErr w:type="gramStart"/>
+      <w:r>
+        <w:rPr>
+          <w:rFonts w:ascii="Courier New" w:hAnsi="Courier New" w:cs="Courier New"/>
+        </w:rPr>
+        <w:t>UserDetails</w:t>
+      </w:r>
+      <w:proofErr w:type="spellEnd"/>
+      <w:r>
+        <w:rPr>
+          <w:rFonts w:ascii="Courier New" w:hAnsi="Courier New" w:cs="Courier New"/>
+        </w:rPr>
+        <w:t xml:space="preserve"> </w:t>
+      </w:r>
+      <w:proofErr w:type="spellStart"/>
       <w:r>
         <w:rPr>
           <w:rFonts w:ascii="Courier New" w:hAnsi="Courier New" w:cs="Courier New"/>
@@ -2213,7 +2161,6 @@
         </w:rPr>
         <w:t>(</w:t>
       </w:r>
-      <w:proofErr w:type="gramEnd"/>
       <w:r>
         <w:rPr>
           <w:rFonts w:ascii="Courier New" w:hAnsi="Courier New" w:cs="Courier New"/>
@@ -2224,13 +2171,19 @@
         <w:rPr>
           <w:rFonts w:ascii="Courier New" w:hAnsi="Courier New" w:cs="Courier New"/>
         </w:rPr>
-        <w:t xml:space="preserve">); </w:t>
-      </w:r>
-      <w:r>
-        <w:rPr>
-          <w:rFonts w:ascii="Arial" w:hAnsi="Arial" w:cs="Arial"/>
-        </w:rPr>
-        <w:t>method is implemented to</w:t>
+        <w:t>);</w:t>
+      </w:r>
+      <w:r>
+        <w:rPr>
+          <w:rFonts w:ascii="Courier New" w:hAnsi="Courier New" w:cs="Courier New"/>
+        </w:rPr>
+        <w:t xml:space="preserve"> </w:t>
+      </w:r>
+      <w:r>
+        <w:rPr>
+          <w:rFonts w:ascii="Arial" w:hAnsi="Arial" w:cs="Arial"/>
+        </w:rPr>
+        <w:t>is implemented to</w:t>
       </w:r>
       <w:r>
         <w:rPr>
@@ -2238,6 +2191,105 @@
         </w:rPr>
         <w:t xml:space="preserve"> get user’s details for checking inserted credentials against registered user’s details.</w:t>
       </w:r>
+    </w:p>
+    <w:p>
+      <w:pPr>
+        <w:spacing w:line="360" w:lineRule="auto"/>
+        <w:ind w:left="426"/>
+        <w:rPr>
+          <w:rFonts w:ascii="Arial" w:hAnsi="Arial" w:cs="Arial"/>
+          <w:b/>
+          <w:bCs/>
+          <w:u w:val="single"/>
+        </w:rPr>
+      </w:pPr>
+      <w:r>
+        <w:rPr>
+          <w:rFonts w:ascii="Arial" w:hAnsi="Arial" w:cs="Arial"/>
+          <w:b/>
+          <w:bCs/>
+          <w:u w:val="single"/>
+        </w:rPr>
+        <w:t>NOTE:</w:t>
+      </w:r>
+    </w:p>
+    <w:p>
+      <w:pPr>
+        <w:spacing w:line="360" w:lineRule="auto"/>
+        <w:ind w:left="426"/>
+        <w:rPr>
+          <w:rFonts w:ascii="Arial" w:hAnsi="Arial" w:cs="Arial"/>
+          <w:b/>
+          <w:bCs/>
+        </w:rPr>
+      </w:pPr>
+      <w:r>
+        <w:rPr>
+          <w:rFonts w:ascii="Arial" w:hAnsi="Arial" w:cs="Arial"/>
+          <w:b/>
+          <w:bCs/>
+        </w:rPr>
+        <w:t xml:space="preserve">Thanks to annotation </w:t>
+      </w:r>
+      <w:r>
+        <w:rPr>
+          <w:rFonts w:ascii="Courier New" w:hAnsi="Courier New" w:cs="Courier New"/>
+          <w:b/>
+          <w:bCs/>
+        </w:rPr>
+        <w:t>@Service</w:t>
+      </w:r>
+      <w:r>
+        <w:rPr>
+          <w:rFonts w:ascii="Arial" w:hAnsi="Arial" w:cs="Arial"/>
+          <w:b/>
+          <w:bCs/>
+        </w:rPr>
+        <w:t xml:space="preserve"> above the class’s name, it’s managed by Spring. That includes instantiation of its</w:t>
+      </w:r>
+      <w:r>
+        <w:rPr>
+          <w:rFonts w:ascii="Arial" w:hAnsi="Arial" w:cs="Arial"/>
+          <w:b/>
+          <w:bCs/>
+        </w:rPr>
+        <w:t xml:space="preserve"> object</w:t>
+      </w:r>
+      <w:r>
+        <w:rPr>
+          <w:rFonts w:ascii="Arial" w:hAnsi="Arial" w:cs="Arial"/>
+          <w:b/>
+          <w:bCs/>
+        </w:rPr>
+        <w:t xml:space="preserve"> and retrieval </w:t>
+      </w:r>
+      <w:r>
+        <w:rPr>
+          <w:rFonts w:ascii="Courier New" w:hAnsi="Courier New" w:cs="Courier New"/>
+          <w:b/>
+          <w:bCs/>
+        </w:rPr>
+        <w:t xml:space="preserve">User </w:t>
+      </w:r>
+      <w:r>
+        <w:rPr>
+          <w:rFonts w:ascii="Arial" w:hAnsi="Arial" w:cs="Arial"/>
+          <w:b/>
+          <w:bCs/>
+        </w:rPr>
+        <w:t>object from its table by a name passed in from a form during a login attempt.</w:t>
+      </w:r>
+    </w:p>
+    <w:p>
+      <w:pPr>
+        <w:spacing w:line="360" w:lineRule="auto"/>
+        <w:ind w:left="426"/>
+        <w:rPr>
+          <w:rFonts w:ascii="Arial" w:hAnsi="Arial" w:cs="Arial"/>
+          <w:b/>
+          <w:bCs/>
+        </w:rPr>
+      </w:pPr>
     </w:p>
     <w:p>
       <w:pPr>
@@ -2251,7 +2303,65 @@
         <w:rPr>
           <w:rFonts w:ascii="Arial" w:hAnsi="Arial" w:cs="Arial"/>
         </w:rPr>
-        <w:t>It accomplished by:</w:t>
+        <w:t>The implementation of the</w:t>
+      </w:r>
+      <w:r>
+        <w:rPr>
+          <w:rFonts w:ascii="Arial" w:hAnsi="Arial" w:cs="Arial"/>
+        </w:rPr>
+        <w:t xml:space="preserve"> method</w:t>
+      </w:r>
+      <w:r>
+        <w:rPr>
+          <w:rFonts w:ascii="Arial" w:hAnsi="Arial" w:cs="Arial"/>
+        </w:rPr>
+        <w:t xml:space="preserve"> </w:t>
+      </w:r>
+      <w:proofErr w:type="spellStart"/>
+      <w:r>
+        <w:rPr>
+          <w:rFonts w:ascii="Courier New" w:hAnsi="Courier New" w:cs="Courier New"/>
+        </w:rPr>
+        <w:t>UserDetails</w:t>
+      </w:r>
+      <w:proofErr w:type="spellEnd"/>
+      <w:r>
+        <w:rPr>
+          <w:rFonts w:ascii="Courier New" w:hAnsi="Courier New" w:cs="Courier New"/>
+        </w:rPr>
+        <w:t xml:space="preserve"> </w:t>
+      </w:r>
+      <w:proofErr w:type="spellStart"/>
+      <w:r>
+        <w:rPr>
+          <w:rFonts w:ascii="Courier New" w:hAnsi="Courier New" w:cs="Courier New"/>
+        </w:rPr>
+        <w:t>loadUserByUsername</w:t>
+      </w:r>
+      <w:proofErr w:type="spellEnd"/>
+      <w:r>
+        <w:rPr>
+          <w:rFonts w:ascii="Courier New" w:hAnsi="Courier New" w:cs="Courier New"/>
+        </w:rPr>
+        <w:t>(String username);</w:t>
+      </w:r>
+      <w:r>
+        <w:rPr>
+          <w:rFonts w:ascii="Arial" w:hAnsi="Arial" w:cs="Arial"/>
+        </w:rPr>
+        <w:t xml:space="preserve"> </w:t>
+      </w:r>
+      <w:r>
+        <w:rPr>
+          <w:rFonts w:ascii="Arial" w:hAnsi="Arial" w:cs="Arial"/>
+        </w:rPr>
+        <w:t xml:space="preserve">is </w:t>
+      </w:r>
+      <w:r>
+        <w:rPr>
+          <w:rFonts w:ascii="Arial" w:hAnsi="Arial" w:cs="Arial"/>
+        </w:rPr>
+        <w:t>accomplished by:</w:t>
       </w:r>
     </w:p>
     <w:p>
@@ -2398,6 +2508,19 @@
             </a:graphic>
           </wp:inline>
         </w:drawing>
+      </w:r>
+    </w:p>
+    <w:p>
+      <w:pPr>
+        <w:rPr>
+          <w:rFonts w:ascii="Arial" w:hAnsi="Arial" w:cs="Arial"/>
+        </w:rPr>
+      </w:pPr>
+      <w:r>
+        <w:rPr>
+          <w:rFonts w:ascii="Arial" w:hAnsi="Arial" w:cs="Arial"/>
+        </w:rPr>
+        <w:br w:type="page"/>
       </w:r>
     </w:p>
     <w:p>
@@ -4235,7 +4358,6 @@
   <w:style w:type="character" w:default="1" w:styleId="DefaultParagraphFont">
     <w:name w:val="Default Paragraph Font"/>
     <w:uiPriority w:val="1"/>
-    <w:semiHidden/>
     <w:unhideWhenUsed/>
   </w:style>
   <w:style w:type="table" w:default="1" w:styleId="TableNormal">

</xml_diff>

<commit_message>
In instruction: add a html form code snipped to the description of a use of UserDetailsService class
</commit_message>
<xml_diff>
--- a/Spring_security_concept.docx
+++ b/Spring_security_concept.docx
@@ -100,14 +100,12 @@
         </w:rPr>
         <w:t xml:space="preserve"> </w:t>
       </w:r>
-      <w:proofErr w:type="spellStart"/>
       <w:r>
         <w:rPr>
           <w:rFonts w:ascii="Courier New" w:hAnsi="Courier New" w:cs="Courier New"/>
         </w:rPr>
         <w:t>SecurityConfiguration</w:t>
       </w:r>
-      <w:proofErr w:type="spellEnd"/>
       <w:r>
         <w:rPr>
           <w:rFonts w:ascii="Arial" w:hAnsi="Arial" w:cs="Arial"/>
@@ -213,7 +211,6 @@
           <w:szCs w:val="28"/>
         </w:rPr>
       </w:pPr>
-      <w:proofErr w:type="spellStart"/>
       <w:r>
         <w:rPr>
           <w:rFonts w:ascii="Courier New" w:hAnsi="Courier New" w:cs="Courier New"/>
@@ -222,7 +219,6 @@
         </w:rPr>
         <w:t>SecurityFilterChain</w:t>
       </w:r>
-      <w:proofErr w:type="spellEnd"/>
       <w:r>
         <w:rPr>
           <w:rFonts w:ascii="Arial" w:hAnsi="Arial" w:cs="Arial"/>
@@ -255,16 +251,8 @@
         <w:rPr>
           <w:rFonts w:ascii="Courier New" w:hAnsi="Courier New" w:cs="Courier New"/>
         </w:rPr>
-        <w:t xml:space="preserve">Bean </w:t>
-      </w:r>
-      <w:proofErr w:type="spellStart"/>
-      <w:r>
-        <w:rPr>
-          <w:rFonts w:ascii="Courier New" w:hAnsi="Courier New" w:cs="Courier New"/>
-        </w:rPr>
-        <w:t>SecurityFilterChain</w:t>
-      </w:r>
-      <w:proofErr w:type="spellEnd"/>
+        <w:t>Bean SecurityFilterChain</w:t>
+      </w:r>
       <w:r>
         <w:rPr>
           <w:rFonts w:ascii="Arial" w:hAnsi="Arial" w:cs="Arial"/>
@@ -295,14 +283,12 @@
           <w:rFonts w:ascii="Arial" w:hAnsi="Arial" w:cs="Arial"/>
         </w:rPr>
       </w:pPr>
-      <w:proofErr w:type="spellStart"/>
       <w:r>
         <w:rPr>
           <w:rFonts w:ascii="Courier New" w:hAnsi="Courier New" w:cs="Courier New"/>
         </w:rPr>
         <w:t>SecurityFilterChain</w:t>
       </w:r>
-      <w:proofErr w:type="spellEnd"/>
       <w:r>
         <w:rPr>
           <w:rFonts w:ascii="Arial" w:hAnsi="Arial" w:cs="Arial"/>
@@ -315,14 +301,12 @@
         </w:rPr>
         <w:t xml:space="preserve"> takes a passed in </w:t>
       </w:r>
-      <w:proofErr w:type="spellStart"/>
       <w:r>
         <w:rPr>
           <w:rFonts w:ascii="Courier New" w:hAnsi="Courier New" w:cs="Courier New"/>
         </w:rPr>
         <w:t>HttpSecurity</w:t>
       </w:r>
-      <w:proofErr w:type="spellEnd"/>
       <w:r>
         <w:rPr>
           <w:rFonts w:ascii="Arial" w:hAnsi="Arial" w:cs="Arial"/>
@@ -353,14 +337,12 @@
         </w:rPr>
         <w:t xml:space="preserve"> </w:t>
       </w:r>
-      <w:proofErr w:type="spellStart"/>
       <w:r>
         <w:rPr>
           <w:rFonts w:ascii="Courier New" w:hAnsi="Courier New" w:cs="Courier New"/>
         </w:rPr>
         <w:t>authorizeHttpRequests</w:t>
       </w:r>
-      <w:proofErr w:type="spellEnd"/>
       <w:r>
         <w:rPr>
           <w:rFonts w:ascii="Arial" w:hAnsi="Arial" w:cs="Arial"/>
@@ -490,28 +472,24 @@
         </w:rPr>
         <w:t xml:space="preserve">further within </w:t>
       </w:r>
-      <w:proofErr w:type="spellStart"/>
       <w:r>
         <w:rPr>
           <w:rFonts w:ascii="Courier New" w:hAnsi="Courier New" w:cs="Courier New"/>
         </w:rPr>
         <w:t>SecurityFilterChain</w:t>
       </w:r>
-      <w:proofErr w:type="spellEnd"/>
       <w:r>
         <w:rPr>
           <w:rFonts w:ascii="Arial" w:hAnsi="Arial" w:cs="Arial"/>
         </w:rPr>
         <w:t xml:space="preserve"> class, with </w:t>
       </w:r>
-      <w:proofErr w:type="spellStart"/>
       <w:r>
         <w:rPr>
           <w:rFonts w:ascii="Courier New" w:hAnsi="Courier New" w:cs="Courier New"/>
         </w:rPr>
         <w:t>HttpSecurity</w:t>
       </w:r>
-      <w:proofErr w:type="spellEnd"/>
       <w:r>
         <w:rPr>
           <w:rFonts w:ascii="Arial" w:hAnsi="Arial" w:cs="Arial"/>
@@ -530,54 +508,11 @@
         </w:rPr>
         <w:t xml:space="preserve">, the latter’s method </w:t>
       </w:r>
-      <w:proofErr w:type="spellStart"/>
-      <w:r>
-        <w:rPr>
-          <w:rFonts w:ascii="Courier New" w:hAnsi="Courier New" w:cs="Courier New"/>
-        </w:rPr>
-        <w:t>formLogin</w:t>
-      </w:r>
-      <w:proofErr w:type="spellEnd"/>
-      <w:r>
-        <w:rPr>
-          <w:rFonts w:ascii="Courier New" w:hAnsi="Courier New" w:cs="Courier New"/>
-        </w:rPr>
-        <w:t>(Customizer&lt;</w:t>
-      </w:r>
-      <w:proofErr w:type="spellStart"/>
-      <w:r>
-        <w:rPr>
-          <w:rFonts w:ascii="Courier New" w:hAnsi="Courier New" w:cs="Courier New"/>
-        </w:rPr>
-        <w:t>FormLoginConfigurer</w:t>
-      </w:r>
-      <w:proofErr w:type="spellEnd"/>
-      <w:r>
-        <w:rPr>
-          <w:rFonts w:ascii="Courier New" w:hAnsi="Courier New" w:cs="Courier New"/>
-        </w:rPr>
-        <w:t>&lt;</w:t>
-      </w:r>
-      <w:proofErr w:type="spellStart"/>
-      <w:r>
-        <w:rPr>
-          <w:rFonts w:ascii="Courier New" w:hAnsi="Courier New" w:cs="Courier New"/>
-        </w:rPr>
-        <w:t>HttpSecurity</w:t>
-      </w:r>
-      <w:proofErr w:type="spellEnd"/>
-      <w:r>
-        <w:rPr>
-          <w:rFonts w:ascii="Courier New" w:hAnsi="Courier New" w:cs="Courier New"/>
-        </w:rPr>
-        <w:t xml:space="preserve">&gt;&gt; </w:t>
-      </w:r>
-      <w:proofErr w:type="spellStart"/>
-      <w:r>
-        <w:rPr>
-          <w:rFonts w:ascii="Courier New" w:hAnsi="Courier New" w:cs="Courier New"/>
-        </w:rPr>
-        <w:t>f</w:t>
+      <w:r>
+        <w:rPr>
+          <w:rFonts w:ascii="Courier New" w:hAnsi="Courier New" w:cs="Courier New"/>
+        </w:rPr>
+        <w:t>formLogin(Customizer&lt;FormLoginConfigurer&lt;HttpSecurity&gt;&gt; f</w:t>
       </w:r>
       <w:r>
         <w:rPr>
@@ -585,7 +520,6 @@
         </w:rPr>
         <w:t>LC</w:t>
       </w:r>
-      <w:proofErr w:type="spellEnd"/>
       <w:r>
         <w:rPr>
           <w:rFonts w:ascii="Courier New" w:hAnsi="Courier New" w:cs="Courier New"/>
@@ -681,35 +615,7 @@
         <w:rPr>
           <w:rFonts w:ascii="Courier New" w:hAnsi="Courier New" w:cs="Courier New"/>
         </w:rPr>
-        <w:t>.</w:t>
-      </w:r>
-      <w:proofErr w:type="spellStart"/>
-      <w:r>
-        <w:rPr>
-          <w:rFonts w:ascii="Courier New" w:hAnsi="Courier New" w:cs="Courier New"/>
-        </w:rPr>
-        <w:t>loginPage</w:t>
-      </w:r>
-      <w:proofErr w:type="spellEnd"/>
-      <w:r>
-        <w:rPr>
-          <w:rFonts w:ascii="Courier New" w:hAnsi="Courier New" w:cs="Courier New"/>
-        </w:rPr>
-        <w:t xml:space="preserve">([login </w:t>
-      </w:r>
-      <w:proofErr w:type="spellStart"/>
-      <w:r>
-        <w:rPr>
-          <w:rFonts w:ascii="Courier New" w:hAnsi="Courier New" w:cs="Courier New"/>
-        </w:rPr>
-        <w:t>url</w:t>
-      </w:r>
-      <w:proofErr w:type="spellEnd"/>
-      <w:r>
-        <w:rPr>
-          <w:rFonts w:ascii="Courier New" w:hAnsi="Courier New" w:cs="Courier New"/>
-        </w:rPr>
-        <w:t>])</w:t>
+        <w:t>.loginPage([login url])</w:t>
       </w:r>
       <w:r>
         <w:rPr>
@@ -721,21 +627,7 @@
         <w:rPr>
           <w:rFonts w:ascii="Courier New" w:hAnsi="Courier New" w:cs="Courier New"/>
         </w:rPr>
-        <w:t>.</w:t>
-      </w:r>
-      <w:proofErr w:type="spellStart"/>
-      <w:r>
-        <w:rPr>
-          <w:rFonts w:ascii="Courier New" w:hAnsi="Courier New" w:cs="Courier New"/>
-        </w:rPr>
-        <w:t>formLogin</w:t>
-      </w:r>
-      <w:proofErr w:type="spellEnd"/>
-      <w:r>
-        <w:rPr>
-          <w:rFonts w:ascii="Courier New" w:hAnsi="Courier New" w:cs="Courier New"/>
-        </w:rPr>
-        <w:t>(login -&gt; login…</w:t>
+        <w:t>.formLogin(login -&gt; login…</w:t>
       </w:r>
       <w:r>
         <w:rPr>
@@ -937,14 +829,12 @@
         </w:rPr>
         <w:t>.</w:t>
       </w:r>
-      <w:proofErr w:type="spellStart"/>
       <w:r>
         <w:rPr>
           <w:rFonts w:ascii="Courier New" w:hAnsi="Courier New" w:cs="Courier New"/>
         </w:rPr>
         <w:t>usernameParameter</w:t>
       </w:r>
-      <w:proofErr w:type="spellEnd"/>
       <w:r>
         <w:rPr>
           <w:rFonts w:ascii="Courier New" w:hAnsi="Courier New" w:cs="Courier New"/>
@@ -979,21 +869,7 @@
         <w:rPr>
           <w:rFonts w:ascii="Courier New" w:hAnsi="Courier New" w:cs="Courier New"/>
         </w:rPr>
-        <w:t>.</w:t>
-      </w:r>
-      <w:proofErr w:type="spellStart"/>
-      <w:r>
-        <w:rPr>
-          <w:rFonts w:ascii="Courier New" w:hAnsi="Courier New" w:cs="Courier New"/>
-        </w:rPr>
-        <w:t>passwordParameter</w:t>
-      </w:r>
-      <w:proofErr w:type="spellEnd"/>
-      <w:r>
-        <w:rPr>
-          <w:rFonts w:ascii="Courier New" w:hAnsi="Courier New" w:cs="Courier New"/>
-        </w:rPr>
-        <w:t>([password])</w:t>
+        <w:t>.passwordParameter([password])</w:t>
       </w:r>
       <w:r>
         <w:rPr>
@@ -1011,21 +887,7 @@
         <w:rPr>
           <w:rFonts w:ascii="Courier New" w:hAnsi="Courier New" w:cs="Courier New"/>
         </w:rPr>
-        <w:t>.</w:t>
-      </w:r>
-      <w:proofErr w:type="spellStart"/>
-      <w:r>
-        <w:rPr>
-          <w:rFonts w:ascii="Courier New" w:hAnsi="Courier New" w:cs="Courier New"/>
-        </w:rPr>
-        <w:t>formLogin</w:t>
-      </w:r>
-      <w:proofErr w:type="spellEnd"/>
-      <w:r>
-        <w:rPr>
-          <w:rFonts w:ascii="Courier New" w:hAnsi="Courier New" w:cs="Courier New"/>
-        </w:rPr>
-        <w:t>(login -&gt; login…)</w:t>
+        <w:t>.formLogin(login -&gt; login…)</w:t>
       </w:r>
       <w:r>
         <w:rPr>
@@ -1247,7 +1109,6 @@
         </w:rPr>
         <w:t>.</w:t>
       </w:r>
-      <w:proofErr w:type="spellStart"/>
       <w:r>
         <w:rPr>
           <w:rFonts w:ascii="Courier New" w:hAnsi="Courier New" w:cs="Courier New"/>
@@ -1256,7 +1117,6 @@
         </w:rPr>
         <w:t>usernameParameter</w:t>
       </w:r>
-      <w:proofErr w:type="spellEnd"/>
       <w:r>
         <w:rPr>
           <w:rFonts w:ascii="Courier New" w:hAnsi="Courier New" w:cs="Courier New"/>
@@ -1303,25 +1163,7 @@
           <w:b/>
           <w:bCs/>
         </w:rPr>
-        <w:t>.</w:t>
-      </w:r>
-      <w:proofErr w:type="spellStart"/>
-      <w:r>
-        <w:rPr>
-          <w:rFonts w:ascii="Courier New" w:hAnsi="Courier New" w:cs="Courier New"/>
-          <w:b/>
-          <w:bCs/>
-        </w:rPr>
-        <w:t>passwordParameter</w:t>
-      </w:r>
-      <w:proofErr w:type="spellEnd"/>
-      <w:r>
-        <w:rPr>
-          <w:rFonts w:ascii="Courier New" w:hAnsi="Courier New" w:cs="Courier New"/>
-          <w:b/>
-          <w:bCs/>
-        </w:rPr>
-        <w:t>([password])</w:t>
+        <w:t>.passwordParameter([password])</w:t>
       </w:r>
       <w:r>
         <w:rPr>
@@ -1345,25 +1187,7 @@
           <w:b/>
           <w:bCs/>
         </w:rPr>
-        <w:t>.</w:t>
-      </w:r>
-      <w:proofErr w:type="spellStart"/>
-      <w:r>
-        <w:rPr>
-          <w:rFonts w:ascii="Courier New" w:hAnsi="Courier New" w:cs="Courier New"/>
-          <w:b/>
-          <w:bCs/>
-        </w:rPr>
-        <w:t>formLogin</w:t>
-      </w:r>
-      <w:proofErr w:type="spellEnd"/>
-      <w:r>
-        <w:rPr>
-          <w:rFonts w:ascii="Courier New" w:hAnsi="Courier New" w:cs="Courier New"/>
-          <w:b/>
-          <w:bCs/>
-        </w:rPr>
-        <w:t>(login -&gt; login…)</w:t>
+        <w:t>.formLogin(login -&gt; login…)</w:t>
       </w:r>
       <w:r>
         <w:rPr>
@@ -1379,43 +1203,7 @@
           <w:b/>
           <w:bCs/>
         </w:rPr>
-        <w:t xml:space="preserve"> .</w:t>
-      </w:r>
-      <w:proofErr w:type="spellStart"/>
-      <w:r>
-        <w:rPr>
-          <w:rFonts w:ascii="Courier New" w:hAnsi="Courier New" w:cs="Courier New"/>
-          <w:b/>
-          <w:bCs/>
-        </w:rPr>
-        <w:t>loginPage</w:t>
-      </w:r>
-      <w:proofErr w:type="spellEnd"/>
-      <w:r>
-        <w:rPr>
-          <w:rFonts w:ascii="Courier New" w:hAnsi="Courier New" w:cs="Courier New"/>
-          <w:b/>
-          <w:bCs/>
-        </w:rPr>
-        <w:t xml:space="preserve">([login </w:t>
-      </w:r>
-      <w:proofErr w:type="spellStart"/>
-      <w:r>
-        <w:rPr>
-          <w:rFonts w:ascii="Courier New" w:hAnsi="Courier New" w:cs="Courier New"/>
-          <w:b/>
-          <w:bCs/>
-        </w:rPr>
-        <w:t>url</w:t>
-      </w:r>
-      <w:proofErr w:type="spellEnd"/>
-      <w:r>
-        <w:rPr>
-          <w:rFonts w:ascii="Courier New" w:hAnsi="Courier New" w:cs="Courier New"/>
-          <w:b/>
-          <w:bCs/>
-        </w:rPr>
-        <w:t>])</w:t>
+        <w:t xml:space="preserve"> .loginPage([login url])</w:t>
       </w:r>
       <w:r>
         <w:rPr>
@@ -1431,25 +1219,7 @@
           <w:b/>
           <w:bCs/>
         </w:rPr>
-        <w:t>.</w:t>
-      </w:r>
-      <w:proofErr w:type="spellStart"/>
-      <w:r>
-        <w:rPr>
-          <w:rFonts w:ascii="Courier New" w:hAnsi="Courier New" w:cs="Courier New"/>
-          <w:b/>
-          <w:bCs/>
-        </w:rPr>
-        <w:t>formLogin</w:t>
-      </w:r>
-      <w:proofErr w:type="spellEnd"/>
-      <w:r>
-        <w:rPr>
-          <w:rFonts w:ascii="Courier New" w:hAnsi="Courier New" w:cs="Courier New"/>
-          <w:b/>
-          <w:bCs/>
-        </w:rPr>
-        <w:t>(login -&gt; login…</w:t>
+        <w:t>.formLogin(login -&gt; login…</w:t>
       </w:r>
       <w:r>
         <w:rPr>
@@ -1537,7 +1307,6 @@
         </w:rPr>
         <w:t xml:space="preserve">against exiting user is performed with a use of </w:t>
       </w:r>
-      <w:proofErr w:type="spellStart"/>
       <w:r>
         <w:rPr>
           <w:rFonts w:ascii="Courier New" w:hAnsi="Courier New" w:cs="Courier New"/>
@@ -1546,7 +1315,6 @@
         </w:rPr>
         <w:t>UserDetailsService</w:t>
       </w:r>
-      <w:proofErr w:type="spellEnd"/>
       <w:r>
         <w:rPr>
           <w:rFonts w:ascii="Arial" w:hAnsi="Arial" w:cs="Arial"/>
@@ -1777,7 +1545,6 @@
           <w:szCs w:val="28"/>
         </w:rPr>
       </w:pPr>
-      <w:proofErr w:type="spellStart"/>
       <w:r>
         <w:rPr>
           <w:rFonts w:ascii="Courier New" w:hAnsi="Courier New" w:cs="Courier New"/>
@@ -1786,7 +1553,6 @@
         </w:rPr>
         <w:t>PasswordEncoder</w:t>
       </w:r>
-      <w:proofErr w:type="spellEnd"/>
       <w:r>
         <w:rPr>
           <w:rFonts w:ascii="Arial" w:hAnsi="Arial" w:cs="Arial"/>
@@ -1813,16 +1579,8 @@
         <w:rPr>
           <w:rFonts w:ascii="Courier New" w:hAnsi="Courier New" w:cs="Courier New"/>
         </w:rPr>
-        <w:t xml:space="preserve"> </w:t>
-      </w:r>
-      <w:proofErr w:type="spellStart"/>
-      <w:r>
-        <w:rPr>
-          <w:rFonts w:ascii="Courier New" w:hAnsi="Courier New" w:cs="Courier New"/>
-        </w:rPr>
-        <w:t>SecurityConfiguration</w:t>
-      </w:r>
-      <w:proofErr w:type="spellEnd"/>
+        <w:t xml:space="preserve"> SecurityConfiguration</w:t>
+      </w:r>
       <w:r>
         <w:rPr>
           <w:rFonts w:ascii="Arial" w:hAnsi="Arial" w:cs="Arial"/>
@@ -1977,7 +1735,6 @@
         </w:rPr>
         <w:t xml:space="preserve"> </w:t>
       </w:r>
-      <w:proofErr w:type="spellStart"/>
       <w:r>
         <w:rPr>
           <w:rFonts w:ascii="Courier New" w:hAnsi="Courier New" w:cs="Courier New"/>
@@ -1986,7 +1743,6 @@
         </w:rPr>
         <w:t>UserDetailsService</w:t>
       </w:r>
-      <w:proofErr w:type="spellEnd"/>
       <w:r>
         <w:rPr>
           <w:rFonts w:ascii="Arial" w:hAnsi="Arial" w:cs="Arial"/>
@@ -2133,33 +1889,11 @@
         </w:rPr>
         <w:t xml:space="preserve"> </w:t>
       </w:r>
-      <w:proofErr w:type="spellStart"/>
-      <w:r>
-        <w:rPr>
-          <w:rFonts w:ascii="Courier New" w:hAnsi="Courier New" w:cs="Courier New"/>
-        </w:rPr>
-        <w:t>UserDetails</w:t>
-      </w:r>
-      <w:proofErr w:type="spellEnd"/>
-      <w:r>
-        <w:rPr>
-          <w:rFonts w:ascii="Courier New" w:hAnsi="Courier New" w:cs="Courier New"/>
-        </w:rPr>
-        <w:t xml:space="preserve"> </w:t>
-      </w:r>
-      <w:proofErr w:type="spellStart"/>
-      <w:r>
-        <w:rPr>
-          <w:rFonts w:ascii="Courier New" w:hAnsi="Courier New" w:cs="Courier New"/>
-        </w:rPr>
-        <w:t>loadUserByUsername</w:t>
-      </w:r>
-      <w:proofErr w:type="spellEnd"/>
-      <w:r>
-        <w:rPr>
-          <w:rFonts w:ascii="Courier New" w:hAnsi="Courier New" w:cs="Courier New"/>
-        </w:rPr>
-        <w:t>(</w:t>
+      <w:r>
+        <w:rPr>
+          <w:rFonts w:ascii="Courier New" w:hAnsi="Courier New" w:cs="Courier New"/>
+        </w:rPr>
+        <w:t>UserDetails loadUserByUsername(</w:t>
       </w:r>
       <w:r>
         <w:rPr>
@@ -2200,94 +1934,6 @@
           <w:rFonts w:ascii="Arial" w:hAnsi="Arial" w:cs="Arial"/>
           <w:b/>
           <w:bCs/>
-          <w:u w:val="single"/>
-        </w:rPr>
-      </w:pPr>
-      <w:r>
-        <w:rPr>
-          <w:rFonts w:ascii="Arial" w:hAnsi="Arial" w:cs="Arial"/>
-          <w:b/>
-          <w:bCs/>
-          <w:u w:val="single"/>
-        </w:rPr>
-        <w:t>NOTE:</w:t>
-      </w:r>
-    </w:p>
-    <w:p>
-      <w:pPr>
-        <w:spacing w:line="360" w:lineRule="auto"/>
-        <w:ind w:left="426"/>
-        <w:rPr>
-          <w:rFonts w:ascii="Arial" w:hAnsi="Arial" w:cs="Arial"/>
-          <w:b/>
-          <w:bCs/>
-        </w:rPr>
-      </w:pPr>
-      <w:r>
-        <w:rPr>
-          <w:rFonts w:ascii="Arial" w:hAnsi="Arial" w:cs="Arial"/>
-          <w:b/>
-          <w:bCs/>
-        </w:rPr>
-        <w:t xml:space="preserve">Thanks to annotation </w:t>
-      </w:r>
-      <w:r>
-        <w:rPr>
-          <w:rFonts w:ascii="Courier New" w:hAnsi="Courier New" w:cs="Courier New"/>
-          <w:b/>
-          <w:bCs/>
-        </w:rPr>
-        <w:t>@Service</w:t>
-      </w:r>
-      <w:r>
-        <w:rPr>
-          <w:rFonts w:ascii="Arial" w:hAnsi="Arial" w:cs="Arial"/>
-          <w:b/>
-          <w:bCs/>
-        </w:rPr>
-        <w:t xml:space="preserve"> above the class’s name, it’s managed by Spring. That includes instantiation of its</w:t>
-      </w:r>
-      <w:r>
-        <w:rPr>
-          <w:rFonts w:ascii="Arial" w:hAnsi="Arial" w:cs="Arial"/>
-          <w:b/>
-          <w:bCs/>
-        </w:rPr>
-        <w:t xml:space="preserve"> object</w:t>
-      </w:r>
-      <w:r>
-        <w:rPr>
-          <w:rFonts w:ascii="Arial" w:hAnsi="Arial" w:cs="Arial"/>
-          <w:b/>
-          <w:bCs/>
-        </w:rPr>
-        <w:t xml:space="preserve"> and retrieval </w:t>
-      </w:r>
-      <w:r>
-        <w:rPr>
-          <w:rFonts w:ascii="Courier New" w:hAnsi="Courier New" w:cs="Courier New"/>
-          <w:b/>
-          <w:bCs/>
-        </w:rPr>
-        <w:t xml:space="preserve">User </w:t>
-      </w:r>
-      <w:r>
-        <w:rPr>
-          <w:rFonts w:ascii="Arial" w:hAnsi="Arial" w:cs="Arial"/>
-          <w:b/>
-          <w:bCs/>
-        </w:rPr>
-        <w:t>object from its table by a name passed in from a form during a login attempt.</w:t>
-      </w:r>
-    </w:p>
-    <w:p>
-      <w:pPr>
-        <w:spacing w:line="360" w:lineRule="auto"/>
-        <w:ind w:left="426"/>
-        <w:rPr>
-          <w:rFonts w:ascii="Arial" w:hAnsi="Arial" w:cs="Arial"/>
-          <w:b/>
-          <w:bCs/>
         </w:rPr>
       </w:pPr>
     </w:p>
@@ -2317,33 +1963,11 @@
         </w:rPr>
         <w:t xml:space="preserve"> </w:t>
       </w:r>
-      <w:proofErr w:type="spellStart"/>
-      <w:r>
-        <w:rPr>
-          <w:rFonts w:ascii="Courier New" w:hAnsi="Courier New" w:cs="Courier New"/>
-        </w:rPr>
-        <w:t>UserDetails</w:t>
-      </w:r>
-      <w:proofErr w:type="spellEnd"/>
-      <w:r>
-        <w:rPr>
-          <w:rFonts w:ascii="Courier New" w:hAnsi="Courier New" w:cs="Courier New"/>
-        </w:rPr>
-        <w:t xml:space="preserve"> </w:t>
-      </w:r>
-      <w:proofErr w:type="spellStart"/>
-      <w:r>
-        <w:rPr>
-          <w:rFonts w:ascii="Courier New" w:hAnsi="Courier New" w:cs="Courier New"/>
-        </w:rPr>
-        <w:t>loadUserByUsername</w:t>
-      </w:r>
-      <w:proofErr w:type="spellEnd"/>
-      <w:r>
-        <w:rPr>
-          <w:rFonts w:ascii="Courier New" w:hAnsi="Courier New" w:cs="Courier New"/>
-        </w:rPr>
-        <w:t>(String username);</w:t>
+      <w:r>
+        <w:rPr>
+          <w:rFonts w:ascii="Courier New" w:hAnsi="Courier New" w:cs="Courier New"/>
+        </w:rPr>
+        <w:t>UserDetails loadUserByUsername(String username);</w:t>
       </w:r>
       <w:r>
         <w:rPr>
@@ -2514,12 +2138,102 @@
       <w:pPr>
         <w:rPr>
           <w:rFonts w:ascii="Arial" w:hAnsi="Arial" w:cs="Arial"/>
-        </w:rPr>
-      </w:pPr>
-      <w:r>
-        <w:rPr>
-          <w:rFonts w:ascii="Arial" w:hAnsi="Arial" w:cs="Arial"/>
-        </w:rPr>
+          <w:b/>
+          <w:bCs/>
+          <w:u w:val="single"/>
+        </w:rPr>
+      </w:pPr>
+      <w:r>
+        <w:rPr>
+          <w:rFonts w:ascii="Arial" w:hAnsi="Arial" w:cs="Arial"/>
+          <w:b/>
+          <w:bCs/>
+          <w:u w:val="single"/>
+        </w:rPr>
+        <w:t>NOTE:</w:t>
+      </w:r>
+    </w:p>
+    <w:p>
+      <w:pPr>
+        <w:rPr>
+          <w:rFonts w:ascii="Arial" w:hAnsi="Arial" w:cs="Arial"/>
+          <w:b/>
+          <w:bCs/>
+        </w:rPr>
+      </w:pPr>
+      <w:r>
+        <w:rPr>
+          <w:rFonts w:ascii="Arial" w:hAnsi="Arial" w:cs="Arial"/>
+          <w:b/>
+          <w:bCs/>
+        </w:rPr>
+        <w:t>Thanks to annotation @Service above the class’s name, it’s managed by Spring. That includes instantiation of its object and retrieval User object from its table by a name passed in from a form during a login attempt.</w:t>
+      </w:r>
+    </w:p>
+    <w:p>
+      <w:pPr>
+        <w:jc w:val="center"/>
+        <w:rPr>
+          <w:rFonts w:ascii="Arial" w:hAnsi="Arial" w:cs="Arial"/>
+          <w:b/>
+          <w:bCs/>
+        </w:rPr>
+      </w:pPr>
+      <w:r>
+        <w:rPr>
+          <w:rFonts w:ascii="Arial" w:hAnsi="Arial" w:cs="Arial"/>
+          <w:b/>
+          <w:bCs/>
+          <w:noProof/>
+        </w:rPr>
+        <w:drawing>
+          <wp:inline distT="0" distB="0" distL="0" distR="0" wp14:anchorId="1FC42168" wp14:editId="1EA216C7">
+            <wp:extent cx="4848224" cy="2256784"/>
+            <wp:effectExtent l="0" t="0" r="0" b="0"/>
+            <wp:docPr id="1997502345" name="Picture 1" descr="A computer screen shot of a program code&#10;&#10;AI-generated content may be incorrect."/>
+            <wp:cNvGraphicFramePr>
+              <a:graphicFrameLocks xmlns:a="http://schemas.openxmlformats.org/drawingml/2006/main" noChangeAspect="1"/>
+            </wp:cNvGraphicFramePr>
+            <a:graphic xmlns:a="http://schemas.openxmlformats.org/drawingml/2006/main">
+              <a:graphicData uri="http://schemas.openxmlformats.org/drawingml/2006/picture">
+                <pic:pic xmlns:pic="http://schemas.openxmlformats.org/drawingml/2006/picture">
+                  <pic:nvPicPr>
+                    <pic:cNvPr id="1743090149" name="Picture 1" descr="A computer screen shot of a program code&#10;&#10;AI-generated content may be incorrect."/>
+                    <pic:cNvPicPr/>
+                  </pic:nvPicPr>
+                  <pic:blipFill>
+                    <a:blip r:embed="rId11"/>
+                    <a:stretch>
+                      <a:fillRect/>
+                    </a:stretch>
+                  </pic:blipFill>
+                  <pic:spPr>
+                    <a:xfrm>
+                      <a:off x="0" y="0"/>
+                      <a:ext cx="4858848" cy="2261729"/>
+                    </a:xfrm>
+                    <a:prstGeom prst="rect">
+                      <a:avLst/>
+                    </a:prstGeom>
+                  </pic:spPr>
+                </pic:pic>
+              </a:graphicData>
+            </a:graphic>
+          </wp:inline>
+        </w:drawing>
+      </w:r>
+    </w:p>
+    <w:p>
+      <w:pPr>
+        <w:rPr>
+          <w:rFonts w:ascii="Arial" w:hAnsi="Arial" w:cs="Arial"/>
+        </w:rPr>
+      </w:pPr>
+      <w:r>
+        <w:rPr>
+          <w:rFonts w:ascii="Arial" w:hAnsi="Arial" w:cs="Arial"/>
+        </w:rPr>
+        <w:lastRenderedPageBreak/>
         <w:br w:type="page"/>
       </w:r>
     </w:p>
@@ -2562,25 +2276,7 @@
           <w:sz w:val="32"/>
           <w:szCs w:val="32"/>
         </w:rPr>
-        <w:t xml:space="preserve"> </w:t>
-      </w:r>
-      <w:proofErr w:type="spellStart"/>
-      <w:r>
-        <w:rPr>
-          <w:rFonts w:ascii="Courier New" w:hAnsi="Courier New" w:cs="Courier New"/>
-          <w:sz w:val="32"/>
-          <w:szCs w:val="32"/>
-        </w:rPr>
-        <w:t>PasswordEncoder</w:t>
-      </w:r>
-      <w:proofErr w:type="spellEnd"/>
-      <w:r>
-        <w:rPr>
-          <w:rFonts w:ascii="Courier New" w:hAnsi="Courier New" w:cs="Courier New"/>
-          <w:sz w:val="32"/>
-          <w:szCs w:val="32"/>
-        </w:rPr>
-        <w:t xml:space="preserve"> </w:t>
+        <w:t xml:space="preserve"> PasswordEncoder </w:t>
       </w:r>
       <w:r>
         <w:rPr>

</xml_diff>

<commit_message>
In java and in tutorial: add logout option
</commit_message>
<xml_diff>
--- a/Spring_security_concept.docx
+++ b/Spring_security_concept.docx
@@ -62,6 +62,7 @@
           <w:rFonts w:ascii="Courier New" w:hAnsi="Courier New" w:cs="Courier New"/>
           <w:sz w:val="28"/>
           <w:szCs w:val="28"/>
+          <w:highlight w:val="yellow"/>
         </w:rPr>
         <w:t>config</w:t>
       </w:r>
@@ -85,6 +86,7 @@
       <w:r>
         <w:rPr>
           <w:rFonts w:ascii="Courier New" w:hAnsi="Courier New" w:cs="Courier New"/>
+          <w:highlight w:val="yellow"/>
         </w:rPr>
         <w:t>config</w:t>
       </w:r>
@@ -100,12 +102,15 @@
         </w:rPr>
         <w:t xml:space="preserve"> </w:t>
       </w:r>
-      <w:r>
-        <w:rPr>
-          <w:rFonts w:ascii="Courier New" w:hAnsi="Courier New" w:cs="Courier New"/>
+      <w:proofErr w:type="spellStart"/>
+      <w:r>
+        <w:rPr>
+          <w:rFonts w:ascii="Courier New" w:hAnsi="Courier New" w:cs="Courier New"/>
+          <w:highlight w:val="yellow"/>
         </w:rPr>
         <w:t>SecurityConfiguration</w:t>
       </w:r>
+      <w:proofErr w:type="spellEnd"/>
       <w:r>
         <w:rPr>
           <w:rFonts w:ascii="Arial" w:hAnsi="Arial" w:cs="Arial"/>
@@ -211,14 +216,17 @@
           <w:szCs w:val="28"/>
         </w:rPr>
       </w:pPr>
+      <w:proofErr w:type="spellStart"/>
       <w:r>
         <w:rPr>
           <w:rFonts w:ascii="Courier New" w:hAnsi="Courier New" w:cs="Courier New"/>
           <w:sz w:val="28"/>
           <w:szCs w:val="28"/>
+          <w:highlight w:val="yellow"/>
         </w:rPr>
         <w:t>SecurityFilterChain</w:t>
       </w:r>
+      <w:proofErr w:type="spellEnd"/>
       <w:r>
         <w:rPr>
           <w:rFonts w:ascii="Arial" w:hAnsi="Arial" w:cs="Arial"/>
@@ -250,9 +258,25 @@
       <w:r>
         <w:rPr>
           <w:rFonts w:ascii="Courier New" w:hAnsi="Courier New" w:cs="Courier New"/>
-        </w:rPr>
-        <w:t>Bean SecurityFilterChain</w:t>
-      </w:r>
+          <w:highlight w:val="yellow"/>
+        </w:rPr>
+        <w:t>Bean</w:t>
+      </w:r>
+      <w:r>
+        <w:rPr>
+          <w:rFonts w:ascii="Courier New" w:hAnsi="Courier New" w:cs="Courier New"/>
+        </w:rPr>
+        <w:t xml:space="preserve"> </w:t>
+      </w:r>
+      <w:proofErr w:type="spellStart"/>
+      <w:r>
+        <w:rPr>
+          <w:rFonts w:ascii="Courier New" w:hAnsi="Courier New" w:cs="Courier New"/>
+          <w:highlight w:val="yellow"/>
+        </w:rPr>
+        <w:t>SecurityFilterChain</w:t>
+      </w:r>
+      <w:proofErr w:type="spellEnd"/>
       <w:r>
         <w:rPr>
           <w:rFonts w:ascii="Arial" w:hAnsi="Arial" w:cs="Arial"/>
@@ -283,12 +307,15 @@
           <w:rFonts w:ascii="Arial" w:hAnsi="Arial" w:cs="Arial"/>
         </w:rPr>
       </w:pPr>
-      <w:r>
-        <w:rPr>
-          <w:rFonts w:ascii="Courier New" w:hAnsi="Courier New" w:cs="Courier New"/>
+      <w:proofErr w:type="spellStart"/>
+      <w:r>
+        <w:rPr>
+          <w:rFonts w:ascii="Courier New" w:hAnsi="Courier New" w:cs="Courier New"/>
+          <w:highlight w:val="yellow"/>
         </w:rPr>
         <w:t>SecurityFilterChain</w:t>
       </w:r>
+      <w:proofErr w:type="spellEnd"/>
       <w:r>
         <w:rPr>
           <w:rFonts w:ascii="Arial" w:hAnsi="Arial" w:cs="Arial"/>
@@ -301,12 +328,15 @@
         </w:rPr>
         <w:t xml:space="preserve"> takes a passed in </w:t>
       </w:r>
-      <w:r>
-        <w:rPr>
-          <w:rFonts w:ascii="Courier New" w:hAnsi="Courier New" w:cs="Courier New"/>
+      <w:proofErr w:type="spellStart"/>
+      <w:r>
+        <w:rPr>
+          <w:rFonts w:ascii="Courier New" w:hAnsi="Courier New" w:cs="Courier New"/>
+          <w:highlight w:val="yellow"/>
         </w:rPr>
         <w:t>HttpSecurity</w:t>
       </w:r>
+      <w:proofErr w:type="spellEnd"/>
       <w:r>
         <w:rPr>
           <w:rFonts w:ascii="Arial" w:hAnsi="Arial" w:cs="Arial"/>
@@ -337,12 +367,15 @@
         </w:rPr>
         <w:t xml:space="preserve"> </w:t>
       </w:r>
-      <w:r>
-        <w:rPr>
-          <w:rFonts w:ascii="Courier New" w:hAnsi="Courier New" w:cs="Courier New"/>
+      <w:proofErr w:type="spellStart"/>
+      <w:r>
+        <w:rPr>
+          <w:rFonts w:ascii="Courier New" w:hAnsi="Courier New" w:cs="Courier New"/>
+          <w:highlight w:val="yellow"/>
         </w:rPr>
         <w:t>authorizeHttpRequests</w:t>
       </w:r>
+      <w:proofErr w:type="spellEnd"/>
       <w:r>
         <w:rPr>
           <w:rFonts w:ascii="Arial" w:hAnsi="Arial" w:cs="Arial"/>
@@ -472,24 +505,30 @@
         </w:rPr>
         <w:t xml:space="preserve">further within </w:t>
       </w:r>
-      <w:r>
-        <w:rPr>
-          <w:rFonts w:ascii="Courier New" w:hAnsi="Courier New" w:cs="Courier New"/>
+      <w:proofErr w:type="spellStart"/>
+      <w:r>
+        <w:rPr>
+          <w:rFonts w:ascii="Courier New" w:hAnsi="Courier New" w:cs="Courier New"/>
+          <w:highlight w:val="yellow"/>
         </w:rPr>
         <w:t>SecurityFilterChain</w:t>
       </w:r>
+      <w:proofErr w:type="spellEnd"/>
       <w:r>
         <w:rPr>
           <w:rFonts w:ascii="Arial" w:hAnsi="Arial" w:cs="Arial"/>
         </w:rPr>
         <w:t xml:space="preserve"> class, with </w:t>
       </w:r>
-      <w:r>
-        <w:rPr>
-          <w:rFonts w:ascii="Courier New" w:hAnsi="Courier New" w:cs="Courier New"/>
+      <w:proofErr w:type="spellStart"/>
+      <w:r>
+        <w:rPr>
+          <w:rFonts w:ascii="Courier New" w:hAnsi="Courier New" w:cs="Courier New"/>
+          <w:highlight w:val="yellow"/>
         </w:rPr>
         <w:t>HttpSecurity</w:t>
       </w:r>
+      <w:proofErr w:type="spellEnd"/>
       <w:r>
         <w:rPr>
           <w:rFonts w:ascii="Arial" w:hAnsi="Arial" w:cs="Arial"/>
@@ -506,23 +545,84 @@
         <w:rPr>
           <w:rFonts w:ascii="Arial" w:hAnsi="Arial" w:cs="Arial"/>
         </w:rPr>
-        <w:t xml:space="preserve">, the latter’s method </w:t>
-      </w:r>
-      <w:r>
-        <w:rPr>
-          <w:rFonts w:ascii="Courier New" w:hAnsi="Courier New" w:cs="Courier New"/>
-        </w:rPr>
-        <w:t>formLogin(Customizer&lt;FormLoginConfigurer&lt;HttpSecurity&gt;&gt; f</w:t>
-      </w:r>
-      <w:r>
-        <w:rPr>
-          <w:rFonts w:ascii="Courier New" w:hAnsi="Courier New" w:cs="Courier New"/>
-        </w:rPr>
-        <w:t>LC</w:t>
-      </w:r>
-      <w:r>
-        <w:rPr>
-          <w:rFonts w:ascii="Courier New" w:hAnsi="Courier New" w:cs="Courier New"/>
+        <w:t xml:space="preserve">, the latter’s </w:t>
+      </w:r>
+      <w:proofErr w:type="gramStart"/>
+      <w:r>
+        <w:rPr>
+          <w:rFonts w:ascii="Arial" w:hAnsi="Arial" w:cs="Arial"/>
+        </w:rPr>
+        <w:t xml:space="preserve">method </w:t>
+      </w:r>
+      <w:r>
+        <w:rPr>
+          <w:rFonts w:ascii="Arial" w:hAnsi="Arial" w:cs="Arial"/>
+          <w:highlight w:val="yellow"/>
+        </w:rPr>
+        <w:t>.</w:t>
+      </w:r>
+      <w:proofErr w:type="spellStart"/>
+      <w:r>
+        <w:rPr>
+          <w:rFonts w:ascii="Courier New" w:hAnsi="Courier New" w:cs="Courier New"/>
+          <w:highlight w:val="yellow"/>
+        </w:rPr>
+        <w:t>formLogin</w:t>
+      </w:r>
+      <w:proofErr w:type="spellEnd"/>
+      <w:proofErr w:type="gramEnd"/>
+      <w:r>
+        <w:rPr>
+          <w:rFonts w:ascii="Courier New" w:hAnsi="Courier New" w:cs="Courier New"/>
+          <w:highlight w:val="yellow"/>
+        </w:rPr>
+        <w:t>(Customizer&lt;</w:t>
+      </w:r>
+      <w:proofErr w:type="spellStart"/>
+      <w:r>
+        <w:rPr>
+          <w:rFonts w:ascii="Courier New" w:hAnsi="Courier New" w:cs="Courier New"/>
+          <w:highlight w:val="yellow"/>
+        </w:rPr>
+        <w:t>FormLoginConfigurer</w:t>
+      </w:r>
+      <w:proofErr w:type="spellEnd"/>
+      <w:r>
+        <w:rPr>
+          <w:rFonts w:ascii="Courier New" w:hAnsi="Courier New" w:cs="Courier New"/>
+          <w:highlight w:val="yellow"/>
+        </w:rPr>
+        <w:t>&lt;</w:t>
+      </w:r>
+      <w:proofErr w:type="spellStart"/>
+      <w:r>
+        <w:rPr>
+          <w:rFonts w:ascii="Courier New" w:hAnsi="Courier New" w:cs="Courier New"/>
+          <w:highlight w:val="yellow"/>
+        </w:rPr>
+        <w:t>HttpSecurity</w:t>
+      </w:r>
+      <w:proofErr w:type="spellEnd"/>
+      <w:r>
+        <w:rPr>
+          <w:rFonts w:ascii="Courier New" w:hAnsi="Courier New" w:cs="Courier New"/>
+          <w:highlight w:val="yellow"/>
+        </w:rPr>
+        <w:t xml:space="preserve">&gt;&gt; </w:t>
+      </w:r>
+      <w:proofErr w:type="spellStart"/>
+      <w:r>
+        <w:rPr>
+          <w:rFonts w:ascii="Courier New" w:hAnsi="Courier New" w:cs="Courier New"/>
+          <w:highlight w:val="yellow"/>
+        </w:rPr>
+        <w:t>fLC</w:t>
+      </w:r>
+      <w:proofErr w:type="spellEnd"/>
+      <w:r>
+        <w:rPr>
+          <w:rFonts w:ascii="Courier New" w:hAnsi="Courier New" w:cs="Courier New"/>
+          <w:highlight w:val="yellow"/>
         </w:rPr>
         <w:t>)</w:t>
       </w:r>
@@ -599,6 +699,7 @@
           <w:noProof/>
         </w:rPr>
       </w:pPr>
+      <w:proofErr w:type="gramStart"/>
       <w:r>
         <w:rPr>
           <w:rFonts w:ascii="Arial" w:hAnsi="Arial" w:cs="Arial"/>
@@ -614,24 +715,84 @@
       <w:r>
         <w:rPr>
           <w:rFonts w:ascii="Courier New" w:hAnsi="Courier New" w:cs="Courier New"/>
-        </w:rPr>
-        <w:t>.loginPage([login url])</w:t>
-      </w:r>
-      <w:r>
-        <w:rPr>
-          <w:rFonts w:ascii="Arial" w:hAnsi="Arial" w:cs="Arial"/>
-        </w:rPr>
-        <w:t xml:space="preserve"> in </w:t>
-      </w:r>
-      <w:r>
-        <w:rPr>
-          <w:rFonts w:ascii="Courier New" w:hAnsi="Courier New" w:cs="Courier New"/>
-        </w:rPr>
-        <w:t>.formLogin(login -&gt; login…</w:t>
-      </w:r>
-      <w:r>
-        <w:rPr>
-          <w:rFonts w:ascii="Courier New" w:hAnsi="Courier New" w:cs="Courier New"/>
+          <w:highlight w:val="yellow"/>
+        </w:rPr>
+        <w:t>.</w:t>
+      </w:r>
+      <w:proofErr w:type="spellStart"/>
+      <w:r>
+        <w:rPr>
+          <w:rFonts w:ascii="Courier New" w:hAnsi="Courier New" w:cs="Courier New"/>
+          <w:highlight w:val="yellow"/>
+        </w:rPr>
+        <w:t>loginPage</w:t>
+      </w:r>
+      <w:proofErr w:type="spellEnd"/>
+      <w:proofErr w:type="gramEnd"/>
+      <w:r>
+        <w:rPr>
+          <w:rFonts w:ascii="Courier New" w:hAnsi="Courier New" w:cs="Courier New"/>
+          <w:highlight w:val="yellow"/>
+        </w:rPr>
+        <w:t xml:space="preserve">([login </w:t>
+      </w:r>
+      <w:proofErr w:type="spellStart"/>
+      <w:r>
+        <w:rPr>
+          <w:rFonts w:ascii="Courier New" w:hAnsi="Courier New" w:cs="Courier New"/>
+          <w:highlight w:val="yellow"/>
+        </w:rPr>
+        <w:t>url</w:t>
+      </w:r>
+      <w:proofErr w:type="spellEnd"/>
+      <w:r>
+        <w:rPr>
+          <w:rFonts w:ascii="Courier New" w:hAnsi="Courier New" w:cs="Courier New"/>
+          <w:highlight w:val="yellow"/>
+        </w:rPr>
+        <w:t>])</w:t>
+      </w:r>
+      <w:r>
+        <w:rPr>
+          <w:rFonts w:ascii="Arial" w:hAnsi="Arial" w:cs="Arial"/>
+        </w:rPr>
+        <w:t xml:space="preserve"> </w:t>
+      </w:r>
+      <w:proofErr w:type="gramStart"/>
+      <w:r>
+        <w:rPr>
+          <w:rFonts w:ascii="Arial" w:hAnsi="Arial" w:cs="Arial"/>
+        </w:rPr>
+        <w:t xml:space="preserve">in </w:t>
+      </w:r>
+      <w:r>
+        <w:rPr>
+          <w:rFonts w:ascii="Courier New" w:hAnsi="Courier New" w:cs="Courier New"/>
+          <w:highlight w:val="yellow"/>
+        </w:rPr>
+        <w:t>.</w:t>
+      </w:r>
+      <w:proofErr w:type="spellStart"/>
+      <w:r>
+        <w:rPr>
+          <w:rFonts w:ascii="Courier New" w:hAnsi="Courier New" w:cs="Courier New"/>
+          <w:highlight w:val="yellow"/>
+        </w:rPr>
+        <w:t>formLogin</w:t>
+      </w:r>
+      <w:proofErr w:type="spellEnd"/>
+      <w:proofErr w:type="gramEnd"/>
+      <w:r>
+        <w:rPr>
+          <w:rFonts w:ascii="Courier New" w:hAnsi="Courier New" w:cs="Courier New"/>
+          <w:highlight w:val="yellow"/>
+        </w:rPr>
+        <w:t>(login -&gt; login…</w:t>
+      </w:r>
+      <w:r>
+        <w:rPr>
+          <w:rFonts w:ascii="Courier New" w:hAnsi="Courier New" w:cs="Courier New"/>
+          <w:highlight w:val="yellow"/>
         </w:rPr>
         <w:t>)</w:t>
       </w:r>
@@ -732,12 +893,14 @@
       <w:r>
         <w:rPr>
           <w:rFonts w:ascii="Courier New" w:hAnsi="Courier New" w:cs="Courier New"/>
+          <w:highlight w:val="yellow"/>
         </w:rPr>
         <w:t>“</w:t>
       </w:r>
       <w:r>
         <w:rPr>
           <w:rFonts w:ascii="Courier New" w:hAnsi="Courier New" w:cs="Courier New"/>
+          <w:highlight w:val="yellow"/>
         </w:rPr>
         <w:t>/auth/login”</w:t>
       </w:r>
@@ -817,6 +980,7 @@
           <w:rFonts w:ascii="Arial" w:hAnsi="Arial" w:cs="Arial"/>
         </w:rPr>
       </w:pPr>
+      <w:proofErr w:type="gramStart"/>
       <w:r>
         <w:rPr>
           <w:rFonts w:ascii="Arial" w:hAnsi="Arial" w:cs="Arial"/>
@@ -826,32 +990,26 @@
       <w:r>
         <w:rPr>
           <w:rFonts w:ascii="Courier New" w:hAnsi="Courier New" w:cs="Courier New"/>
+          <w:highlight w:val="yellow"/>
         </w:rPr>
         <w:t>.</w:t>
       </w:r>
-      <w:r>
-        <w:rPr>
-          <w:rFonts w:ascii="Courier New" w:hAnsi="Courier New" w:cs="Courier New"/>
+      <w:proofErr w:type="spellStart"/>
+      <w:r>
+        <w:rPr>
+          <w:rFonts w:ascii="Courier New" w:hAnsi="Courier New" w:cs="Courier New"/>
+          <w:highlight w:val="yellow"/>
         </w:rPr>
         <w:t>usernameParameter</w:t>
       </w:r>
-      <w:r>
-        <w:rPr>
-          <w:rFonts w:ascii="Courier New" w:hAnsi="Courier New" w:cs="Courier New"/>
-        </w:rPr>
-        <w:t>([</w:t>
-      </w:r>
-      <w:r>
-        <w:rPr>
-          <w:rFonts w:ascii="Courier New" w:hAnsi="Courier New" w:cs="Courier New"/>
-        </w:rPr>
-        <w:t>username</w:t>
-      </w:r>
-      <w:r>
-        <w:rPr>
-          <w:rFonts w:ascii="Courier New" w:hAnsi="Courier New" w:cs="Courier New"/>
-        </w:rPr>
-        <w:t>])</w:t>
+      <w:proofErr w:type="spellEnd"/>
+      <w:proofErr w:type="gramEnd"/>
+      <w:r>
+        <w:rPr>
+          <w:rFonts w:ascii="Courier New" w:hAnsi="Courier New" w:cs="Courier New"/>
+          <w:highlight w:val="yellow"/>
+        </w:rPr>
+        <w:t>([username])</w:t>
       </w:r>
       <w:r>
         <w:rPr>
@@ -859,6 +1017,7 @@
         </w:rPr>
         <w:t xml:space="preserve"> </w:t>
       </w:r>
+      <w:proofErr w:type="gramStart"/>
       <w:r>
         <w:rPr>
           <w:rFonts w:ascii="Arial" w:hAnsi="Arial" w:cs="Arial"/>
@@ -868,8 +1027,26 @@
       <w:r>
         <w:rPr>
           <w:rFonts w:ascii="Courier New" w:hAnsi="Courier New" w:cs="Courier New"/>
-        </w:rPr>
-        <w:t>.passwordParameter([password])</w:t>
+          <w:highlight w:val="yellow"/>
+        </w:rPr>
+        <w:t>.</w:t>
+      </w:r>
+      <w:proofErr w:type="spellStart"/>
+      <w:r>
+        <w:rPr>
+          <w:rFonts w:ascii="Courier New" w:hAnsi="Courier New" w:cs="Courier New"/>
+          <w:highlight w:val="yellow"/>
+        </w:rPr>
+        <w:t>passwordParameter</w:t>
+      </w:r>
+      <w:proofErr w:type="spellEnd"/>
+      <w:proofErr w:type="gramEnd"/>
+      <w:r>
+        <w:rPr>
+          <w:rFonts w:ascii="Courier New" w:hAnsi="Courier New" w:cs="Courier New"/>
+          <w:highlight w:val="yellow"/>
+        </w:rPr>
+        <w:t>([password])</w:t>
       </w:r>
       <w:r>
         <w:rPr>
@@ -877,6 +1054,7 @@
         </w:rPr>
         <w:t xml:space="preserve"> </w:t>
       </w:r>
+      <w:proofErr w:type="gramStart"/>
       <w:r>
         <w:rPr>
           <w:rFonts w:ascii="Arial" w:hAnsi="Arial" w:cs="Arial"/>
@@ -886,8 +1064,26 @@
       <w:r>
         <w:rPr>
           <w:rFonts w:ascii="Courier New" w:hAnsi="Courier New" w:cs="Courier New"/>
-        </w:rPr>
-        <w:t>.formLogin(login -&gt; login…)</w:t>
+          <w:highlight w:val="yellow"/>
+        </w:rPr>
+        <w:t>.</w:t>
+      </w:r>
+      <w:proofErr w:type="spellStart"/>
+      <w:r>
+        <w:rPr>
+          <w:rFonts w:ascii="Courier New" w:hAnsi="Courier New" w:cs="Courier New"/>
+          <w:highlight w:val="yellow"/>
+        </w:rPr>
+        <w:t>formLogin</w:t>
+      </w:r>
+      <w:proofErr w:type="spellEnd"/>
+      <w:proofErr w:type="gramEnd"/>
+      <w:r>
+        <w:rPr>
+          <w:rFonts w:ascii="Courier New" w:hAnsi="Courier New" w:cs="Courier New"/>
+          <w:highlight w:val="yellow"/>
+        </w:rPr>
+        <w:t>(login -&gt; login…)</w:t>
       </w:r>
       <w:r>
         <w:rPr>
@@ -1083,63 +1279,98 @@
           <w:rFonts w:ascii="Courier New" w:hAnsi="Courier New" w:cs="Courier New"/>
           <w:b/>
           <w:bCs/>
-        </w:rPr>
-      </w:pPr>
-      <w:r>
-        <w:rPr>
-          <w:rFonts w:ascii="Arial" w:hAnsi="Arial" w:cs="Arial"/>
-          <w:b/>
-          <w:bCs/>
-        </w:rPr>
-        <w:t>When “input” fields’ names are default i.e.: “username” and “password</w:t>
-      </w:r>
-      <w:r>
-        <w:rPr>
-          <w:rFonts w:ascii="Arial" w:hAnsi="Arial" w:cs="Arial"/>
-          <w:b/>
-          <w:bCs/>
-        </w:rPr>
-        <w:t xml:space="preserve">”, </w:t>
-      </w:r>
-      <w:r>
-        <w:rPr>
-          <w:rFonts w:ascii="Courier New" w:hAnsi="Courier New" w:cs="Courier New"/>
-          <w:b/>
-          <w:bCs/>
+          <w:lang w:val="pl-PL"/>
+        </w:rPr>
+      </w:pPr>
+      <w:r>
+        <w:rPr>
+          <w:rFonts w:ascii="Arial" w:hAnsi="Arial" w:cs="Arial"/>
+          <w:b/>
+          <w:bCs/>
+        </w:rPr>
+        <w:t xml:space="preserve">When </w:t>
+      </w:r>
+      <w:r>
+        <w:rPr>
+          <w:rFonts w:ascii="Courier New" w:hAnsi="Courier New" w:cs="Courier New"/>
+          <w:b/>
+          <w:bCs/>
+          <w:highlight w:val="yellow"/>
+        </w:rPr>
+        <w:t>input</w:t>
+      </w:r>
+      <w:r>
+        <w:rPr>
+          <w:rFonts w:ascii="Arial" w:hAnsi="Arial" w:cs="Arial"/>
+          <w:b/>
+          <w:bCs/>
+        </w:rPr>
+        <w:t xml:space="preserve"> fields’ names are default i.e.: </w:t>
+      </w:r>
+      <w:r>
+        <w:rPr>
+          <w:rFonts w:ascii="Courier New" w:hAnsi="Courier New" w:cs="Courier New"/>
+          <w:b/>
+          <w:bCs/>
+          <w:highlight w:val="yellow"/>
+        </w:rPr>
+        <w:t>“username”</w:t>
+      </w:r>
+      <w:r>
+        <w:rPr>
+          <w:rFonts w:ascii="Arial" w:hAnsi="Arial" w:cs="Arial"/>
+          <w:b/>
+          <w:bCs/>
+        </w:rPr>
+        <w:t xml:space="preserve"> and </w:t>
+      </w:r>
+      <w:r>
+        <w:rPr>
+          <w:rFonts w:ascii="Arial" w:hAnsi="Arial" w:cs="Arial"/>
+          <w:b/>
+          <w:bCs/>
+          <w:highlight w:val="yellow"/>
+        </w:rPr>
+        <w:t>“password”</w:t>
+      </w:r>
+      <w:proofErr w:type="gramStart"/>
+      <w:r>
+        <w:rPr>
+          <w:rFonts w:ascii="Arial" w:hAnsi="Arial" w:cs="Arial"/>
+          <w:b/>
+          <w:bCs/>
+        </w:rPr>
+        <w:t xml:space="preserve">, </w:t>
+      </w:r>
+      <w:r>
+        <w:rPr>
+          <w:rFonts w:ascii="Courier New" w:hAnsi="Courier New" w:cs="Courier New"/>
+          <w:b/>
+          <w:bCs/>
+          <w:highlight w:val="yellow"/>
         </w:rPr>
         <w:t>.</w:t>
       </w:r>
-      <w:r>
-        <w:rPr>
-          <w:rFonts w:ascii="Courier New" w:hAnsi="Courier New" w:cs="Courier New"/>
-          <w:b/>
-          <w:bCs/>
+      <w:proofErr w:type="spellStart"/>
+      <w:r>
+        <w:rPr>
+          <w:rFonts w:ascii="Courier New" w:hAnsi="Courier New" w:cs="Courier New"/>
+          <w:b/>
+          <w:bCs/>
+          <w:highlight w:val="yellow"/>
         </w:rPr>
         <w:t>usernameParameter</w:t>
       </w:r>
-      <w:r>
-        <w:rPr>
-          <w:rFonts w:ascii="Courier New" w:hAnsi="Courier New" w:cs="Courier New"/>
-          <w:b/>
-          <w:bCs/>
-        </w:rPr>
-        <w:t>([</w:t>
-      </w:r>
-      <w:r>
-        <w:rPr>
-          <w:rFonts w:ascii="Courier New" w:hAnsi="Courier New" w:cs="Courier New"/>
-          <w:b/>
-          <w:bCs/>
-        </w:rPr>
-        <w:t>username</w:t>
-      </w:r>
-      <w:r>
-        <w:rPr>
-          <w:rFonts w:ascii="Courier New" w:hAnsi="Courier New" w:cs="Courier New"/>
-          <w:b/>
-          <w:bCs/>
-        </w:rPr>
-        <w:t>])</w:t>
+      <w:proofErr w:type="spellEnd"/>
+      <w:proofErr w:type="gramEnd"/>
+      <w:r>
+        <w:rPr>
+          <w:rFonts w:ascii="Courier New" w:hAnsi="Courier New" w:cs="Courier New"/>
+          <w:b/>
+          <w:bCs/>
+          <w:highlight w:val="yellow"/>
+        </w:rPr>
+        <w:t>([username])</w:t>
       </w:r>
       <w:r>
         <w:rPr>
@@ -1149,6 +1380,7 @@
         </w:rPr>
         <w:t xml:space="preserve"> </w:t>
       </w:r>
+      <w:proofErr w:type="gramStart"/>
       <w:r>
         <w:rPr>
           <w:rFonts w:ascii="Arial" w:hAnsi="Arial" w:cs="Arial"/>
@@ -1162,8 +1394,30 @@
           <w:rFonts w:ascii="Courier New" w:hAnsi="Courier New" w:cs="Courier New"/>
           <w:b/>
           <w:bCs/>
-        </w:rPr>
-        <w:t>.passwordParameter([password])</w:t>
+          <w:highlight w:val="yellow"/>
+        </w:rPr>
+        <w:t>.</w:t>
+      </w:r>
+      <w:proofErr w:type="spellStart"/>
+      <w:r>
+        <w:rPr>
+          <w:rFonts w:ascii="Courier New" w:hAnsi="Courier New" w:cs="Courier New"/>
+          <w:b/>
+          <w:bCs/>
+          <w:highlight w:val="yellow"/>
+        </w:rPr>
+        <w:t>passwordParameter</w:t>
+      </w:r>
+      <w:proofErr w:type="spellEnd"/>
+      <w:proofErr w:type="gramEnd"/>
+      <w:r>
+        <w:rPr>
+          <w:rFonts w:ascii="Courier New" w:hAnsi="Courier New" w:cs="Courier New"/>
+          <w:b/>
+          <w:bCs/>
+          <w:highlight w:val="yellow"/>
+        </w:rPr>
+        <w:t>([password])</w:t>
       </w:r>
       <w:r>
         <w:rPr>
@@ -1173,6 +1427,7 @@
         </w:rPr>
         <w:t xml:space="preserve"> </w:t>
       </w:r>
+      <w:proofErr w:type="gramStart"/>
       <w:r>
         <w:rPr>
           <w:rFonts w:ascii="Arial" w:hAnsi="Arial" w:cs="Arial"/>
@@ -1186,8 +1441,38 @@
           <w:rFonts w:ascii="Courier New" w:hAnsi="Courier New" w:cs="Courier New"/>
           <w:b/>
           <w:bCs/>
-        </w:rPr>
-        <w:t>.formLogin(login -&gt; login…)</w:t>
+          <w:highlight w:val="yellow"/>
+        </w:rPr>
+        <w:t>.</w:t>
+      </w:r>
+      <w:proofErr w:type="spellStart"/>
+      <w:r>
+        <w:rPr>
+          <w:rFonts w:ascii="Courier New" w:hAnsi="Courier New" w:cs="Courier New"/>
+          <w:b/>
+          <w:bCs/>
+          <w:highlight w:val="yellow"/>
+        </w:rPr>
+        <w:t>formLogin</w:t>
+      </w:r>
+      <w:proofErr w:type="spellEnd"/>
+      <w:proofErr w:type="gramEnd"/>
+      <w:r>
+        <w:rPr>
+          <w:rFonts w:ascii="Courier New" w:hAnsi="Courier New" w:cs="Courier New"/>
+          <w:b/>
+          <w:bCs/>
+          <w:highlight w:val="yellow"/>
+        </w:rPr>
+        <w:t>(login -&gt; login…)</w:t>
+      </w:r>
+      <w:r>
+        <w:rPr>
+          <w:rFonts w:ascii="Courier New" w:hAnsi="Courier New" w:cs="Courier New"/>
+          <w:b/>
+          <w:bCs/>
+        </w:rPr>
+        <w:t xml:space="preserve"> </w:t>
       </w:r>
       <w:r>
         <w:rPr>
@@ -1203,31 +1488,7 @@
           <w:b/>
           <w:bCs/>
         </w:rPr>
-        <w:t xml:space="preserve"> .loginPage([login url])</w:t>
-      </w:r>
-      <w:r>
-        <w:rPr>
-          <w:rFonts w:ascii="Arial" w:hAnsi="Arial" w:cs="Arial"/>
-          <w:b/>
-          <w:bCs/>
-        </w:rPr>
-        <w:t xml:space="preserve"> in </w:t>
-      </w:r>
-      <w:r>
-        <w:rPr>
-          <w:rFonts w:ascii="Courier New" w:hAnsi="Courier New" w:cs="Courier New"/>
-          <w:b/>
-          <w:bCs/>
-        </w:rPr>
-        <w:t>.formLogin(login -&gt; login…</w:t>
-      </w:r>
-      <w:r>
-        <w:rPr>
-          <w:rFonts w:ascii="Courier New" w:hAnsi="Courier New" w:cs="Courier New"/>
-          <w:b/>
-          <w:bCs/>
-        </w:rPr>
-        <w:t>)</w:t>
+        <w:t>:</w:t>
       </w:r>
     </w:p>
     <w:p>
@@ -1309,12 +1570,23 @@
       </w:r>
       <w:r>
         <w:rPr>
-          <w:rFonts w:ascii="Courier New" w:hAnsi="Courier New" w:cs="Courier New"/>
-          <w:b/>
-          <w:bCs/>
+          <w:rFonts w:ascii="Arial" w:hAnsi="Arial" w:cs="Arial"/>
+          <w:b/>
+          <w:bCs/>
+        </w:rPr>
+        <w:t xml:space="preserve">a </w:t>
+      </w:r>
+      <w:proofErr w:type="spellStart"/>
+      <w:r>
+        <w:rPr>
+          <w:rFonts w:ascii="Courier New" w:hAnsi="Courier New" w:cs="Courier New"/>
+          <w:b/>
+          <w:bCs/>
+          <w:highlight w:val="yellow"/>
         </w:rPr>
         <w:t>UserDetailsService</w:t>
       </w:r>
+      <w:proofErr w:type="spellEnd"/>
       <w:r>
         <w:rPr>
           <w:rFonts w:ascii="Arial" w:hAnsi="Arial" w:cs="Arial"/>
@@ -1523,10 +1795,1372 @@
     </w:p>
     <w:p>
       <w:pPr>
-        <w:rPr>
-          <w:rFonts w:ascii="Arial" w:hAnsi="Arial" w:cs="Arial"/>
-          <w:b/>
-          <w:bCs/>
+        <w:numPr>
+          <w:ilvl w:val="0"/>
+          <w:numId w:val="15"/>
+        </w:numPr>
+        <w:rPr>
+          <w:rFonts w:ascii="Arial" w:hAnsi="Arial" w:cs="Arial"/>
+        </w:rPr>
+      </w:pPr>
+      <w:r>
+        <w:rPr>
+          <w:rFonts w:ascii="Arial" w:hAnsi="Arial" w:cs="Arial"/>
+        </w:rPr>
+        <w:lastRenderedPageBreak/>
+        <w:t xml:space="preserve">further within </w:t>
+      </w:r>
+      <w:proofErr w:type="spellStart"/>
+      <w:r>
+        <w:rPr>
+          <w:rFonts w:ascii="Courier New" w:hAnsi="Courier New" w:cs="Courier New"/>
+          <w:highlight w:val="yellow"/>
+        </w:rPr>
+        <w:t>SecurityFilterChain</w:t>
+      </w:r>
+      <w:proofErr w:type="spellEnd"/>
+      <w:r>
+        <w:rPr>
+          <w:rFonts w:ascii="Arial" w:hAnsi="Arial" w:cs="Arial"/>
+        </w:rPr>
+        <w:t xml:space="preserve"> class, with </w:t>
+      </w:r>
+      <w:proofErr w:type="spellStart"/>
+      <w:r>
+        <w:rPr>
+          <w:rFonts w:ascii="Courier New" w:hAnsi="Courier New" w:cs="Courier New"/>
+          <w:highlight w:val="yellow"/>
+        </w:rPr>
+        <w:t>HttpSecurity</w:t>
+      </w:r>
+      <w:proofErr w:type="spellEnd"/>
+      <w:r>
+        <w:rPr>
+          <w:rFonts w:ascii="Arial" w:hAnsi="Arial" w:cs="Arial"/>
+        </w:rPr>
+        <w:t xml:space="preserve"> object passed into it, the latter’s </w:t>
+      </w:r>
+      <w:proofErr w:type="gramStart"/>
+      <w:r>
+        <w:rPr>
+          <w:rFonts w:ascii="Arial" w:hAnsi="Arial" w:cs="Arial"/>
+        </w:rPr>
+        <w:t xml:space="preserve">method </w:t>
+      </w:r>
+      <w:r>
+        <w:rPr>
+          <w:rFonts w:ascii="Courier New" w:hAnsi="Courier New" w:cs="Courier New"/>
+          <w:highlight w:val="yellow"/>
+        </w:rPr>
+        <w:t>.logout</w:t>
+      </w:r>
+      <w:proofErr w:type="gramEnd"/>
+      <w:r>
+        <w:rPr>
+          <w:rFonts w:ascii="Courier New" w:hAnsi="Courier New" w:cs="Courier New"/>
+          <w:highlight w:val="yellow"/>
+        </w:rPr>
+        <w:t>(Customizer&lt;</w:t>
+      </w:r>
+      <w:proofErr w:type="spellStart"/>
+      <w:r>
+        <w:rPr>
+          <w:rFonts w:ascii="Courier New" w:hAnsi="Courier New" w:cs="Courier New"/>
+          <w:highlight w:val="yellow"/>
+        </w:rPr>
+        <w:t>Log</w:t>
+      </w:r>
+      <w:r>
+        <w:rPr>
+          <w:rFonts w:ascii="Courier New" w:hAnsi="Courier New" w:cs="Courier New"/>
+          <w:highlight w:val="yellow"/>
+        </w:rPr>
+        <w:t>out</w:t>
+      </w:r>
+      <w:r>
+        <w:rPr>
+          <w:rFonts w:ascii="Courier New" w:hAnsi="Courier New" w:cs="Courier New"/>
+          <w:highlight w:val="yellow"/>
+        </w:rPr>
+        <w:t>Configurer</w:t>
+      </w:r>
+      <w:proofErr w:type="spellEnd"/>
+      <w:r>
+        <w:rPr>
+          <w:rFonts w:ascii="Courier New" w:hAnsi="Courier New" w:cs="Courier New"/>
+          <w:highlight w:val="yellow"/>
+        </w:rPr>
+        <w:t>&lt;</w:t>
+      </w:r>
+      <w:proofErr w:type="spellStart"/>
+      <w:r>
+        <w:rPr>
+          <w:rFonts w:ascii="Courier New" w:hAnsi="Courier New" w:cs="Courier New"/>
+          <w:highlight w:val="yellow"/>
+        </w:rPr>
+        <w:t>HttpSecurity</w:t>
+      </w:r>
+      <w:proofErr w:type="spellEnd"/>
+      <w:r>
+        <w:rPr>
+          <w:rFonts w:ascii="Courier New" w:hAnsi="Courier New" w:cs="Courier New"/>
+          <w:highlight w:val="yellow"/>
+        </w:rPr>
+        <w:t xml:space="preserve">&gt;&gt; </w:t>
+      </w:r>
+      <w:proofErr w:type="spellStart"/>
+      <w:r>
+        <w:rPr>
+          <w:rFonts w:ascii="Courier New" w:hAnsi="Courier New" w:cs="Courier New"/>
+          <w:highlight w:val="yellow"/>
+        </w:rPr>
+        <w:t>logout</w:t>
+      </w:r>
+      <w:r>
+        <w:rPr>
+          <w:rFonts w:ascii="Courier New" w:hAnsi="Courier New" w:cs="Courier New"/>
+          <w:highlight w:val="yellow"/>
+        </w:rPr>
+        <w:t>C</w:t>
+      </w:r>
+      <w:r>
+        <w:rPr>
+          <w:rFonts w:ascii="Courier New" w:hAnsi="Courier New" w:cs="Courier New"/>
+          <w:highlight w:val="yellow"/>
+        </w:rPr>
+        <w:t>ust</w:t>
+      </w:r>
+      <w:proofErr w:type="spellEnd"/>
+      <w:r>
+        <w:rPr>
+          <w:rFonts w:ascii="Courier New" w:hAnsi="Courier New" w:cs="Courier New"/>
+          <w:highlight w:val="yellow"/>
+        </w:rPr>
+        <w:t>)</w:t>
+      </w:r>
+      <w:r>
+        <w:rPr>
+          <w:rFonts w:ascii="Arial" w:hAnsi="Arial" w:cs="Arial"/>
+        </w:rPr>
+        <w:t xml:space="preserve"> is used to set log</w:t>
+      </w:r>
+      <w:r>
+        <w:rPr>
+          <w:rFonts w:ascii="Arial" w:hAnsi="Arial" w:cs="Arial"/>
+        </w:rPr>
+        <w:t>out</w:t>
+      </w:r>
+      <w:r>
+        <w:rPr>
+          <w:rFonts w:ascii="Arial" w:hAnsi="Arial" w:cs="Arial"/>
+        </w:rPr>
+        <w:t xml:space="preserve"> </w:t>
+      </w:r>
+      <w:r>
+        <w:rPr>
+          <w:rFonts w:ascii="Arial" w:hAnsi="Arial" w:cs="Arial"/>
+        </w:rPr>
+        <w:t xml:space="preserve">option with its </w:t>
+      </w:r>
+      <w:proofErr w:type="spellStart"/>
+      <w:r>
+        <w:rPr>
+          <w:rFonts w:ascii="Arial" w:hAnsi="Arial" w:cs="Arial"/>
+        </w:rPr>
+        <w:t>url</w:t>
+      </w:r>
+      <w:proofErr w:type="spellEnd"/>
+      <w:r>
+        <w:rPr>
+          <w:rFonts w:ascii="Arial" w:hAnsi="Arial" w:cs="Arial"/>
+        </w:rPr>
+        <w:t xml:space="preserve"> </w:t>
+      </w:r>
+      <w:proofErr w:type="gramStart"/>
+      <w:r>
+        <w:rPr>
+          <w:rFonts w:ascii="Arial" w:hAnsi="Arial" w:cs="Arial"/>
+        </w:rPr>
+        <w:t xml:space="preserve">in </w:t>
+      </w:r>
+      <w:r>
+        <w:rPr>
+          <w:rFonts w:ascii="Courier New" w:hAnsi="Courier New" w:cs="Courier New"/>
+          <w:highlight w:val="yellow"/>
+        </w:rPr>
+        <w:t>.</w:t>
+      </w:r>
+      <w:r>
+        <w:rPr>
+          <w:rFonts w:ascii="Courier New" w:hAnsi="Courier New" w:cs="Courier New"/>
+          <w:highlight w:val="yellow"/>
+        </w:rPr>
+        <w:t>l</w:t>
+      </w:r>
+      <w:r>
+        <w:rPr>
+          <w:rFonts w:ascii="Courier New" w:hAnsi="Courier New" w:cs="Courier New"/>
+          <w:highlight w:val="yellow"/>
+        </w:rPr>
+        <w:t>og</w:t>
+      </w:r>
+      <w:r>
+        <w:rPr>
+          <w:rFonts w:ascii="Courier New" w:hAnsi="Courier New" w:cs="Courier New"/>
+          <w:highlight w:val="yellow"/>
+        </w:rPr>
+        <w:t>out</w:t>
+      </w:r>
+      <w:proofErr w:type="gramEnd"/>
+      <w:r>
+        <w:rPr>
+          <w:rFonts w:ascii="Courier New" w:hAnsi="Courier New" w:cs="Courier New"/>
+          <w:highlight w:val="yellow"/>
+        </w:rPr>
+        <w:t>(l</w:t>
+      </w:r>
+      <w:r>
+        <w:rPr>
+          <w:rFonts w:ascii="Courier New" w:hAnsi="Courier New" w:cs="Courier New"/>
+          <w:highlight w:val="yellow"/>
+        </w:rPr>
+        <w:t>ogout</w:t>
+      </w:r>
+      <w:r>
+        <w:rPr>
+          <w:rFonts w:ascii="Courier New" w:hAnsi="Courier New" w:cs="Courier New"/>
+          <w:highlight w:val="yellow"/>
+        </w:rPr>
+        <w:t xml:space="preserve"> -&gt; </w:t>
+      </w:r>
+      <w:proofErr w:type="spellStart"/>
+      <w:proofErr w:type="gramStart"/>
+      <w:r>
+        <w:rPr>
+          <w:rFonts w:ascii="Courier New" w:hAnsi="Courier New" w:cs="Courier New"/>
+          <w:highlight w:val="yellow"/>
+        </w:rPr>
+        <w:t>log</w:t>
+      </w:r>
+      <w:r>
+        <w:rPr>
+          <w:rFonts w:ascii="Courier New" w:hAnsi="Courier New" w:cs="Courier New"/>
+          <w:highlight w:val="yellow"/>
+        </w:rPr>
+        <w:t>out.logoutUrl</w:t>
+      </w:r>
+      <w:proofErr w:type="spellEnd"/>
+      <w:proofErr w:type="gramEnd"/>
+      <w:r>
+        <w:rPr>
+          <w:rFonts w:ascii="Courier New" w:hAnsi="Courier New" w:cs="Courier New"/>
+          <w:highlight w:val="yellow"/>
+        </w:rPr>
+        <w:t xml:space="preserve">([logout </w:t>
+      </w:r>
+      <w:proofErr w:type="spellStart"/>
+      <w:r>
+        <w:rPr>
+          <w:rFonts w:ascii="Courier New" w:hAnsi="Courier New" w:cs="Courier New"/>
+          <w:highlight w:val="yellow"/>
+        </w:rPr>
+        <w:t>url</w:t>
+      </w:r>
+      <w:proofErr w:type="spellEnd"/>
+      <w:r>
+        <w:rPr>
+          <w:rFonts w:ascii="Courier New" w:hAnsi="Courier New" w:cs="Courier New"/>
+          <w:highlight w:val="yellow"/>
+        </w:rPr>
+        <w:t>)</w:t>
+      </w:r>
+      <w:r>
+        <w:rPr>
+          <w:rFonts w:ascii="Courier New" w:hAnsi="Courier New" w:cs="Courier New"/>
+          <w:highlight w:val="yellow"/>
+        </w:rPr>
+        <w:t>)</w:t>
+      </w:r>
+      <w:r>
+        <w:rPr>
+          <w:rFonts w:ascii="Arial" w:hAnsi="Arial" w:cs="Arial"/>
+        </w:rPr>
+        <w:t xml:space="preserve"> for re-direction:</w:t>
+      </w:r>
+    </w:p>
+    <w:p>
+      <w:pPr>
+        <w:ind w:left="927"/>
+        <w:jc w:val="center"/>
+        <w:rPr>
+          <w:rFonts w:ascii="Arial" w:hAnsi="Arial" w:cs="Arial"/>
+        </w:rPr>
+      </w:pPr>
+      <w:r>
+        <w:rPr>
+          <w:rFonts w:ascii="Arial" w:hAnsi="Arial" w:cs="Arial"/>
+        </w:rPr>
+        <w:drawing>
+          <wp:inline distT="0" distB="0" distL="0" distR="0" wp14:anchorId="35861CA3" wp14:editId="75055D66">
+            <wp:extent cx="2972215" cy="666843"/>
+            <wp:effectExtent l="0" t="0" r="0" b="0"/>
+            <wp:docPr id="1406027093" name="Picture 1"/>
+            <wp:cNvGraphicFramePr>
+              <a:graphicFrameLocks xmlns:a="http://schemas.openxmlformats.org/drawingml/2006/main" noChangeAspect="1"/>
+            </wp:cNvGraphicFramePr>
+            <a:graphic xmlns:a="http://schemas.openxmlformats.org/drawingml/2006/main">
+              <a:graphicData uri="http://schemas.openxmlformats.org/drawingml/2006/picture">
+                <pic:pic xmlns:pic="http://schemas.openxmlformats.org/drawingml/2006/picture">
+                  <pic:nvPicPr>
+                    <pic:cNvPr id="1406027093" name=""/>
+                    <pic:cNvPicPr/>
+                  </pic:nvPicPr>
+                  <pic:blipFill>
+                    <a:blip r:embed="rId15"/>
+                    <a:stretch>
+                      <a:fillRect/>
+                    </a:stretch>
+                  </pic:blipFill>
+                  <pic:spPr>
+                    <a:xfrm>
+                      <a:off x="0" y="0"/>
+                      <a:ext cx="2972215" cy="666843"/>
+                    </a:xfrm>
+                    <a:prstGeom prst="rect">
+                      <a:avLst/>
+                    </a:prstGeom>
+                  </pic:spPr>
+                </pic:pic>
+              </a:graphicData>
+            </a:graphic>
+          </wp:inline>
+        </w:drawing>
+      </w:r>
+    </w:p>
+    <w:p>
+      <w:pPr>
+        <w:ind w:left="927"/>
+        <w:rPr>
+          <w:rFonts w:ascii="Arial" w:hAnsi="Arial" w:cs="Arial"/>
+          <w:b/>
+          <w:bCs/>
+          <w:u w:val="single"/>
+        </w:rPr>
+      </w:pPr>
+      <w:r>
+        <w:rPr>
+          <w:rFonts w:ascii="Arial" w:hAnsi="Arial" w:cs="Arial"/>
+          <w:b/>
+          <w:bCs/>
+          <w:u w:val="single"/>
+        </w:rPr>
+        <w:t>NOTE:</w:t>
+      </w:r>
+    </w:p>
+    <w:p>
+      <w:pPr>
+        <w:ind w:left="927"/>
+        <w:rPr>
+          <w:rFonts w:ascii="Arial" w:hAnsi="Arial" w:cs="Arial"/>
+          <w:b/>
+          <w:bCs/>
+        </w:rPr>
+      </w:pPr>
+      <w:r>
+        <w:rPr>
+          <w:rFonts w:ascii="Arial" w:hAnsi="Arial" w:cs="Arial"/>
+          <w:b/>
+          <w:bCs/>
+        </w:rPr>
+        <w:t xml:space="preserve">There is no such endpoint in the controller as defined </w:t>
+      </w:r>
+      <w:proofErr w:type="gramStart"/>
+      <w:r>
+        <w:rPr>
+          <w:rFonts w:ascii="Arial" w:hAnsi="Arial" w:cs="Arial"/>
+          <w:b/>
+          <w:bCs/>
+        </w:rPr>
+        <w:t xml:space="preserve">in </w:t>
+      </w:r>
+      <w:r>
+        <w:rPr>
+          <w:rFonts w:ascii="Courier New" w:hAnsi="Courier New" w:cs="Courier New"/>
+          <w:b/>
+          <w:bCs/>
+          <w:highlight w:val="yellow"/>
+        </w:rPr>
+        <w:t>.logout</w:t>
+      </w:r>
+      <w:proofErr w:type="gramEnd"/>
+      <w:r>
+        <w:rPr>
+          <w:rFonts w:ascii="Courier New" w:hAnsi="Courier New" w:cs="Courier New"/>
+          <w:b/>
+          <w:bCs/>
+          <w:highlight w:val="yellow"/>
+        </w:rPr>
+        <w:t xml:space="preserve">(logout -&gt; </w:t>
+      </w:r>
+      <w:proofErr w:type="spellStart"/>
+      <w:proofErr w:type="gramStart"/>
+      <w:r>
+        <w:rPr>
+          <w:rFonts w:ascii="Courier New" w:hAnsi="Courier New" w:cs="Courier New"/>
+          <w:b/>
+          <w:bCs/>
+          <w:highlight w:val="yellow"/>
+        </w:rPr>
+        <w:t>logout.logoutUrl</w:t>
+      </w:r>
+      <w:proofErr w:type="spellEnd"/>
+      <w:proofErr w:type="gramEnd"/>
+      <w:r>
+        <w:rPr>
+          <w:rFonts w:ascii="Courier New" w:hAnsi="Courier New" w:cs="Courier New"/>
+          <w:b/>
+          <w:bCs/>
+          <w:highlight w:val="yellow"/>
+        </w:rPr>
+        <w:t xml:space="preserve">([logout </w:t>
+      </w:r>
+      <w:proofErr w:type="spellStart"/>
+      <w:r>
+        <w:rPr>
+          <w:rFonts w:ascii="Courier New" w:hAnsi="Courier New" w:cs="Courier New"/>
+          <w:b/>
+          <w:bCs/>
+          <w:highlight w:val="yellow"/>
+        </w:rPr>
+        <w:t>url</w:t>
+      </w:r>
+      <w:proofErr w:type="spellEnd"/>
+      <w:r>
+        <w:rPr>
+          <w:rFonts w:ascii="Courier New" w:hAnsi="Courier New" w:cs="Courier New"/>
+          <w:b/>
+          <w:bCs/>
+          <w:highlight w:val="yellow"/>
+        </w:rPr>
+        <w:t>))</w:t>
+      </w:r>
+      <w:r>
+        <w:rPr>
+          <w:rFonts w:ascii="Arial" w:hAnsi="Arial" w:cs="Arial"/>
+          <w:b/>
+          <w:bCs/>
+        </w:rPr>
+        <w:t>.</w:t>
+      </w:r>
+      <w:r>
+        <w:rPr>
+          <w:rFonts w:ascii="Arial" w:hAnsi="Arial" w:cs="Arial"/>
+          <w:b/>
+          <w:bCs/>
+        </w:rPr>
+        <w:t xml:space="preserve"> Therefore, a response is directed to </w:t>
+      </w:r>
+      <w:proofErr w:type="spellStart"/>
+      <w:r>
+        <w:rPr>
+          <w:rFonts w:ascii="Arial" w:hAnsi="Arial" w:cs="Arial"/>
+          <w:b/>
+          <w:bCs/>
+        </w:rPr>
+        <w:t>url</w:t>
+      </w:r>
+      <w:proofErr w:type="spellEnd"/>
+      <w:r>
+        <w:rPr>
+          <w:rFonts w:ascii="Arial" w:hAnsi="Arial" w:cs="Arial"/>
+          <w:b/>
+          <w:bCs/>
+        </w:rPr>
+        <w:t xml:space="preserve"> defined in login and the endpoint of logout is passed as response’s parameter to login page:</w:t>
+      </w:r>
+    </w:p>
+    <w:p>
+      <w:pPr>
+        <w:ind w:left="927"/>
+        <w:rPr>
+          <w:rFonts w:ascii="Arial" w:hAnsi="Arial" w:cs="Arial"/>
+          <w:b/>
+          <w:bCs/>
+        </w:rPr>
+      </w:pPr>
+    </w:p>
+    <w:p>
+      <w:pPr>
+        <w:ind w:left="927"/>
+        <w:rPr>
+          <w:rFonts w:ascii="Arial" w:hAnsi="Arial" w:cs="Arial"/>
+          <w:b/>
+          <w:bCs/>
+        </w:rPr>
+      </w:pPr>
+      <w:r>
+        <w:rPr>
+          <w:rFonts w:ascii="Arial" w:hAnsi="Arial" w:cs="Arial"/>
+          <w:b/>
+          <w:bCs/>
+        </w:rPr>
+        <mc:AlternateContent>
+          <mc:Choice Requires="wps">
+            <w:drawing>
+              <wp:anchor distT="0" distB="0" distL="114300" distR="114300" simplePos="0" relativeHeight="251659264" behindDoc="0" locked="0" layoutInCell="1" allowOverlap="1" wp14:anchorId="2F7C8B66" wp14:editId="6E44A70A">
+                <wp:simplePos x="0" y="0"/>
+                <wp:positionH relativeFrom="column">
+                  <wp:posOffset>1951990</wp:posOffset>
+                </wp:positionH>
+                <wp:positionV relativeFrom="paragraph">
+                  <wp:posOffset>232410</wp:posOffset>
+                </wp:positionV>
+                <wp:extent cx="720090" cy="733425"/>
+                <wp:effectExtent l="0" t="0" r="60960" b="47625"/>
+                <wp:wrapNone/>
+                <wp:docPr id="98507767" name="Straight Arrow Connector 26"/>
+                <wp:cNvGraphicFramePr/>
+                <a:graphic xmlns:a="http://schemas.openxmlformats.org/drawingml/2006/main">
+                  <a:graphicData uri="http://schemas.microsoft.com/office/word/2010/wordprocessingShape">
+                    <wps:wsp>
+                      <wps:cNvCnPr/>
+                      <wps:spPr>
+                        <a:xfrm>
+                          <a:off x="0" y="0"/>
+                          <a:ext cx="719455" cy="733425"/>
+                        </a:xfrm>
+                        <a:prstGeom prst="straightConnector1">
+                          <a:avLst/>
+                        </a:prstGeom>
+                        <a:ln w="19050">
+                          <a:solidFill>
+                            <a:srgbClr val="C00000"/>
+                          </a:solidFill>
+                          <a:tailEnd type="triangle"/>
+                        </a:ln>
+                      </wps:spPr>
+                      <wps:style>
+                        <a:lnRef idx="1">
+                          <a:schemeClr val="accent1"/>
+                        </a:lnRef>
+                        <a:fillRef idx="0">
+                          <a:schemeClr val="accent1"/>
+                        </a:fillRef>
+                        <a:effectRef idx="0">
+                          <a:schemeClr val="accent1"/>
+                        </a:effectRef>
+                        <a:fontRef idx="minor">
+                          <a:schemeClr val="tx1"/>
+                        </a:fontRef>
+                      </wps:style>
+                      <wps:bodyPr/>
+                    </wps:wsp>
+                  </a:graphicData>
+                </a:graphic>
+                <wp14:sizeRelH relativeFrom="margin">
+                  <wp14:pctWidth>0</wp14:pctWidth>
+                </wp14:sizeRelH>
+                <wp14:sizeRelV relativeFrom="margin">
+                  <wp14:pctHeight>0</wp14:pctHeight>
+                </wp14:sizeRelV>
+              </wp:anchor>
+            </w:drawing>
+          </mc:Choice>
+          <mc:Fallback>
+            <w:pict>
+              <v:shapetype w14:anchorId="4AFC2F68" id="_x0000_t32" coordsize="21600,21600" o:spt="32" o:oned="t" path="m,l21600,21600e" filled="f">
+                <v:path arrowok="t" fillok="f" o:connecttype="none"/>
+                <o:lock v:ext="edit" shapetype="t"/>
+              </v:shapetype>
+              <v:shape id="Straight Arrow Connector 26" o:spid="_x0000_s1026" type="#_x0000_t32" style="position:absolute;margin-left:153.7pt;margin-top:18.3pt;width:56.7pt;height:57.75pt;z-index:251659264;visibility:visible;mso-wrap-style:square;mso-width-percent:0;mso-height-percent:0;mso-wrap-distance-left:9pt;mso-wrap-distance-top:0;mso-wrap-distance-right:9pt;mso-wrap-distance-bottom:0;mso-position-horizontal:absolute;mso-position-horizontal-relative:text;mso-position-vertical:absolute;mso-position-vertical-relative:text;mso-width-percent:0;mso-height-percent:0;mso-width-relative:margin;mso-height-relative:margin" o:gfxdata="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" strokecolor="#c00000" strokeweight="1.5pt">
+                <v:stroke endarrow="block" joinstyle="miter"/>
+              </v:shape>
+            </w:pict>
+          </mc:Fallback>
+        </mc:AlternateContent>
+      </w:r>
+      <w:r>
+        <w:rPr>
+          <w:rFonts w:ascii="Arial" w:hAnsi="Arial" w:cs="Arial"/>
+          <w:b/>
+          <w:bCs/>
+        </w:rPr>
+        <w:drawing>
+          <wp:inline distT="0" distB="0" distL="0" distR="0" wp14:anchorId="3BFBD29A" wp14:editId="3DCF98F3">
+            <wp:extent cx="4775200" cy="628650"/>
+            <wp:effectExtent l="0" t="0" r="6350" b="0"/>
+            <wp:docPr id="276142401" name="Picture 19"/>
+            <wp:cNvGraphicFramePr>
+              <a:graphicFrameLocks xmlns:a="http://schemas.openxmlformats.org/drawingml/2006/main" noChangeAspect="1"/>
+            </wp:cNvGraphicFramePr>
+            <a:graphic xmlns:a="http://schemas.openxmlformats.org/drawingml/2006/main">
+              <a:graphicData uri="http://schemas.openxmlformats.org/drawingml/2006/picture">
+                <pic:pic xmlns:pic="http://schemas.openxmlformats.org/drawingml/2006/picture">
+                  <pic:nvPicPr>
+                    <pic:cNvPr id="0" name="Picture 21"/>
+                    <pic:cNvPicPr>
+                      <a:picLocks noChangeAspect="1" noChangeArrowheads="1"/>
+                    </pic:cNvPicPr>
+                  </pic:nvPicPr>
+                  <pic:blipFill>
+                    <a:blip r:embed="rId16">
+                      <a:extLst>
+                        <a:ext uri="{28A0092B-C50C-407E-A947-70E740481C1C}">
+                          <a14:useLocalDpi xmlns:a14="http://schemas.microsoft.com/office/drawing/2010/main" val="0"/>
+                        </a:ext>
+                      </a:extLst>
+                    </a:blip>
+                    <a:srcRect/>
+                    <a:stretch>
+                      <a:fillRect/>
+                    </a:stretch>
+                  </pic:blipFill>
+                  <pic:spPr bwMode="auto">
+                    <a:xfrm>
+                      <a:off x="0" y="0"/>
+                      <a:ext cx="4775200" cy="628650"/>
+                    </a:xfrm>
+                    <a:prstGeom prst="rect">
+                      <a:avLst/>
+                    </a:prstGeom>
+                    <a:noFill/>
+                    <a:ln>
+                      <a:noFill/>
+                    </a:ln>
+                  </pic:spPr>
+                </pic:pic>
+              </a:graphicData>
+            </a:graphic>
+          </wp:inline>
+        </w:drawing>
+      </w:r>
+    </w:p>
+    <w:p>
+      <w:pPr>
+        <w:ind w:left="927"/>
+        <w:rPr>
+          <w:rFonts w:ascii="Arial" w:hAnsi="Arial" w:cs="Arial"/>
+          <w:b/>
+          <w:bCs/>
+        </w:rPr>
+      </w:pPr>
+      <w:r>
+        <w:rPr>
+          <w:rFonts w:ascii="Arial" w:hAnsi="Arial" w:cs="Arial"/>
+          <w:b/>
+          <w:bCs/>
+        </w:rPr>
+        <mc:AlternateContent>
+          <mc:Choice Requires="wps">
+            <w:drawing>
+              <wp:anchor distT="0" distB="0" distL="114300" distR="114300" simplePos="0" relativeHeight="251661312" behindDoc="0" locked="0" layoutInCell="1" allowOverlap="1" wp14:anchorId="57FC97B4" wp14:editId="576654CD">
+                <wp:simplePos x="0" y="0"/>
+                <wp:positionH relativeFrom="column">
+                  <wp:posOffset>2657475</wp:posOffset>
+                </wp:positionH>
+                <wp:positionV relativeFrom="paragraph">
+                  <wp:posOffset>384810</wp:posOffset>
+                </wp:positionV>
+                <wp:extent cx="104775" cy="3057525"/>
+                <wp:effectExtent l="76200" t="0" r="28575" b="47625"/>
+                <wp:wrapNone/>
+                <wp:docPr id="27102414" name="Straight Arrow Connector 25"/>
+                <wp:cNvGraphicFramePr/>
+                <a:graphic xmlns:a="http://schemas.openxmlformats.org/drawingml/2006/main">
+                  <a:graphicData uri="http://schemas.microsoft.com/office/word/2010/wordprocessingShape">
+                    <wps:wsp>
+                      <wps:cNvCnPr/>
+                      <wps:spPr>
+                        <a:xfrm flipH="1">
+                          <a:off x="0" y="0"/>
+                          <a:ext cx="104775" cy="3057525"/>
+                        </a:xfrm>
+                        <a:prstGeom prst="straightConnector1">
+                          <a:avLst/>
+                        </a:prstGeom>
+                        <a:ln w="12700">
+                          <a:solidFill>
+                            <a:srgbClr val="C00000"/>
+                          </a:solidFill>
+                          <a:tailEnd type="triangle"/>
+                        </a:ln>
+                      </wps:spPr>
+                      <wps:style>
+                        <a:lnRef idx="1">
+                          <a:schemeClr val="accent1"/>
+                        </a:lnRef>
+                        <a:fillRef idx="0">
+                          <a:schemeClr val="accent1"/>
+                        </a:fillRef>
+                        <a:effectRef idx="0">
+                          <a:schemeClr val="accent1"/>
+                        </a:effectRef>
+                        <a:fontRef idx="minor">
+                          <a:schemeClr val="tx1"/>
+                        </a:fontRef>
+                      </wps:style>
+                      <wps:bodyPr/>
+                    </wps:wsp>
+                  </a:graphicData>
+                </a:graphic>
+                <wp14:sizeRelH relativeFrom="margin">
+                  <wp14:pctWidth>0</wp14:pctWidth>
+                </wp14:sizeRelH>
+                <wp14:sizeRelV relativeFrom="margin">
+                  <wp14:pctHeight>0</wp14:pctHeight>
+                </wp14:sizeRelV>
+              </wp:anchor>
+            </w:drawing>
+          </mc:Choice>
+          <mc:Fallback>
+            <w:pict>
+              <v:shape w14:anchorId="1CFDE3E8" id="Straight Arrow Connector 25" o:spid="_x0000_s1026" type="#_x0000_t32" style="position:absolute;margin-left:209.25pt;margin-top:30.3pt;width:8.25pt;height:240.75pt;flip:x;z-index:251661312;visibility:visible;mso-wrap-style:square;mso-width-percent:0;mso-height-percent:0;mso-wrap-distance-left:9pt;mso-wrap-distance-top:0;mso-wrap-distance-right:9pt;mso-wrap-distance-bottom:0;mso-position-horizontal:absolute;mso-position-horizontal-relative:text;mso-position-vertical:absolute;mso-position-vertical-relative:text;mso-width-percent:0;mso-height-percent:0;mso-width-relative:margin;mso-height-relative:margin" o:gfxdata="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" strokecolor="#c00000" strokeweight="1pt">
+                <v:stroke endarrow="block" joinstyle="miter"/>
+              </v:shape>
+            </w:pict>
+          </mc:Fallback>
+        </mc:AlternateContent>
+      </w:r>
+      <w:r>
+        <w:rPr>
+          <w:rFonts w:ascii="Arial" w:hAnsi="Arial" w:cs="Arial"/>
+          <w:b/>
+          <w:bCs/>
+        </w:rPr>
+        <mc:AlternateContent>
+          <mc:Choice Requires="wps">
+            <w:drawing>
+              <wp:anchor distT="0" distB="0" distL="114300" distR="114300" simplePos="0" relativeHeight="251663360" behindDoc="0" locked="0" layoutInCell="1" allowOverlap="1" wp14:anchorId="1054B174" wp14:editId="584E8AE4">
+                <wp:simplePos x="0" y="0"/>
+                <wp:positionH relativeFrom="column">
+                  <wp:posOffset>2266950</wp:posOffset>
+                </wp:positionH>
+                <wp:positionV relativeFrom="paragraph">
+                  <wp:posOffset>403860</wp:posOffset>
+                </wp:positionV>
+                <wp:extent cx="390525" cy="828675"/>
+                <wp:effectExtent l="38100" t="0" r="28575" b="47625"/>
+                <wp:wrapNone/>
+                <wp:docPr id="278327566" name="Straight Arrow Connector 24"/>
+                <wp:cNvGraphicFramePr/>
+                <a:graphic xmlns:a="http://schemas.openxmlformats.org/drawingml/2006/main">
+                  <a:graphicData uri="http://schemas.microsoft.com/office/word/2010/wordprocessingShape">
+                    <wps:wsp>
+                      <wps:cNvCnPr/>
+                      <wps:spPr>
+                        <a:xfrm flipH="1">
+                          <a:off x="0" y="0"/>
+                          <a:ext cx="390525" cy="828675"/>
+                        </a:xfrm>
+                        <a:prstGeom prst="straightConnector1">
+                          <a:avLst/>
+                        </a:prstGeom>
+                        <a:ln w="12700">
+                          <a:solidFill>
+                            <a:srgbClr val="C00000"/>
+                          </a:solidFill>
+                          <a:tailEnd type="triangle"/>
+                        </a:ln>
+                      </wps:spPr>
+                      <wps:style>
+                        <a:lnRef idx="1">
+                          <a:schemeClr val="accent1"/>
+                        </a:lnRef>
+                        <a:fillRef idx="0">
+                          <a:schemeClr val="accent1"/>
+                        </a:fillRef>
+                        <a:effectRef idx="0">
+                          <a:schemeClr val="accent1"/>
+                        </a:effectRef>
+                        <a:fontRef idx="minor">
+                          <a:schemeClr val="tx1"/>
+                        </a:fontRef>
+                      </wps:style>
+                      <wps:bodyPr/>
+                    </wps:wsp>
+                  </a:graphicData>
+                </a:graphic>
+                <wp14:sizeRelH relativeFrom="margin">
+                  <wp14:pctWidth>0</wp14:pctWidth>
+                </wp14:sizeRelH>
+                <wp14:sizeRelV relativeFrom="margin">
+                  <wp14:pctHeight>0</wp14:pctHeight>
+                </wp14:sizeRelV>
+              </wp:anchor>
+            </w:drawing>
+          </mc:Choice>
+          <mc:Fallback>
+            <w:pict>
+              <v:shape w14:anchorId="0DE4A422" id="Straight Arrow Connector 24" o:spid="_x0000_s1026" type="#_x0000_t32" style="position:absolute;margin-left:178.5pt;margin-top:31.8pt;width:30.75pt;height:65.25pt;flip:x;z-index:251663360;visibility:visible;mso-wrap-style:square;mso-width-percent:0;mso-height-percent:0;mso-wrap-distance-left:9pt;mso-wrap-distance-top:0;mso-wrap-distance-right:9pt;mso-wrap-distance-bottom:0;mso-position-horizontal:absolute;mso-position-horizontal-relative:text;mso-position-vertical:absolute;mso-position-vertical-relative:text;mso-width-percent:0;mso-height-percent:0;mso-width-relative:margin;mso-height-relative:margin" o:gfxdata="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" strokecolor="#c00000" strokeweight="1pt">
+                <v:stroke endarrow="block" joinstyle="miter"/>
+              </v:shape>
+            </w:pict>
+          </mc:Fallback>
+        </mc:AlternateContent>
+      </w:r>
+      <w:r>
+        <w:rPr>
+          <w:rFonts w:ascii="Arial" w:hAnsi="Arial" w:cs="Arial"/>
+          <w:b/>
+          <w:bCs/>
+        </w:rPr>
+        <mc:AlternateContent>
+          <mc:Choice Requires="wps">
+            <w:drawing>
+              <wp:anchor distT="0" distB="0" distL="114300" distR="114300" simplePos="0" relativeHeight="251660288" behindDoc="0" locked="0" layoutInCell="1" allowOverlap="1" wp14:anchorId="1C28798C" wp14:editId="67AA0E4A">
+                <wp:simplePos x="0" y="0"/>
+                <wp:positionH relativeFrom="column">
+                  <wp:posOffset>2219325</wp:posOffset>
+                </wp:positionH>
+                <wp:positionV relativeFrom="paragraph">
+                  <wp:posOffset>394335</wp:posOffset>
+                </wp:positionV>
+                <wp:extent cx="104775" cy="495300"/>
+                <wp:effectExtent l="57150" t="0" r="28575" b="57150"/>
+                <wp:wrapNone/>
+                <wp:docPr id="1064233072" name="Straight Arrow Connector 23"/>
+                <wp:cNvGraphicFramePr/>
+                <a:graphic xmlns:a="http://schemas.openxmlformats.org/drawingml/2006/main">
+                  <a:graphicData uri="http://schemas.microsoft.com/office/word/2010/wordprocessingShape">
+                    <wps:wsp>
+                      <wps:cNvCnPr/>
+                      <wps:spPr>
+                        <a:xfrm flipH="1">
+                          <a:off x="0" y="0"/>
+                          <a:ext cx="104775" cy="495300"/>
+                        </a:xfrm>
+                        <a:prstGeom prst="straightConnector1">
+                          <a:avLst/>
+                        </a:prstGeom>
+                        <a:ln w="12700">
+                          <a:solidFill>
+                            <a:srgbClr val="C00000"/>
+                          </a:solidFill>
+                          <a:tailEnd type="triangle"/>
+                        </a:ln>
+                      </wps:spPr>
+                      <wps:style>
+                        <a:lnRef idx="1">
+                          <a:schemeClr val="accent1"/>
+                        </a:lnRef>
+                        <a:fillRef idx="0">
+                          <a:schemeClr val="accent1"/>
+                        </a:fillRef>
+                        <a:effectRef idx="0">
+                          <a:schemeClr val="accent1"/>
+                        </a:effectRef>
+                        <a:fontRef idx="minor">
+                          <a:schemeClr val="tx1"/>
+                        </a:fontRef>
+                      </wps:style>
+                      <wps:bodyPr/>
+                    </wps:wsp>
+                  </a:graphicData>
+                </a:graphic>
+                <wp14:sizeRelH relativeFrom="page">
+                  <wp14:pctWidth>0</wp14:pctWidth>
+                </wp14:sizeRelH>
+                <wp14:sizeRelV relativeFrom="page">
+                  <wp14:pctHeight>0</wp14:pctHeight>
+                </wp14:sizeRelV>
+              </wp:anchor>
+            </w:drawing>
+          </mc:Choice>
+          <mc:Fallback>
+            <w:pict>
+              <v:shape w14:anchorId="7A92B1C8" id="Straight Arrow Connector 23" o:spid="_x0000_s1026" type="#_x0000_t32" style="position:absolute;margin-left:174.75pt;margin-top:31.05pt;width:8.25pt;height:39pt;flip:x;z-index:251660288;visibility:visible;mso-wrap-style:square;mso-width-percent:0;mso-height-percent:0;mso-wrap-distance-left:9pt;mso-wrap-distance-top:0;mso-wrap-distance-right:9pt;mso-wrap-distance-bottom:0;mso-position-horizontal:absolute;mso-position-horizontal-relative:text;mso-position-vertical:absolute;mso-position-vertical-relative:text;mso-width-percent:0;mso-height-percent:0;mso-width-relative:page;mso-height-relative:page" o:gfxdata="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" strokecolor="#c00000" strokeweight="1pt">
+                <v:stroke endarrow="block" joinstyle="miter"/>
+              </v:shape>
+            </w:pict>
+          </mc:Fallback>
+        </mc:AlternateContent>
+      </w:r>
+      <w:r>
+        <w:rPr>
+          <w:rFonts w:ascii="Arial" w:hAnsi="Arial" w:cs="Arial"/>
+          <w:b/>
+          <w:bCs/>
+        </w:rPr>
+        <w:drawing>
+          <wp:inline distT="0" distB="0" distL="0" distR="0" wp14:anchorId="46CB42A6" wp14:editId="6B6B8DD7">
+            <wp:extent cx="2838450" cy="635000"/>
+            <wp:effectExtent l="0" t="0" r="0" b="0"/>
+            <wp:docPr id="1191700056" name="Picture 18"/>
+            <wp:cNvGraphicFramePr>
+              <a:graphicFrameLocks xmlns:a="http://schemas.openxmlformats.org/drawingml/2006/main" noChangeAspect="1"/>
+            </wp:cNvGraphicFramePr>
+            <a:graphic xmlns:a="http://schemas.openxmlformats.org/drawingml/2006/main">
+              <a:graphicData uri="http://schemas.openxmlformats.org/drawingml/2006/picture">
+                <pic:pic xmlns:pic="http://schemas.openxmlformats.org/drawingml/2006/picture">
+                  <pic:nvPicPr>
+                    <pic:cNvPr id="0" name="Picture 22"/>
+                    <pic:cNvPicPr>
+                      <a:picLocks noChangeAspect="1" noChangeArrowheads="1"/>
+                    </pic:cNvPicPr>
+                  </pic:nvPicPr>
+                  <pic:blipFill>
+                    <a:blip r:embed="rId15">
+                      <a:extLst>
+                        <a:ext uri="{28A0092B-C50C-407E-A947-70E740481C1C}">
+                          <a14:useLocalDpi xmlns:a14="http://schemas.microsoft.com/office/drawing/2010/main" val="0"/>
+                        </a:ext>
+                      </a:extLst>
+                    </a:blip>
+                    <a:srcRect/>
+                    <a:stretch>
+                      <a:fillRect/>
+                    </a:stretch>
+                  </pic:blipFill>
+                  <pic:spPr bwMode="auto">
+                    <a:xfrm>
+                      <a:off x="0" y="0"/>
+                      <a:ext cx="2838450" cy="635000"/>
+                    </a:xfrm>
+                    <a:prstGeom prst="rect">
+                      <a:avLst/>
+                    </a:prstGeom>
+                    <a:noFill/>
+                    <a:ln>
+                      <a:noFill/>
+                    </a:ln>
+                  </pic:spPr>
+                </pic:pic>
+              </a:graphicData>
+            </a:graphic>
+          </wp:inline>
+        </w:drawing>
+      </w:r>
+    </w:p>
+    <w:p>
+      <w:pPr>
+        <w:ind w:left="927"/>
+        <w:rPr>
+          <w:rFonts w:ascii="Arial" w:hAnsi="Arial" w:cs="Arial"/>
+          <w:b/>
+          <w:bCs/>
+        </w:rPr>
+      </w:pPr>
+      <w:r>
+        <w:rPr>
+          <w:rFonts w:ascii="Arial" w:hAnsi="Arial" w:cs="Arial"/>
+          <w:b/>
+          <w:bCs/>
+        </w:rPr>
+        <mc:AlternateContent>
+          <mc:Choice Requires="wps">
+            <w:drawing>
+              <wp:anchor distT="0" distB="0" distL="114300" distR="114300" simplePos="0" relativeHeight="251665408" behindDoc="0" locked="0" layoutInCell="1" allowOverlap="1" wp14:anchorId="57CBB17F" wp14:editId="18663618">
+                <wp:simplePos x="0" y="0"/>
+                <wp:positionH relativeFrom="column">
+                  <wp:posOffset>1676400</wp:posOffset>
+                </wp:positionH>
+                <wp:positionV relativeFrom="paragraph">
+                  <wp:posOffset>2310765</wp:posOffset>
+                </wp:positionV>
+                <wp:extent cx="438150" cy="295275"/>
+                <wp:effectExtent l="38100" t="0" r="19050" b="47625"/>
+                <wp:wrapNone/>
+                <wp:docPr id="1077795715" name="Straight Arrow Connector 22"/>
+                <wp:cNvGraphicFramePr/>
+                <a:graphic xmlns:a="http://schemas.openxmlformats.org/drawingml/2006/main">
+                  <a:graphicData uri="http://schemas.microsoft.com/office/word/2010/wordprocessingShape">
+                    <wps:wsp>
+                      <wps:cNvCnPr/>
+                      <wps:spPr>
+                        <a:xfrm flipH="1">
+                          <a:off x="0" y="0"/>
+                          <a:ext cx="438150" cy="295275"/>
+                        </a:xfrm>
+                        <a:prstGeom prst="straightConnector1">
+                          <a:avLst/>
+                        </a:prstGeom>
+                        <a:ln w="12700">
+                          <a:solidFill>
+                            <a:srgbClr val="C00000"/>
+                          </a:solidFill>
+                          <a:tailEnd type="triangle"/>
+                        </a:ln>
+                      </wps:spPr>
+                      <wps:style>
+                        <a:lnRef idx="1">
+                          <a:schemeClr val="accent1"/>
+                        </a:lnRef>
+                        <a:fillRef idx="0">
+                          <a:schemeClr val="accent1"/>
+                        </a:fillRef>
+                        <a:effectRef idx="0">
+                          <a:schemeClr val="accent1"/>
+                        </a:effectRef>
+                        <a:fontRef idx="minor">
+                          <a:schemeClr val="tx1"/>
+                        </a:fontRef>
+                      </wps:style>
+                      <wps:bodyPr/>
+                    </wps:wsp>
+                  </a:graphicData>
+                </a:graphic>
+                <wp14:sizeRelH relativeFrom="margin">
+                  <wp14:pctWidth>0</wp14:pctWidth>
+                </wp14:sizeRelH>
+                <wp14:sizeRelV relativeFrom="margin">
+                  <wp14:pctHeight>0</wp14:pctHeight>
+                </wp14:sizeRelV>
+              </wp:anchor>
+            </w:drawing>
+          </mc:Choice>
+          <mc:Fallback>
+            <w:pict>
+              <v:shape w14:anchorId="0C317A12" id="Straight Arrow Connector 22" o:spid="_x0000_s1026" type="#_x0000_t32" style="position:absolute;margin-left:132pt;margin-top:181.95pt;width:34.5pt;height:23.25pt;flip:x;z-index:251665408;visibility:visible;mso-wrap-style:square;mso-width-percent:0;mso-height-percent:0;mso-wrap-distance-left:9pt;mso-wrap-distance-top:0;mso-wrap-distance-right:9pt;mso-wrap-distance-bottom:0;mso-position-horizontal:absolute;mso-position-horizontal-relative:text;mso-position-vertical:absolute;mso-position-vertical-relative:text;mso-width-percent:0;mso-height-percent:0;mso-width-relative:margin;mso-height-relative:margin" o:gfxdata="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" strokecolor="#c00000" strokeweight="1pt">
+                <v:stroke endarrow="block" joinstyle="miter"/>
+              </v:shape>
+            </w:pict>
+          </mc:Fallback>
+        </mc:AlternateContent>
+      </w:r>
+      <w:r>
+        <w:rPr>
+          <w:rFonts w:ascii="Arial" w:hAnsi="Arial" w:cs="Arial"/>
+          <w:b/>
+          <w:bCs/>
+        </w:rPr>
+        <mc:AlternateContent>
+          <mc:Choice Requires="wps">
+            <w:drawing>
+              <wp:anchor distT="0" distB="0" distL="114300" distR="114300" simplePos="0" relativeHeight="251664384" behindDoc="0" locked="0" layoutInCell="1" allowOverlap="1" wp14:anchorId="3C653379" wp14:editId="5C6023CB">
+                <wp:simplePos x="0" y="0"/>
+                <wp:positionH relativeFrom="column">
+                  <wp:posOffset>2209800</wp:posOffset>
+                </wp:positionH>
+                <wp:positionV relativeFrom="paragraph">
+                  <wp:posOffset>720090</wp:posOffset>
+                </wp:positionV>
+                <wp:extent cx="76200" cy="742950"/>
+                <wp:effectExtent l="0" t="0" r="76200" b="57150"/>
+                <wp:wrapNone/>
+                <wp:docPr id="1716529992" name="Straight Arrow Connector 21"/>
+                <wp:cNvGraphicFramePr/>
+                <a:graphic xmlns:a="http://schemas.openxmlformats.org/drawingml/2006/main">
+                  <a:graphicData uri="http://schemas.microsoft.com/office/word/2010/wordprocessingShape">
+                    <wps:wsp>
+                      <wps:cNvCnPr/>
+                      <wps:spPr>
+                        <a:xfrm>
+                          <a:off x="0" y="0"/>
+                          <a:ext cx="76200" cy="742950"/>
+                        </a:xfrm>
+                        <a:prstGeom prst="straightConnector1">
+                          <a:avLst/>
+                        </a:prstGeom>
+                        <a:ln w="12700">
+                          <a:solidFill>
+                            <a:srgbClr val="C00000"/>
+                          </a:solidFill>
+                          <a:tailEnd type="triangle"/>
+                        </a:ln>
+                      </wps:spPr>
+                      <wps:style>
+                        <a:lnRef idx="1">
+                          <a:schemeClr val="accent1"/>
+                        </a:lnRef>
+                        <a:fillRef idx="0">
+                          <a:schemeClr val="accent1"/>
+                        </a:fillRef>
+                        <a:effectRef idx="0">
+                          <a:schemeClr val="accent1"/>
+                        </a:effectRef>
+                        <a:fontRef idx="minor">
+                          <a:schemeClr val="tx1"/>
+                        </a:fontRef>
+                      </wps:style>
+                      <wps:bodyPr/>
+                    </wps:wsp>
+                  </a:graphicData>
+                </a:graphic>
+                <wp14:sizeRelH relativeFrom="margin">
+                  <wp14:pctWidth>0</wp14:pctWidth>
+                </wp14:sizeRelH>
+                <wp14:sizeRelV relativeFrom="margin">
+                  <wp14:pctHeight>0</wp14:pctHeight>
+                </wp14:sizeRelV>
+              </wp:anchor>
+            </w:drawing>
+          </mc:Choice>
+          <mc:Fallback>
+            <w:pict>
+              <v:shape w14:anchorId="1B81E722" id="Straight Arrow Connector 21" o:spid="_x0000_s1026" type="#_x0000_t32" style="position:absolute;margin-left:174pt;margin-top:56.7pt;width:6pt;height:58.5pt;z-index:251664384;visibility:visible;mso-wrap-style:square;mso-width-percent:0;mso-height-percent:0;mso-wrap-distance-left:9pt;mso-wrap-distance-top:0;mso-wrap-distance-right:9pt;mso-wrap-distance-bottom:0;mso-position-horizontal:absolute;mso-position-horizontal-relative:text;mso-position-vertical:absolute;mso-position-vertical-relative:text;mso-width-percent:0;mso-height-percent:0;mso-width-relative:margin;mso-height-relative:margin" o:gfxdata="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" strokecolor="#c00000" strokeweight="1pt">
+                <v:stroke endarrow="block" joinstyle="miter"/>
+              </v:shape>
+            </w:pict>
+          </mc:Fallback>
+        </mc:AlternateContent>
+      </w:r>
+      <w:r>
+        <w:rPr>
+          <w:rFonts w:ascii="Arial" w:hAnsi="Arial" w:cs="Arial"/>
+          <w:b/>
+          <w:bCs/>
+        </w:rPr>
+        <mc:AlternateContent>
+          <mc:Choice Requires="wps">
+            <w:drawing>
+              <wp:anchor distT="0" distB="0" distL="114300" distR="114300" simplePos="0" relativeHeight="251662336" behindDoc="0" locked="0" layoutInCell="1" allowOverlap="1" wp14:anchorId="117476BC" wp14:editId="15261E2C">
+                <wp:simplePos x="0" y="0"/>
+                <wp:positionH relativeFrom="column">
+                  <wp:posOffset>2038350</wp:posOffset>
+                </wp:positionH>
+                <wp:positionV relativeFrom="paragraph">
+                  <wp:posOffset>415290</wp:posOffset>
+                </wp:positionV>
+                <wp:extent cx="342900" cy="381000"/>
+                <wp:effectExtent l="0" t="0" r="19050" b="19050"/>
+                <wp:wrapNone/>
+                <wp:docPr id="328567788" name="Text Box 20"/>
+                <wp:cNvGraphicFramePr/>
+                <a:graphic xmlns:a="http://schemas.openxmlformats.org/drawingml/2006/main">
+                  <a:graphicData uri="http://schemas.microsoft.com/office/word/2010/wordprocessingShape">
+                    <wps:wsp>
+                      <wps:cNvSpPr txBox="1"/>
+                      <wps:spPr>
+                        <a:xfrm>
+                          <a:off x="0" y="0"/>
+                          <a:ext cx="342900" cy="381000"/>
+                        </a:xfrm>
+                        <a:prstGeom prst="rect">
+                          <a:avLst/>
+                        </a:prstGeom>
+                        <a:solidFill>
+                          <a:schemeClr val="lt1"/>
+                        </a:solidFill>
+                        <a:ln w="6350">
+                          <a:solidFill>
+                            <a:prstClr val="black"/>
+                          </a:solidFill>
+                        </a:ln>
+                      </wps:spPr>
+                      <wps:txbx>
+                        <w:txbxContent>
+                          <w:p>
+                            <w:pPr>
+                              <w:rPr>
+                                <w:b/>
+                                <w:bCs/>
+                                <w:color w:val="C00000"/>
+                                <w:sz w:val="40"/>
+                                <w:szCs w:val="40"/>
+                              </w:rPr>
+                            </w:pPr>
+                            <w:r>
+                              <w:rPr>
+                                <w:b/>
+                                <w:bCs/>
+                                <w:color w:val="C00000"/>
+                                <w:sz w:val="40"/>
+                                <w:szCs w:val="40"/>
+                              </w:rPr>
+                              <w:t>?</w:t>
+                            </w:r>
+                          </w:p>
+                        </w:txbxContent>
+                      </wps:txbx>
+                      <wps:bodyPr rot="0" spcFirstLastPara="0" vertOverflow="clip" horzOverflow="clip" vert="horz" wrap="square" lIns="91440" tIns="45720" rIns="91440" bIns="45720" numCol="1" spcCol="0" rtlCol="0" fromWordArt="0" anchor="t" anchorCtr="0" forceAA="0" compatLnSpc="1">
+                        <a:prstTxWarp prst="textNoShape">
+                          <a:avLst/>
+                        </a:prstTxWarp>
+                        <a:noAutofit/>
+                      </wps:bodyPr>
+                    </wps:wsp>
+                  </a:graphicData>
+                </a:graphic>
+                <wp14:sizeRelH relativeFrom="margin">
+                  <wp14:pctWidth>0</wp14:pctWidth>
+                </wp14:sizeRelH>
+                <wp14:sizeRelV relativeFrom="margin">
+                  <wp14:pctHeight>0</wp14:pctHeight>
+                </wp14:sizeRelV>
+              </wp:anchor>
+            </w:drawing>
+          </mc:Choice>
+          <mc:Fallback>
+            <w:pict>
+              <v:shapetype w14:anchorId="117476BC" id="_x0000_t202" coordsize="21600,21600" o:spt="202" path="m,l,21600r21600,l21600,xe">
+                <v:stroke joinstyle="miter"/>
+                <v:path gradientshapeok="t" o:connecttype="rect"/>
+              </v:shapetype>
+              <v:shape id="Text Box 20" o:spid="_x0000_s1026" type="#_x0000_t202" style="position:absolute;left:0;text-align:left;margin-left:160.5pt;margin-top:32.7pt;width:27pt;height:30pt;z-index:251662336;visibility:visible;mso-wrap-style:square;mso-width-percent:0;mso-height-percent:0;mso-wrap-distance-left:9pt;mso-wrap-distance-top:0;mso-wrap-distance-right:9pt;mso-wrap-distance-bottom:0;mso-position-horizontal:absolute;mso-position-horizontal-relative:text;mso-position-vertical:absolute;mso-position-vertical-relative:text;mso-width-percent:0;mso-height-percent:0;mso-width-relative:margin;mso-height-relative:margin;v-text-anchor:top" o:gfxdata="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" fillcolor="white [3201]" strokeweight=".5pt">
+                <v:textbox>
+                  <w:txbxContent>
+                    <w:p>
+                      <w:pPr>
+                        <w:rPr>
+                          <w:b/>
+                          <w:bCs/>
+                          <w:color w:val="C00000"/>
+                          <w:sz w:val="40"/>
+                          <w:szCs w:val="40"/>
+                        </w:rPr>
+                      </w:pPr>
+                      <w:r>
+                        <w:rPr>
+                          <w:b/>
+                          <w:bCs/>
+                          <w:color w:val="C00000"/>
+                          <w:sz w:val="40"/>
+                          <w:szCs w:val="40"/>
+                        </w:rPr>
+                        <w:t>?</w:t>
+                      </w:r>
+                    </w:p>
+                  </w:txbxContent>
+                </v:textbox>
+              </v:shape>
+            </w:pict>
+          </mc:Fallback>
+        </mc:AlternateContent>
+      </w:r>
+      <w:r>
+        <w:rPr>
+          <w:rFonts w:ascii="Arial" w:hAnsi="Arial" w:cs="Arial"/>
+          <w:b/>
+          <w:bCs/>
+        </w:rPr>
+        <w:drawing>
+          <wp:inline distT="0" distB="0" distL="0" distR="0" wp14:anchorId="7EC8B8F0" wp14:editId="129AA78D">
+            <wp:extent cx="5727700" cy="2533650"/>
+            <wp:effectExtent l="0" t="0" r="6350" b="0"/>
+            <wp:docPr id="94446575" name="Picture 17"/>
+            <wp:cNvGraphicFramePr>
+              <a:graphicFrameLocks xmlns:a="http://schemas.openxmlformats.org/drawingml/2006/main" noChangeAspect="1"/>
+            </wp:cNvGraphicFramePr>
+            <a:graphic xmlns:a="http://schemas.openxmlformats.org/drawingml/2006/main">
+              <a:graphicData uri="http://schemas.openxmlformats.org/drawingml/2006/picture">
+                <pic:pic xmlns:pic="http://schemas.openxmlformats.org/drawingml/2006/picture">
+                  <pic:nvPicPr>
+                    <pic:cNvPr id="0" name="Picture 23"/>
+                    <pic:cNvPicPr>
+                      <a:picLocks noChangeAspect="1" noChangeArrowheads="1"/>
+                    </pic:cNvPicPr>
+                  </pic:nvPicPr>
+                  <pic:blipFill>
+                    <a:blip r:embed="rId17">
+                      <a:extLst>
+                        <a:ext uri="{28A0092B-C50C-407E-A947-70E740481C1C}">
+                          <a14:useLocalDpi xmlns:a14="http://schemas.microsoft.com/office/drawing/2010/main" val="0"/>
+                        </a:ext>
+                      </a:extLst>
+                    </a:blip>
+                    <a:srcRect/>
+                    <a:stretch>
+                      <a:fillRect/>
+                    </a:stretch>
+                  </pic:blipFill>
+                  <pic:spPr bwMode="auto">
+                    <a:xfrm>
+                      <a:off x="0" y="0"/>
+                      <a:ext cx="5727700" cy="2533650"/>
+                    </a:xfrm>
+                    <a:prstGeom prst="rect">
+                      <a:avLst/>
+                    </a:prstGeom>
+                    <a:noFill/>
+                    <a:ln>
+                      <a:noFill/>
+                    </a:ln>
+                  </pic:spPr>
+                </pic:pic>
+              </a:graphicData>
+            </a:graphic>
+          </wp:inline>
+        </w:drawing>
+      </w:r>
+    </w:p>
+    <w:p>
+      <w:pPr>
+        <w:ind w:left="927"/>
+        <w:rPr>
+          <w:rFonts w:ascii="Arial" w:hAnsi="Arial" w:cs="Arial"/>
+          <w:b/>
+          <w:bCs/>
+        </w:rPr>
+      </w:pPr>
+      <w:r>
+        <w:rPr>
+          <w:rFonts w:ascii="Arial" w:hAnsi="Arial" w:cs="Arial"/>
+          <w:b/>
+          <w:bCs/>
+        </w:rPr>
+        <w:drawing>
+          <wp:inline distT="0" distB="0" distL="0" distR="0" wp14:anchorId="756BB8D5" wp14:editId="6BDB4FBF">
+            <wp:extent cx="4413250" cy="647700"/>
+            <wp:effectExtent l="0" t="0" r="6350" b="0"/>
+            <wp:docPr id="1717683129" name="Picture 16" descr="A black screen with white text&#10;&#10;AI-generated content may be incorrect."/>
+            <wp:cNvGraphicFramePr>
+              <a:graphicFrameLocks xmlns:a="http://schemas.openxmlformats.org/drawingml/2006/main" noChangeAspect="1"/>
+            </wp:cNvGraphicFramePr>
+            <a:graphic xmlns:a="http://schemas.openxmlformats.org/drawingml/2006/main">
+              <a:graphicData uri="http://schemas.openxmlformats.org/drawingml/2006/picture">
+                <pic:pic xmlns:pic="http://schemas.openxmlformats.org/drawingml/2006/picture">
+                  <pic:nvPicPr>
+                    <pic:cNvPr id="0" name="Picture 1" descr="A black screen with white text&#10;&#10;AI-generated content may be incorrect."/>
+                    <pic:cNvPicPr>
+                      <a:picLocks noChangeAspect="1" noChangeArrowheads="1"/>
+                    </pic:cNvPicPr>
+                  </pic:nvPicPr>
+                  <pic:blipFill>
+                    <a:blip r:embed="rId18">
+                      <a:extLst>
+                        <a:ext uri="{28A0092B-C50C-407E-A947-70E740481C1C}">
+                          <a14:useLocalDpi xmlns:a14="http://schemas.microsoft.com/office/drawing/2010/main" val="0"/>
+                        </a:ext>
+                      </a:extLst>
+                    </a:blip>
+                    <a:srcRect/>
+                    <a:stretch>
+                      <a:fillRect/>
+                    </a:stretch>
+                  </pic:blipFill>
+                  <pic:spPr bwMode="auto">
+                    <a:xfrm>
+                      <a:off x="0" y="0"/>
+                      <a:ext cx="4413250" cy="647700"/>
+                    </a:xfrm>
+                    <a:prstGeom prst="rect">
+                      <a:avLst/>
+                    </a:prstGeom>
+                    <a:noFill/>
+                    <a:ln>
+                      <a:noFill/>
+                    </a:ln>
+                  </pic:spPr>
+                </pic:pic>
+              </a:graphicData>
+            </a:graphic>
+          </wp:inline>
+        </w:drawing>
+      </w:r>
+      <w:r>
+        <w:rPr>
+          <w:rFonts w:ascii="Arial" w:hAnsi="Arial" w:cs="Arial"/>
+          <w:b/>
+          <w:bCs/>
+        </w:rPr>
+        <w:br w:type="page"/>
+      </w:r>
+    </w:p>
+    <w:p>
+      <w:pPr>
+        <w:ind w:left="927"/>
+        <w:rPr>
+          <w:rFonts w:ascii="Arial" w:hAnsi="Arial" w:cs="Arial"/>
+          <w:b/>
+          <w:bCs/>
+        </w:rPr>
+      </w:pPr>
+    </w:p>
+    <w:p>
+      <w:pPr>
+        <w:ind w:left="927"/>
+        <w:rPr>
+          <w:rFonts w:ascii="Arial" w:hAnsi="Arial" w:cs="Arial"/>
         </w:rPr>
       </w:pPr>
     </w:p>
@@ -1545,6 +3179,7 @@
           <w:szCs w:val="28"/>
         </w:rPr>
       </w:pPr>
+      <w:proofErr w:type="spellStart"/>
       <w:r>
         <w:rPr>
           <w:rFonts w:ascii="Courier New" w:hAnsi="Courier New" w:cs="Courier New"/>
@@ -1553,6 +3188,7 @@
         </w:rPr>
         <w:t>PasswordEncoder</w:t>
       </w:r>
+      <w:proofErr w:type="spellEnd"/>
       <w:r>
         <w:rPr>
           <w:rFonts w:ascii="Arial" w:hAnsi="Arial" w:cs="Arial"/>
@@ -1579,8 +3215,16 @@
         <w:rPr>
           <w:rFonts w:ascii="Courier New" w:hAnsi="Courier New" w:cs="Courier New"/>
         </w:rPr>
-        <w:t xml:space="preserve"> SecurityConfiguration</w:t>
-      </w:r>
+        <w:t xml:space="preserve"> </w:t>
+      </w:r>
+      <w:proofErr w:type="spellStart"/>
+      <w:r>
+        <w:rPr>
+          <w:rFonts w:ascii="Courier New" w:hAnsi="Courier New" w:cs="Courier New"/>
+        </w:rPr>
+        <w:t>SecurityConfiguration</w:t>
+      </w:r>
+      <w:proofErr w:type="spellEnd"/>
       <w:r>
         <w:rPr>
           <w:rFonts w:ascii="Arial" w:hAnsi="Arial" w:cs="Arial"/>
@@ -1626,7 +3270,7 @@
                     <pic:cNvPicPr/>
                   </pic:nvPicPr>
                   <pic:blipFill>
-                    <a:blip r:embed="rId15"/>
+                    <a:blip r:embed="rId19"/>
                     <a:stretch>
                       <a:fillRect/>
                     </a:stretch>
@@ -1692,12 +3336,89 @@
           <w:rFonts w:ascii="Arial" w:hAnsi="Arial" w:cs="Arial"/>
         </w:rPr>
       </w:pPr>
-      <w:r>
-        <w:rPr>
-          <w:rFonts w:ascii="Arial" w:hAnsi="Arial" w:cs="Arial"/>
-        </w:rPr>
-        <w:br w:type="page"/>
-      </w:r>
+    </w:p>
+    <w:p>
+      <w:pPr>
+        <w:rPr>
+          <w:rFonts w:ascii="Arial" w:hAnsi="Arial" w:cs="Arial"/>
+        </w:rPr>
+      </w:pPr>
+    </w:p>
+    <w:p>
+      <w:pPr>
+        <w:rPr>
+          <w:rFonts w:ascii="Arial" w:hAnsi="Arial" w:cs="Arial"/>
+        </w:rPr>
+      </w:pPr>
+    </w:p>
+    <w:p>
+      <w:pPr>
+        <w:rPr>
+          <w:rFonts w:ascii="Arial" w:hAnsi="Arial" w:cs="Arial"/>
+        </w:rPr>
+      </w:pPr>
+    </w:p>
+    <w:p>
+      <w:pPr>
+        <w:rPr>
+          <w:rFonts w:ascii="Arial" w:hAnsi="Arial" w:cs="Arial"/>
+        </w:rPr>
+      </w:pPr>
+    </w:p>
+    <w:p>
+      <w:pPr>
+        <w:ind w:left="1276" w:hanging="1418"/>
+        <w:rPr>
+          <w:rFonts w:ascii="Arial" w:hAnsi="Arial" w:cs="Arial"/>
+        </w:rPr>
+      </w:pPr>
+    </w:p>
+    <w:p>
+      <w:pPr>
+        <w:ind w:left="1276" w:hanging="1418"/>
+        <w:rPr>
+          <w:rFonts w:ascii="Arial" w:hAnsi="Arial" w:cs="Arial"/>
+        </w:rPr>
+      </w:pPr>
+    </w:p>
+    <w:p>
+      <w:pPr>
+        <w:ind w:left="1276" w:hanging="1418"/>
+        <w:rPr>
+          <w:rFonts w:ascii="Arial" w:hAnsi="Arial" w:cs="Arial"/>
+        </w:rPr>
+      </w:pPr>
+    </w:p>
+    <w:p>
+      <w:pPr>
+        <w:ind w:left="1276" w:hanging="1418"/>
+        <w:rPr>
+          <w:rFonts w:ascii="Arial" w:hAnsi="Arial" w:cs="Arial"/>
+        </w:rPr>
+      </w:pPr>
+    </w:p>
+    <w:p>
+      <w:pPr>
+        <w:ind w:left="1276" w:hanging="1418"/>
+        <w:rPr>
+          <w:rFonts w:ascii="Arial" w:hAnsi="Arial" w:cs="Arial"/>
+        </w:rPr>
+      </w:pPr>
+    </w:p>
+    <w:p>
+      <w:pPr>
+        <w:ind w:left="1276" w:hanging="1418"/>
+        <w:rPr>
+          <w:rFonts w:ascii="Arial" w:hAnsi="Arial" w:cs="Arial"/>
+        </w:rPr>
+      </w:pPr>
+    </w:p>
+    <w:p>
+      <w:pPr>
+        <w:rPr>
+          <w:rFonts w:ascii="Arial" w:hAnsi="Arial" w:cs="Arial"/>
+        </w:rPr>
+      </w:pPr>
     </w:p>
     <w:p>
       <w:pPr>
@@ -1720,7 +3441,6 @@
           <w:sz w:val="32"/>
           <w:szCs w:val="32"/>
         </w:rPr>
-        <w:lastRenderedPageBreak/>
         <w:t>Usage of</w:t>
       </w:r>
       <w:r>
@@ -1735,6 +3455,7 @@
         </w:rPr>
         <w:t xml:space="preserve"> </w:t>
       </w:r>
+      <w:proofErr w:type="spellStart"/>
       <w:r>
         <w:rPr>
           <w:rFonts w:ascii="Courier New" w:hAnsi="Courier New" w:cs="Courier New"/>
@@ -1743,6 +3464,7 @@
         </w:rPr>
         <w:t>UserDetailsService</w:t>
       </w:r>
+      <w:proofErr w:type="spellEnd"/>
       <w:r>
         <w:rPr>
           <w:rFonts w:ascii="Arial" w:hAnsi="Arial" w:cs="Arial"/>
@@ -1836,7 +3558,7 @@
                     <pic:cNvPicPr/>
                   </pic:nvPicPr>
                   <pic:blipFill>
-                    <a:blip r:embed="rId16"/>
+                    <a:blip r:embed="rId20"/>
                     <a:stretch>
                       <a:fillRect/>
                     </a:stretch>
@@ -1869,6 +3591,7 @@
         <w:rPr>
           <w:rFonts w:ascii="Arial" w:hAnsi="Arial" w:cs="Arial"/>
         </w:rPr>
+        <w:lastRenderedPageBreak/>
         <w:t>I</w:t>
       </w:r>
       <w:r>
@@ -1889,12 +3612,36 @@
         </w:rPr>
         <w:t xml:space="preserve"> </w:t>
       </w:r>
-      <w:r>
-        <w:rPr>
-          <w:rFonts w:ascii="Courier New" w:hAnsi="Courier New" w:cs="Courier New"/>
-        </w:rPr>
-        <w:t>UserDetails loadUserByUsername(</w:t>
-      </w:r>
+      <w:proofErr w:type="spellStart"/>
+      <w:r>
+        <w:rPr>
+          <w:rFonts w:ascii="Courier New" w:hAnsi="Courier New" w:cs="Courier New"/>
+        </w:rPr>
+        <w:t>UserDetails</w:t>
+      </w:r>
+      <w:proofErr w:type="spellEnd"/>
+      <w:r>
+        <w:rPr>
+          <w:rFonts w:ascii="Courier New" w:hAnsi="Courier New" w:cs="Courier New"/>
+        </w:rPr>
+        <w:t xml:space="preserve"> </w:t>
+      </w:r>
+      <w:proofErr w:type="spellStart"/>
+      <w:proofErr w:type="gramStart"/>
+      <w:r>
+        <w:rPr>
+          <w:rFonts w:ascii="Courier New" w:hAnsi="Courier New" w:cs="Courier New"/>
+        </w:rPr>
+        <w:t>loadUserByUsername</w:t>
+      </w:r>
+      <w:proofErr w:type="spellEnd"/>
+      <w:r>
+        <w:rPr>
+          <w:rFonts w:ascii="Courier New" w:hAnsi="Courier New" w:cs="Courier New"/>
+        </w:rPr>
+        <w:t>(</w:t>
+      </w:r>
+      <w:proofErr w:type="gramEnd"/>
       <w:r>
         <w:rPr>
           <w:rFonts w:ascii="Courier New" w:hAnsi="Courier New" w:cs="Courier New"/>
@@ -1963,11 +3710,41 @@
         </w:rPr>
         <w:t xml:space="preserve"> </w:t>
       </w:r>
-      <w:r>
-        <w:rPr>
-          <w:rFonts w:ascii="Courier New" w:hAnsi="Courier New" w:cs="Courier New"/>
-        </w:rPr>
-        <w:t>UserDetails loadUserByUsername(String username);</w:t>
+      <w:proofErr w:type="spellStart"/>
+      <w:r>
+        <w:rPr>
+          <w:rFonts w:ascii="Courier New" w:hAnsi="Courier New" w:cs="Courier New"/>
+        </w:rPr>
+        <w:t>UserDetails</w:t>
+      </w:r>
+      <w:proofErr w:type="spellEnd"/>
+      <w:r>
+        <w:rPr>
+          <w:rFonts w:ascii="Courier New" w:hAnsi="Courier New" w:cs="Courier New"/>
+        </w:rPr>
+        <w:t xml:space="preserve"> </w:t>
+      </w:r>
+      <w:proofErr w:type="spellStart"/>
+      <w:proofErr w:type="gramStart"/>
+      <w:r>
+        <w:rPr>
+          <w:rFonts w:ascii="Courier New" w:hAnsi="Courier New" w:cs="Courier New"/>
+        </w:rPr>
+        <w:t>loadUserByUsername</w:t>
+      </w:r>
+      <w:proofErr w:type="spellEnd"/>
+      <w:r>
+        <w:rPr>
+          <w:rFonts w:ascii="Courier New" w:hAnsi="Courier New" w:cs="Courier New"/>
+        </w:rPr>
+        <w:t>(</w:t>
+      </w:r>
+      <w:proofErr w:type="gramEnd"/>
+      <w:r>
+        <w:rPr>
+          <w:rFonts w:ascii="Courier New" w:hAnsi="Courier New" w:cs="Courier New"/>
+        </w:rPr>
+        <w:t>String username);</w:t>
       </w:r>
       <w:r>
         <w:rPr>
@@ -2113,7 +3890,7 @@
                     <pic:cNvPicPr/>
                   </pic:nvPicPr>
                   <pic:blipFill>
-                    <a:blip r:embed="rId17"/>
+                    <a:blip r:embed="rId21"/>
                     <a:stretch>
                       <a:fillRect/>
                     </a:stretch>
@@ -2167,7 +3944,49 @@
           <w:b/>
           <w:bCs/>
         </w:rPr>
-        <w:t>Thanks to annotation @Service above the class’s name, it’s managed by Spring. That includes instantiation of its object and retrieval User object from its table by a name passed in from a form during a login attempt.</w:t>
+        <w:t xml:space="preserve">Thanks to annotation </w:t>
+      </w:r>
+      <w:r>
+        <w:rPr>
+          <w:rFonts w:ascii="Courier New" w:hAnsi="Courier New" w:cs="Courier New"/>
+          <w:b/>
+          <w:bCs/>
+        </w:rPr>
+        <w:t>@Service</w:t>
+      </w:r>
+      <w:r>
+        <w:rPr>
+          <w:rFonts w:ascii="Arial" w:hAnsi="Arial" w:cs="Arial"/>
+          <w:b/>
+          <w:bCs/>
+        </w:rPr>
+        <w:t xml:space="preserve"> above the class’s name, it’s managed by Spring. That includes instantiation of its object and retrieval </w:t>
+      </w:r>
+      <w:r>
+        <w:rPr>
+          <w:rFonts w:ascii="Arial" w:hAnsi="Arial" w:cs="Arial"/>
+          <w:b/>
+          <w:bCs/>
+        </w:rPr>
+        <w:t xml:space="preserve">of a </w:t>
+      </w:r>
+      <w:proofErr w:type="gramStart"/>
+      <w:r>
+        <w:rPr>
+          <w:rFonts w:ascii="Courier New" w:hAnsi="Courier New" w:cs="Courier New"/>
+          <w:b/>
+          <w:bCs/>
+        </w:rPr>
+        <w:t>User</w:t>
+      </w:r>
+      <w:proofErr w:type="gramEnd"/>
+      <w:r>
+        <w:rPr>
+          <w:rFonts w:ascii="Arial" w:hAnsi="Arial" w:cs="Arial"/>
+          <w:b/>
+          <w:bCs/>
+        </w:rPr>
+        <w:t xml:space="preserve"> object from its table by a name passed in from a form during a login attempt.</w:t>
       </w:r>
     </w:p>
     <w:p>
@@ -2175,8 +3994,6 @@
         <w:jc w:val="center"/>
         <w:rPr>
           <w:rFonts w:ascii="Arial" w:hAnsi="Arial" w:cs="Arial"/>
-          <w:b/>
-          <w:bCs/>
         </w:rPr>
       </w:pPr>
       <w:r>
@@ -2187,9 +4004,9 @@
           <w:noProof/>
         </w:rPr>
         <w:drawing>
-          <wp:inline distT="0" distB="0" distL="0" distR="0" wp14:anchorId="1FC42168" wp14:editId="1EA216C7">
-            <wp:extent cx="4848224" cy="2256784"/>
-            <wp:effectExtent l="0" t="0" r="0" b="0"/>
+          <wp:inline distT="0" distB="0" distL="0" distR="0" wp14:anchorId="1FC42168" wp14:editId="4EFFBE27">
+            <wp:extent cx="4610100" cy="2145940"/>
+            <wp:effectExtent l="0" t="0" r="0" b="6985"/>
             <wp:docPr id="1997502345" name="Picture 1" descr="A computer screen shot of a program code&#10;&#10;AI-generated content may be incorrect."/>
             <wp:cNvGraphicFramePr>
               <a:graphicFrameLocks xmlns:a="http://schemas.openxmlformats.org/drawingml/2006/main" noChangeAspect="1"/>
@@ -2210,7 +4027,7 @@
                   <pic:spPr>
                     <a:xfrm>
                       <a:off x="0" y="0"/>
-                      <a:ext cx="4858848" cy="2261729"/>
+                      <a:ext cx="4625189" cy="2152964"/>
                     </a:xfrm>
                     <a:prstGeom prst="rect">
                       <a:avLst/>
@@ -2222,18 +4039,10 @@
           </wp:inline>
         </w:drawing>
       </w:r>
-    </w:p>
-    <w:p>
-      <w:pPr>
-        <w:rPr>
-          <w:rFonts w:ascii="Arial" w:hAnsi="Arial" w:cs="Arial"/>
-        </w:rPr>
-      </w:pPr>
-      <w:r>
-        <w:rPr>
-          <w:rFonts w:ascii="Arial" w:hAnsi="Arial" w:cs="Arial"/>
-        </w:rPr>
-        <w:lastRenderedPageBreak/>
+      <w:r>
+        <w:rPr>
+          <w:rFonts w:ascii="Arial" w:hAnsi="Arial" w:cs="Arial"/>
+        </w:rPr>
         <w:br w:type="page"/>
       </w:r>
     </w:p>
@@ -2276,7 +4085,25 @@
           <w:sz w:val="32"/>
           <w:szCs w:val="32"/>
         </w:rPr>
-        <w:t xml:space="preserve"> PasswordEncoder </w:t>
+        <w:t xml:space="preserve"> </w:t>
+      </w:r>
+      <w:proofErr w:type="spellStart"/>
+      <w:r>
+        <w:rPr>
+          <w:rFonts w:ascii="Courier New" w:hAnsi="Courier New" w:cs="Courier New"/>
+          <w:sz w:val="32"/>
+          <w:szCs w:val="32"/>
+        </w:rPr>
+        <w:t>PasswordEncoder</w:t>
+      </w:r>
+      <w:proofErr w:type="spellEnd"/>
+      <w:r>
+        <w:rPr>
+          <w:rFonts w:ascii="Courier New" w:hAnsi="Courier New" w:cs="Courier New"/>
+          <w:sz w:val="32"/>
+          <w:szCs w:val="32"/>
+        </w:rPr>
+        <w:t xml:space="preserve"> </w:t>
       </w:r>
       <w:r>
         <w:rPr>
@@ -2352,7 +4179,7 @@
                     </pic:cNvPicPr>
                   </pic:nvPicPr>
                   <pic:blipFill>
-                    <a:blip r:embed="rId18">
+                    <a:blip r:embed="rId22">
                       <a:extLst>
                         <a:ext uri="{28A0092B-C50C-407E-A947-70E740481C1C}">
                           <a14:useLocalDpi xmlns:a14="http://schemas.microsoft.com/office/drawing/2010/main" val="0"/>
@@ -3447,6 +5274,18 @@
     <w:lvlOverride w:ilvl="8">
       <w:startOverride w:val="1"/>
     </w:lvlOverride>
+  </w:num>
+  <w:num w:numId="15" w16cid:durableId="2117630694">
+    <w:abstractNumId w:val="0"/>
+    <w:lvlOverride w:ilvl="0"/>
+    <w:lvlOverride w:ilvl="1"/>
+    <w:lvlOverride w:ilvl="2"/>
+    <w:lvlOverride w:ilvl="3"/>
+    <w:lvlOverride w:ilvl="4"/>
+    <w:lvlOverride w:ilvl="5"/>
+    <w:lvlOverride w:ilvl="6"/>
+    <w:lvlOverride w:ilvl="7"/>
+    <w:lvlOverride w:ilvl="8"/>
   </w:num>
 </w:numbering>
 </file>

</xml_diff>